<commit_message>
docs: expand slide deck and workshop manual with deep tech taxonomy, pros/cons, gotchas, and white background visual design specifications
</commit_message>
<xml_diff>
--- a/WORKSHOP_AI_DRIVEN_SMART_OPERATIONS_SLIDE_DECK.docx
+++ b/WORKSHOP_AI_DRIVEN_SMART_OPERATIONS_SLIDE_DECK.docx
@@ -11,9 +11,9 @@
           <w:rFonts w:ascii="Arial" w:hAnsi="Arial"/>
           <w:b/>
           <w:color w:val="B45309"/>
-          <w:sz w:val="20"/>
+          <w:sz w:val="21"/>
         </w:rPr>
-        <w:t>SEAL HACKATHON SUMMER 2026 • OFFICIAL WORKSHOP MANUAL</w:t>
+        <w:t>SEAL HACKATHON SUMMER 2026 • OFFICIAL TECHNICAL MANUAL</w:t>
         <w:br/>
       </w:r>
     </w:p>
@@ -42,9 +42,9 @@
           <w:rFonts w:ascii="Arial" w:hAnsi="Arial"/>
           <w:i/>
           <w:color w:val="475569"/>
-          <w:sz w:val="24"/>
+          <w:sz w:val="22"/>
         </w:rPr>
-        <w:t>Tài Liệu Toàn Diện: Kịch Bản Thuyết Trình 90 Phút &amp; Nội Dung Trình Bày 18 Slide</w:t>
+        <w:t>Tài Liệu Chi Tiết: Kịch Bản Thuyết Trình 90 Phút &amp; Nội Dung 18 Slide (Kèm Ưu/Nhược Điểm &amp; Visual Nền Trắng Chữ Đen)</w:t>
       </w:r>
     </w:p>
     <w:tbl>
@@ -54,8 +54,8 @@
         <w:tblLook w:firstColumn="1" w:firstRow="1" w:lastColumn="0" w:lastRow="0" w:noHBand="0" w:noVBand="1" w:val="04A0"/>
       </w:tblPr>
       <w:tblGrid>
-        <w:gridCol w:w="4968"/>
-        <w:gridCol w:w="4968"/>
+        <w:gridCol w:w="5040"/>
+        <w:gridCol w:w="5040"/>
       </w:tblGrid>
       <w:tr>
         <w:tc>
@@ -82,7 +82,7 @@
         </w:tc>
         <w:tc>
           <w:tcPr>
-            <w:tcW w:type="dxa" w:w="6624"/>
+            <w:tcW w:type="dxa" w:w="6912"/>
             <w:shd w:fill="FFFFFF"/>
             <w:tcMar>
               <w:top w:w="60" w:type="dxa"/>
@@ -121,13 +121,13 @@
                 <w:color w:val="0F172A"/>
                 <w:sz w:val="19"/>
               </w:rPr>
-              <w:t>Thời gian (Duration):</w:t>
+              <w:t>Thời gian &amp; Địa điểm:</w:t>
             </w:r>
           </w:p>
         </w:tc>
         <w:tc>
           <w:tcPr>
-            <w:tcW w:type="dxa" w:w="6624"/>
+            <w:tcW w:type="dxa" w:w="6912"/>
             <w:shd w:fill="FFFFFF"/>
             <w:tcMar>
               <w:top w:w="60" w:type="dxa"/>
@@ -142,7 +142,7 @@
                 <w:color w:val="0F172A"/>
                 <w:sz w:val="19"/>
               </w:rPr>
-              <w:t>20:00 - 21:30, August 13, 2026 (90 Phút) • Google Meet</w:t>
+              <w:t>20:00 - 21:30, August 13, 2026 (90 Phút) • Google Meet (meet.google.com/zbr-tktz-bea)</w:t>
             </w:r>
           </w:p>
         </w:tc>
@@ -172,7 +172,7 @@
         </w:tc>
         <w:tc>
           <w:tcPr>
-            <w:tcW w:type="dxa" w:w="6624"/>
+            <w:tcW w:type="dxa" w:w="6912"/>
             <w:shd w:fill="FFFFFF"/>
             <w:tcMar>
               <w:top w:w="60" w:type="dxa"/>
@@ -187,7 +187,7 @@
                 <w:color w:val="0F172A"/>
                 <w:sz w:val="19"/>
               </w:rPr>
-              <w:t>Nguyễn Đức Tuấn (Backend Lead / System Architect, FPT Software)</w:t>
+              <w:t>Nguyễn Đức Tuấn (Backend Lead / System Architect, FPT Software &amp; Google Student Ambassador)</w:t>
             </w:r>
           </w:p>
         </w:tc>
@@ -211,13 +211,13 @@
                 <w:color w:val="0F172A"/>
                 <w:sz w:val="19"/>
               </w:rPr>
-              <w:t>Kho lưu trữ mã nguồn:</w:t>
+              <w:t>Kho lưu trữ mã nguồn mẫu:</w:t>
             </w:r>
           </w:p>
         </w:tc>
         <w:tc>
           <w:tcPr>
-            <w:tcW w:type="dxa" w:w="6624"/>
+            <w:tcW w:type="dxa" w:w="6912"/>
             <w:shd w:fill="FFFFFF"/>
             <w:tcMar>
               <w:top w:w="60" w:type="dxa"/>
@@ -257,10 +257,10 @@
         <w:tblLook w:firstColumn="1" w:firstRow="1" w:lastColumn="0" w:lastRow="0" w:noHBand="0" w:noVBand="1" w:val="04A0"/>
       </w:tblPr>
       <w:tblGrid>
-        <w:gridCol w:w="2484"/>
-        <w:gridCol w:w="2484"/>
-        <w:gridCol w:w="2484"/>
-        <w:gridCol w:w="2484"/>
+        <w:gridCol w:w="2520"/>
+        <w:gridCol w:w="2520"/>
+        <w:gridCol w:w="2520"/>
+        <w:gridCol w:w="2520"/>
       </w:tblGrid>
       <w:tr>
         <w:tc>
@@ -309,7 +309,7 @@
         </w:tc>
         <w:tc>
           <w:tcPr>
-            <w:tcW w:type="dxa" w:w="5184"/>
+            <w:tcW w:type="dxa" w:w="5472"/>
             <w:shd w:fill="15803D"/>
             <w:tcMar>
               <w:top w:w="80" w:type="dxa"/>
@@ -325,7 +325,7 @@
                 <w:color w:val="FFFFFF"/>
                 <w:sz w:val="19"/>
               </w:rPr>
-              <w:t>Nội Dung Chi Tiết &amp; Trọng Tâm</w:t>
+              <w:t>Nội Dung Chi Tiết &amp; Trọng Tâm Kỹ Thuật</w:t>
             </w:r>
           </w:p>
         </w:tc>
@@ -398,7 +398,7 @@
         </w:tc>
         <w:tc>
           <w:tcPr>
-            <w:tcW w:type="dxa" w:w="5184"/>
+            <w:tcW w:type="dxa" w:w="5472"/>
             <w:shd w:fill="FFFFFF"/>
             <w:tcMar>
               <w:top w:w="60" w:type="dxa"/>
@@ -415,9 +415,11 @@
               </w:rPr>
               <w:t>Phần 1: Khai mạc, Giới thiệu &amp; Bối cảnh Smart Operations</w:t>
               <w:br/>
-              <w:t>• Khởi động Hackathon &amp; Giới thiệu lộ trình</w:t>
+              <w:t>• Khởi động Hackathon &amp; Giới thiệu lộ trình 90 phút</w:t>
               <w:br/>
-              <w:t>• Chuyển dịch từ Giám sát thụ động sang AI tự hành</w:t>
+              <w:t>• Sự chuyển dịch từ Giám sát thụ động sang AI tự hành</w:t>
+              <w:br/>
+              <w:t>• Phương pháp luận xác định Đúng/Sai (Ground Truth)</w:t>
             </w:r>
           </w:p>
         </w:tc>
@@ -489,7 +491,7 @@
         </w:tc>
         <w:tc>
           <w:tcPr>
-            <w:tcW w:type="dxa" w:w="5184"/>
+            <w:tcW w:type="dxa" w:w="5472"/>
             <w:shd w:fill="F8FAFC"/>
             <w:tcMar>
               <w:top w:w="60" w:type="dxa"/>
@@ -506,9 +508,9 @@
               </w:rPr>
               <w:t>Phần 2: Kiến trúc Thu thập &amp; Xử lý Luồng Dữ liệu IoT</w:t>
               <w:br/>
-              <w:t>• Giao thức: MQTT (:1883), CoAP (:5683 UDP), Kafka/Redpanda</w:t>
+              <w:t>• Giao thức: MQTT (:1883), CoAP (:5683 UDP), Kafka/Redpanda (:9092)</w:t>
               <w:br/>
-              <w:t>• Stream Engine: Watermarking, Tumbling &amp; Sliding Windows</w:t>
+              <w:t>• Stream Engine: Bounded Watermarking, Tumbling (1m) &amp; Sliding (5m) Windows</w:t>
             </w:r>
           </w:p>
         </w:tc>
@@ -580,7 +582,7 @@
         </w:tc>
         <w:tc>
           <w:tcPr>
-            <w:tcW w:type="dxa" w:w="5184"/>
+            <w:tcW w:type="dxa" w:w="5472"/>
             <w:shd w:fill="FFFFFF"/>
             <w:tcMar>
               <w:top w:w="60" w:type="dxa"/>
@@ -595,11 +597,11 @@
                 <w:color w:val="0F172A"/>
                 <w:sz w:val="18"/>
               </w:rPr>
-              <w:t>Phần 3: Trí tuệ Nhân tạo &amp; AI Agents trong Vận hành</w:t>
+              <w:t>Phần 3: Trí tuệ Nhân tạo &amp; AI Agents trong Vận hành Tự động</w:t>
               <w:br/>
-              <w:t>• 5 Bước: Feature -&gt; Anomaly -&gt; RCA -&gt; Agent -&gt; Action</w:t>
+              <w:t>• Chuỗi 5 Bước: Feature Extraction -&gt; Anomaly -&gt; RCA -&gt; Agent -&gt; Action</w:t>
               <w:br/>
-              <w:t>• Isolation Forest, Autoencoder, Causal Graph, Guardrails</w:t>
+              <w:t>• Isolation Forest, Autoencoder, SHAP, Causal Knowledge Graph, Guardrails</w:t>
             </w:r>
           </w:p>
         </w:tc>
@@ -671,7 +673,7 @@
         </w:tc>
         <w:tc>
           <w:tcPr>
-            <w:tcW w:type="dxa" w:w="5184"/>
+            <w:tcW w:type="dxa" w:w="5472"/>
             <w:shd w:fill="F8FAFC"/>
             <w:tcMar>
               <w:top w:w="60" w:type="dxa"/>
@@ -688,9 +690,9 @@
               </w:rPr>
               <w:t>Phần 4: Kiến trúc Tham chiếu &amp; Chiến Lược Hackathon</w:t>
               <w:br/>
-              <w:t>• Blueprint 1-Click Docker Compose (FastAPI, Redis, Timescale)</w:t>
+              <w:t>• Blueprint 1-Click Docker Compose (FastAPI, Redis, TimescaleDB)</w:t>
               <w:br/>
-              <w:t>• Bí quyết Pitching: 'Live Anomaly Injection'</w:t>
+              <w:t>• Bí quyết Pitching: Demo 'Live Anomaly Injection' 5 phút</w:t>
             </w:r>
           </w:p>
         </w:tc>
@@ -762,7 +764,7 @@
         </w:tc>
         <w:tc>
           <w:tcPr>
-            <w:tcW w:type="dxa" w:w="5184"/>
+            <w:tcW w:type="dxa" w:w="5472"/>
             <w:shd w:fill="FFFFFF"/>
             <w:tcMar>
               <w:top w:w="60" w:type="dxa"/>
@@ -781,7 +783,7 @@
               <w:br/>
               <w:t>• Trực tiếp tháo gỡ vướng mắc kiến trúc, streaming, AI models</w:t>
               <w:br/>
-              <w:t>• Cảnh báo các bẫy phần cứng phổ biến</w:t>
+              <w:t>• Cảnh báo các bẫy phần cứng phổ biến và hướng dẫn bảo vệ đề tài</w:t>
             </w:r>
           </w:p>
         </w:tc>
@@ -823,7 +825,7 @@
     <w:p>
       <w:r>
         <w:rPr>
-          <w:sz w:val="21"/>
+          <w:sz w:val="20"/>
         </w:rPr>
         <w:t xml:space="preserve">Một trong những thách thức kỹ thuật cốt lõi trong Smart Operations là: </w:t>
       </w:r>
@@ -848,7 +850,7 @@
         <w:pStyle w:val="ListBullet2"/>
       </w:pPr>
       <w:r>
-        <w:t>Tầng 1 - Giới hạn vật lý (Physical Bounds): Kiểm tra ngưỡng cực trị vật lý của cảm biến (ví dụ: nhiệt độ nước không thể vượt 100°C ở áp suất thường).</w:t>
+        <w:t>Tầng 1 - Giới hạn vật lý (Physical Bounds): Kiểm tra ngưỡng cực trị vật lý của cảm biến (0 &lt;= Humidity &lt;= 100%, 800 &lt;= Pressure &lt;= 1080 hPa). Bất kỳ giá trị nào ngoài dải sẽ bị loại trừ ngay.</w:t>
       </w:r>
     </w:p>
     <w:p>
@@ -856,7 +858,7 @@
         <w:pStyle w:val="ListBullet2"/>
       </w:pPr>
       <w:r>
-        <w:t>Tầng 2 - Tương quan đa biến (Multivariate Physical Correlation): Nếu chỉ 1 cảm biến nhảy vọt trong khi các cảm biến liên đới xung quanh đứng yên -&gt; Xác định Lỗi Cảm Biến (Sensor Fault), bỏ qua không kích hoạt dừng máy.</w:t>
+        <w:t>Tầng 2 - Tương quan đa biến (Multivariate Correlation): Nếu chỉ 1 cảm biến nhảy vọt đơn độc trong khi các cảm biến liên đới xung quanh đứng yên -&gt; Xác định LỖI CẢM BIẾN (Sensor Fault), không kích hoạt dừng máy.</w:t>
       </w:r>
     </w:p>
     <w:p>
@@ -864,7 +866,7 @@
         <w:pStyle w:val="ListBullet2"/>
       </w:pPr>
       <w:r>
-        <w:t>Tầng 3 - Mô hình học máy (Machine Learning Deviations): Isolation Forest đánh giá Anomaly Score và Autoencoder tính sai số tái tạo MSE (Reconstruction Error = ||X - X_hat||^2) để nhận diện các trạng thái thoái hóa tinh vi.</w:t>
+        <w:t>Tầng 3 - Mô hình học máy (Machine Learning Deviations): Isolation Forest đánh giá Anomaly Score s(x, n) &gt; 0.65 và Autoencoder tính sai số tái tạo MSE = ||x - x_hat||^2 &gt; Threshold.</w:t>
       </w:r>
     </w:p>
     <w:p>
@@ -894,16 +896,16 @@
         <w:tblLook w:firstColumn="1" w:firstRow="1" w:lastColumn="0" w:lastRow="0" w:noHBand="0" w:noVBand="1" w:val="04A0"/>
       </w:tblPr>
       <w:tblGrid>
-        <w:gridCol w:w="9936"/>
+        <w:gridCol w:w="10080"/>
       </w:tblGrid>
       <w:tr>
         <w:tc>
           <w:tcPr>
-            <w:tcW w:type="dxa" w:w="9792"/>
+            <w:tcW w:type="dxa" w:w="10080"/>
             <w:shd w:fill="15803D"/>
             <w:tcMar>
-              <w:top w:w="60" w:type="dxa"/>
-              <w:bottom w:w="60" w:type="dxa"/>
+              <w:top w:w="70" w:type="dxa"/>
+              <w:bottom w:w="70" w:type="dxa"/>
               <w:left w:w="100" w:type="dxa"/>
               <w:right w:w="100" w:type="dxa"/>
             </w:tcMar>
@@ -923,11 +925,11 @@
       <w:tr>
         <w:tc>
           <w:tcPr>
-            <w:tcW w:type="dxa" w:w="9792"/>
+            <w:tcW w:type="dxa" w:w="10080"/>
             <w:shd w:fill="FFFFFF"/>
             <w:tcMar>
-              <w:top w:w="80" w:type="dxa"/>
-              <w:bottom w:w="80" w:type="dxa"/>
+              <w:top w:w="70" w:type="dxa"/>
+              <w:bottom w:w="70" w:type="dxa"/>
               <w:left w:w="120" w:type="dxa"/>
               <w:right w:w="120" w:type="dxa"/>
             </w:tcMar>
@@ -995,7 +997,69 @@
       <w:tr>
         <w:tc>
           <w:tcPr>
-            <w:tcW w:type="dxa" w:w="9792"/>
+            <w:tcW w:type="dxa" w:w="10080"/>
+            <w:shd w:fill="F8FAFC"/>
+            <w:tcMar>
+              <w:top w:w="60" w:type="dxa"/>
+              <w:bottom w:w="60" w:type="dxa"/>
+              <w:left w:w="120" w:type="dxa"/>
+              <w:right w:w="120" w:type="dxa"/>
+            </w:tcMar>
+          </w:tcPr>
+          <w:p>
+            <w:r>
+              <w:rPr>
+                <w:b/>
+                <w:color w:val="0284C7"/>
+                <w:sz w:val="18"/>
+              </w:rPr>
+              <w:t xml:space="preserve">🔍 Phân tích Khái niệm &amp; Cơ chế Kỹ thuật: </w:t>
+            </w:r>
+            <w:r>
+              <w:rPr>
+                <w:color w:val="0F172A"/>
+                <w:sz w:val="18"/>
+              </w:rPr>
+              <w:t>Chuyển dịch toàn diện từ Giám sát thụ động (Passive Telemetry) sang Vận hành thông minh tự động (AI-Driven Smart Operations). Tích hợp toàn diện chuỗi: IoT Ingestion -&gt; Event Streaming -&gt; Time-Series Storage -&gt; AI Anomaly -&gt; AI Agent Action.</w:t>
+            </w:r>
+          </w:p>
+        </w:tc>
+      </w:tr>
+      <w:tr>
+        <w:tc>
+          <w:tcPr>
+            <w:tcW w:type="dxa" w:w="10080"/>
+            <w:shd w:fill="F1F5F9"/>
+            <w:tcMar>
+              <w:top w:w="60" w:type="dxa"/>
+              <w:bottom w:w="60" w:type="dxa"/>
+              <w:left w:w="120" w:type="dxa"/>
+              <w:right w:w="120" w:type="dxa"/>
+            </w:tcMar>
+          </w:tcPr>
+          <w:p>
+            <w:r>
+              <w:rPr>
+                <w:b/>
+                <w:color w:val="15803D"/>
+                <w:sz w:val="18"/>
+              </w:rPr>
+              <w:t xml:space="preserve">🎨 Visual Design (Nền Trắng Chữ Đen &amp; Bố Cục): </w:t>
+            </w:r>
+            <w:r>
+              <w:rPr>
+                <w:color w:val="0F172A"/>
+                <w:sz w:val="17"/>
+              </w:rPr>
+              <w:t>Màu nền: Trắng tinh khiết (#FFFFFF), Tiêu đề chữ đen xanh lá (#15803D, Outfit Bold 28pt), biểu tượng bánh răng kết hợp nút mạng IoT đối xứng trang trọng.</w:t>
+            </w:r>
+          </w:p>
+        </w:tc>
+      </w:tr>
+      <w:tr>
+        <w:tc>
+          <w:tcPr>
+            <w:tcW w:type="dxa" w:w="10080"/>
             <w:shd w:fill="FEF3C7"/>
             <w:tcMar>
               <w:top w:w="60" w:type="dxa"/>
@@ -1033,16 +1097,16 @@
         <w:tblLook w:firstColumn="1" w:firstRow="1" w:lastColumn="0" w:lastRow="0" w:noHBand="0" w:noVBand="1" w:val="04A0"/>
       </w:tblPr>
       <w:tblGrid>
-        <w:gridCol w:w="9936"/>
+        <w:gridCol w:w="10080"/>
       </w:tblGrid>
       <w:tr>
         <w:tc>
           <w:tcPr>
-            <w:tcW w:type="dxa" w:w="9792"/>
+            <w:tcW w:type="dxa" w:w="10080"/>
             <w:shd w:fill="15803D"/>
             <w:tcMar>
-              <w:top w:w="60" w:type="dxa"/>
-              <w:bottom w:w="60" w:type="dxa"/>
+              <w:top w:w="70" w:type="dxa"/>
+              <w:bottom w:w="70" w:type="dxa"/>
               <w:left w:w="100" w:type="dxa"/>
               <w:right w:w="100" w:type="dxa"/>
             </w:tcMar>
@@ -1062,11 +1126,11 @@
       <w:tr>
         <w:tc>
           <w:tcPr>
-            <w:tcW w:type="dxa" w:w="9792"/>
+            <w:tcW w:type="dxa" w:w="10080"/>
             <w:shd w:fill="FFFFFF"/>
             <w:tcMar>
-              <w:top w:w="80" w:type="dxa"/>
-              <w:bottom w:w="80" w:type="dxa"/>
+              <w:top w:w="70" w:type="dxa"/>
+              <w:bottom w:w="70" w:type="dxa"/>
               <w:left w:w="120" w:type="dxa"/>
               <w:right w:w="120" w:type="dxa"/>
             </w:tcMar>
@@ -1146,7 +1210,69 @@
       <w:tr>
         <w:tc>
           <w:tcPr>
-            <w:tcW w:type="dxa" w:w="9792"/>
+            <w:tcW w:type="dxa" w:w="10080"/>
+            <w:shd w:fill="F8FAFC"/>
+            <w:tcMar>
+              <w:top w:w="60" w:type="dxa"/>
+              <w:bottom w:w="60" w:type="dxa"/>
+              <w:left w:w="120" w:type="dxa"/>
+              <w:right w:w="120" w:type="dxa"/>
+            </w:tcMar>
+          </w:tcPr>
+          <w:p>
+            <w:r>
+              <w:rPr>
+                <w:b/>
+                <w:color w:val="0284C7"/>
+                <w:sz w:val="18"/>
+              </w:rPr>
+              <w:t xml:space="preserve">🔍 Phân tích Khái niệm &amp; Cơ chế Kỹ thuật: </w:t>
+            </w:r>
+            <w:r>
+              <w:rPr>
+                <w:color w:val="0F172A"/>
+                <w:sz w:val="18"/>
+              </w:rPr>
+              <w:t>Lộ trình 5 phân đoạn từ nền tảng giao thức đến mô hình AI và kỹ năng bảo vệ bài thi trước Ban Giám Khảo.</w:t>
+            </w:r>
+          </w:p>
+        </w:tc>
+      </w:tr>
+      <w:tr>
+        <w:tc>
+          <w:tcPr>
+            <w:tcW w:type="dxa" w:w="10080"/>
+            <w:shd w:fill="F1F5F9"/>
+            <w:tcMar>
+              <w:top w:w="60" w:type="dxa"/>
+              <w:bottom w:w="60" w:type="dxa"/>
+              <w:left w:w="120" w:type="dxa"/>
+              <w:right w:w="120" w:type="dxa"/>
+            </w:tcMar>
+          </w:tcPr>
+          <w:p>
+            <w:r>
+              <w:rPr>
+                <w:b/>
+                <w:color w:val="15803D"/>
+                <w:sz w:val="18"/>
+              </w:rPr>
+              <w:t xml:space="preserve">🎨 Visual Design (Nền Trắng Chữ Đen &amp; Bố Cục): </w:t>
+            </w:r>
+            <w:r>
+              <w:rPr>
+                <w:color w:val="0F172A"/>
+                <w:sz w:val="17"/>
+              </w:rPr>
+              <w:t>Lưới 2 cột nền trắng (#FFFFFF), viền thẻ xanh dương (#0284C7) và xanh lá (#15803D), thời lượng hiển thị huy hiệu vàng hổ phách (#B45309).</w:t>
+            </w:r>
+          </w:p>
+        </w:tc>
+      </w:tr>
+      <w:tr>
+        <w:tc>
+          <w:tcPr>
+            <w:tcW w:type="dxa" w:w="10080"/>
             <w:shd w:fill="FEF3C7"/>
             <w:tcMar>
               <w:top w:w="60" w:type="dxa"/>
@@ -1184,16 +1310,16 @@
         <w:tblLook w:firstColumn="1" w:firstRow="1" w:lastColumn="0" w:lastRow="0" w:noHBand="0" w:noVBand="1" w:val="04A0"/>
       </w:tblPr>
       <w:tblGrid>
-        <w:gridCol w:w="9936"/>
+        <w:gridCol w:w="10080"/>
       </w:tblGrid>
       <w:tr>
         <w:tc>
           <w:tcPr>
-            <w:tcW w:type="dxa" w:w="9792"/>
+            <w:tcW w:type="dxa" w:w="10080"/>
             <w:shd w:fill="15803D"/>
             <w:tcMar>
-              <w:top w:w="60" w:type="dxa"/>
-              <w:bottom w:w="60" w:type="dxa"/>
+              <w:top w:w="70" w:type="dxa"/>
+              <w:bottom w:w="70" w:type="dxa"/>
               <w:left w:w="100" w:type="dxa"/>
               <w:right w:w="100" w:type="dxa"/>
             </w:tcMar>
@@ -1213,11 +1339,11 @@
       <w:tr>
         <w:tc>
           <w:tcPr>
-            <w:tcW w:type="dxa" w:w="9792"/>
+            <w:tcW w:type="dxa" w:w="10080"/>
             <w:shd w:fill="FFFFFF"/>
             <w:tcMar>
-              <w:top w:w="80" w:type="dxa"/>
-              <w:bottom w:w="80" w:type="dxa"/>
+              <w:top w:w="70" w:type="dxa"/>
+              <w:bottom w:w="70" w:type="dxa"/>
               <w:left w:w="120" w:type="dxa"/>
               <w:right w:w="120" w:type="dxa"/>
             </w:tcMar>
@@ -1241,7 +1367,7 @@
                 <w:color w:val="0F172A"/>
                 <w:sz w:val="18"/>
               </w:rPr>
-              <w:t>Phase 1: Passive Monitoring ('What happened?') - Thu thập cảm biến &amp; vẽ biểu đồ tĩnh. Con người quan sát 24/7.</w:t>
+              <w:t>Phase 1: Passive Monitoring ('What happened?') - Thu thập dữ liệu cảm biến &amp; vẽ biểu đồ tĩnh. Nhược điểm: Phụ thuộc 100% vào con người quan sát 24/7.</w:t>
             </w:r>
           </w:p>
           <w:p>
@@ -1253,7 +1379,7 @@
                 <w:color w:val="0F172A"/>
                 <w:sz w:val="18"/>
               </w:rPr>
-              <w:t>Phase 2: Reactive Alerting ('Is it broken right now?') - Quy tắc tĩnh IF-THEN. Dễ bão hòa cảnh báo giả.</w:t>
+              <w:t>Phase 2: Reactive Alerting ('Is it broken right now?') - Cài ngưỡng tĩnh IF-THEN. Nhược điểm: Bão cảnh báo giả, không bắt được thoái hóa từ từ.</w:t>
             </w:r>
           </w:p>
           <w:p>
@@ -1265,7 +1391,7 @@
                 <w:color w:val="0F172A"/>
                 <w:sz w:val="18"/>
               </w:rPr>
-              <w:t>Phase 3: AI-Driven Smart Operations ('Why &amp; What automated action to take?') - Phát hiện sớm, chẩn đoán nguyên nhân gốc rễ và tự động hóa hành động khắc phục.</w:t>
+              <w:t>Phase 3: AI-Driven Smart Operations ('Why &amp; How to fix?') - Tự động phát hiện sớm, chẩn đoán nguyên nhân gốc rễ (RCA) và tự động thực thi hành động.</w:t>
             </w:r>
           </w:p>
         </w:tc>
@@ -1273,7 +1399,69 @@
       <w:tr>
         <w:tc>
           <w:tcPr>
-            <w:tcW w:type="dxa" w:w="9792"/>
+            <w:tcW w:type="dxa" w:w="10080"/>
+            <w:shd w:fill="F8FAFC"/>
+            <w:tcMar>
+              <w:top w:w="60" w:type="dxa"/>
+              <w:bottom w:w="60" w:type="dxa"/>
+              <w:left w:w="120" w:type="dxa"/>
+              <w:right w:w="120" w:type="dxa"/>
+            </w:tcMar>
+          </w:tcPr>
+          <w:p>
+            <w:r>
+              <w:rPr>
+                <w:b/>
+                <w:color w:val="0284C7"/>
+                <w:sz w:val="18"/>
+              </w:rPr>
+              <w:t xml:space="preserve">🔍 Phân tích Khái niệm &amp; Cơ chế Kỹ thuật: </w:t>
+            </w:r>
+            <w:r>
+              <w:rPr>
+                <w:color w:val="0F172A"/>
+                <w:sz w:val="18"/>
+              </w:rPr>
+              <w:t>Khái niệm cốt lõi: Phân biệt 3 giai đoạn tiến hóa của hệ thống giám sát công nghiệp và lợi thế cạnh tranh của AI Agent.</w:t>
+            </w:r>
+          </w:p>
+        </w:tc>
+      </w:tr>
+      <w:tr>
+        <w:tc>
+          <w:tcPr>
+            <w:tcW w:type="dxa" w:w="10080"/>
+            <w:shd w:fill="F1F5F9"/>
+            <w:tcMar>
+              <w:top w:w="60" w:type="dxa"/>
+              <w:bottom w:w="60" w:type="dxa"/>
+              <w:left w:w="120" w:type="dxa"/>
+              <w:right w:w="120" w:type="dxa"/>
+            </w:tcMar>
+          </w:tcPr>
+          <w:p>
+            <w:r>
+              <w:rPr>
+                <w:b/>
+                <w:color w:val="15803D"/>
+                <w:sz w:val="18"/>
+              </w:rPr>
+              <w:t xml:space="preserve">🎨 Visual Design (Nền Trắng Chữ Đen &amp; Bố Cục): </w:t>
+            </w:r>
+            <w:r>
+              <w:rPr>
+                <w:color w:val="0F172A"/>
+                <w:sz w:val="17"/>
+              </w:rPr>
+              <w:t>Bảng so sánh 3 cột nền trắng (Cột 1 xám nhạt #F1F5F9, Cột 2 vàng cam nhạt #FEF3C7, Cột 3 xanh lá nhạt #DCFCE7), chữ đen than chì đậm nét.</w:t>
+            </w:r>
+          </w:p>
+        </w:tc>
+      </w:tr>
+      <w:tr>
+        <w:tc>
+          <w:tcPr>
+            <w:tcW w:type="dxa" w:w="10080"/>
             <w:shd w:fill="FEF3C7"/>
             <w:tcMar>
               <w:top w:w="60" w:type="dxa"/>
@@ -1311,16 +1499,16 @@
         <w:tblLook w:firstColumn="1" w:firstRow="1" w:lastColumn="0" w:lastRow="0" w:noHBand="0" w:noVBand="1" w:val="04A0"/>
       </w:tblPr>
       <w:tblGrid>
-        <w:gridCol w:w="9936"/>
+        <w:gridCol w:w="10080"/>
       </w:tblGrid>
       <w:tr>
         <w:tc>
           <w:tcPr>
-            <w:tcW w:type="dxa" w:w="9792"/>
+            <w:tcW w:type="dxa" w:w="10080"/>
             <w:shd w:fill="15803D"/>
             <w:tcMar>
-              <w:top w:w="60" w:type="dxa"/>
-              <w:bottom w:w="60" w:type="dxa"/>
+              <w:top w:w="70" w:type="dxa"/>
+              <w:bottom w:w="70" w:type="dxa"/>
               <w:left w:w="100" w:type="dxa"/>
               <w:right w:w="100" w:type="dxa"/>
             </w:tcMar>
@@ -1340,11 +1528,11 @@
       <w:tr>
         <w:tc>
           <w:tcPr>
-            <w:tcW w:type="dxa" w:w="9792"/>
+            <w:tcW w:type="dxa" w:w="10080"/>
             <w:shd w:fill="FFFFFF"/>
             <w:tcMar>
-              <w:top w:w="80" w:type="dxa"/>
-              <w:bottom w:w="80" w:type="dxa"/>
+              <w:top w:w="70" w:type="dxa"/>
+              <w:bottom w:w="70" w:type="dxa"/>
               <w:left w:w="120" w:type="dxa"/>
               <w:right w:w="120" w:type="dxa"/>
             </w:tcMar>
@@ -1368,7 +1556,7 @@
                 <w:color w:val="0F172A"/>
                 <w:sz w:val="18"/>
               </w:rPr>
-              <w:t>Edge Ingestion: Sensor Nodes &amp; Lightweight Protocols (MQTT / CoAP)</w:t>
+              <w:t>Layer 1 - Edge &amp; Ingestion: Sensor Nodes -&gt; MQTT (:1883) &amp; CoAP (:5683 UDP)</w:t>
             </w:r>
           </w:p>
           <w:p>
@@ -1380,7 +1568,7 @@
                 <w:color w:val="0F172A"/>
                 <w:sz w:val="18"/>
               </w:rPr>
-              <w:t>Ingestion Buffer: High-throughput event logs via Apache Kafka / Redpanda</w:t>
+              <w:t>Layer 2 - Distributed Buffer: Redpanda / Apache Kafka (:9092) chống nghẽn và đảm bảo Zero Data Loss</w:t>
             </w:r>
           </w:p>
           <w:p>
@@ -1392,7 +1580,7 @@
                 <w:color w:val="0F172A"/>
                 <w:sz w:val="18"/>
               </w:rPr>
-              <w:t>Stream Processing: Stateful Windowing &amp; Watermarking Engine</w:t>
+              <w:t>Layer 3 - Stream Engine: Python Async / Flink xử lý Watermarking &amp; Windowing</w:t>
             </w:r>
           </w:p>
           <w:p>
@@ -1404,7 +1592,7 @@
                 <w:color w:val="0F172A"/>
                 <w:sz w:val="18"/>
               </w:rPr>
-              <w:t>Storage Hierarchy: In-Memory Hot Cache (Redis) + Time-Series Engine (TimescaleDB)</w:t>
+              <w:t>Layer 4 - Dual Storage &amp; AI: Redis Hot Cache (&lt;1ms) + TimescaleDB Hypertables nén 90%</w:t>
             </w:r>
           </w:p>
         </w:tc>
@@ -1412,7 +1600,69 @@
       <w:tr>
         <w:tc>
           <w:tcPr>
-            <w:tcW w:type="dxa" w:w="9792"/>
+            <w:tcW w:type="dxa" w:w="10080"/>
+            <w:shd w:fill="F8FAFC"/>
+            <w:tcMar>
+              <w:top w:w="60" w:type="dxa"/>
+              <w:bottom w:w="60" w:type="dxa"/>
+              <w:left w:w="120" w:type="dxa"/>
+              <w:right w:w="120" w:type="dxa"/>
+            </w:tcMar>
+          </w:tcPr>
+          <w:p>
+            <w:r>
+              <w:rPr>
+                <w:b/>
+                <w:color w:val="0284C7"/>
+                <w:sz w:val="18"/>
+              </w:rPr>
+              <w:t xml:space="preserve">🔍 Phân tích Khái niệm &amp; Cơ chế Kỹ thuật: </w:t>
+            </w:r>
+            <w:r>
+              <w:rPr>
+                <w:color w:val="0F172A"/>
+                <w:sz w:val="18"/>
+              </w:rPr>
+              <w:t>Kiến trúc luồng dữ liệu 4 tầng phân tách rõ ràng giữa tốc độ thu thập và tốc độ suy luận của mô hình trí tuệ nhân tạo.</w:t>
+            </w:r>
+          </w:p>
+        </w:tc>
+      </w:tr>
+      <w:tr>
+        <w:tc>
+          <w:tcPr>
+            <w:tcW w:type="dxa" w:w="10080"/>
+            <w:shd w:fill="F1F5F9"/>
+            <w:tcMar>
+              <w:top w:w="60" w:type="dxa"/>
+              <w:bottom w:w="60" w:type="dxa"/>
+              <w:left w:w="120" w:type="dxa"/>
+              <w:right w:w="120" w:type="dxa"/>
+            </w:tcMar>
+          </w:tcPr>
+          <w:p>
+            <w:r>
+              <w:rPr>
+                <w:b/>
+                <w:color w:val="15803D"/>
+                <w:sz w:val="18"/>
+              </w:rPr>
+              <w:t xml:space="preserve">🎨 Visual Design (Nền Trắng Chữ Đen &amp; Bố Cục): </w:t>
+            </w:r>
+            <w:r>
+              <w:rPr>
+                <w:color w:val="0F172A"/>
+                <w:sz w:val="17"/>
+              </w:rPr>
+              <w:t>Sơ đồ khối 4 tầng từ trên xuống nền trắng (#FFFFFF), viền hộp than chì (#334155), mũi tên luồng dữ liệu xanh dương (#0284C7), badge giao thức xanh lá (#15803D).</w:t>
+            </w:r>
+          </w:p>
+        </w:tc>
+      </w:tr>
+      <w:tr>
+        <w:tc>
+          <w:tcPr>
+            <w:tcW w:type="dxa" w:w="10080"/>
             <w:shd w:fill="FEF3C7"/>
             <w:tcMar>
               <w:top w:w="60" w:type="dxa"/>
@@ -1450,16 +1700,16 @@
         <w:tblLook w:firstColumn="1" w:firstRow="1" w:lastColumn="0" w:lastRow="0" w:noHBand="0" w:noVBand="1" w:val="04A0"/>
       </w:tblPr>
       <w:tblGrid>
-        <w:gridCol w:w="9936"/>
+        <w:gridCol w:w="10080"/>
       </w:tblGrid>
       <w:tr>
         <w:tc>
           <w:tcPr>
-            <w:tcW w:type="dxa" w:w="9792"/>
+            <w:tcW w:type="dxa" w:w="10080"/>
             <w:shd w:fill="15803D"/>
             <w:tcMar>
-              <w:top w:w="60" w:type="dxa"/>
-              <w:bottom w:w="60" w:type="dxa"/>
+              <w:top w:w="70" w:type="dxa"/>
+              <w:bottom w:w="70" w:type="dxa"/>
               <w:left w:w="100" w:type="dxa"/>
               <w:right w:w="100" w:type="dxa"/>
             </w:tcMar>
@@ -1479,11 +1729,11 @@
       <w:tr>
         <w:tc>
           <w:tcPr>
-            <w:tcW w:type="dxa" w:w="9792"/>
+            <w:tcW w:type="dxa" w:w="10080"/>
             <w:shd w:fill="FFFFFF"/>
             <w:tcMar>
-              <w:top w:w="80" w:type="dxa"/>
-              <w:bottom w:w="80" w:type="dxa"/>
+              <w:top w:w="70" w:type="dxa"/>
+              <w:bottom w:w="70" w:type="dxa"/>
               <w:left w:w="120" w:type="dxa"/>
               <w:right w:w="120" w:type="dxa"/>
             </w:tcMar>
@@ -1507,7 +1757,7 @@
                 <w:color w:val="0F172A"/>
                 <w:sz w:val="18"/>
               </w:rPr>
-              <w:t>MQTT (:1883): Giao thức TCP Pub/Sub siêu nhẹ (header 2 bytes), QoS 0/1/2 tin cậy cho mạng chập chờn.</w:t>
+              <w:t>MQTT (1883): Pub/Sub trên TCP, header 2B siêu nhẹ, QoS 0/1/2, Keepalive, LWT. Lưu ý: Dùng QoS 1 + event_time.</w:t>
             </w:r>
           </w:p>
           <w:p>
@@ -1519,7 +1769,7 @@
                 <w:color w:val="0F172A"/>
                 <w:sz w:val="18"/>
               </w:rPr>
-              <w:t>CoAP (:5683 UDP): Giao thức nhị phân RESTful tối ưu cho cảm biến pin yếu (NB-IoT/LPWAN).</w:t>
+              <w:t>CoAP (5683 UDP): RESTful nhị phân chạy UDP, header 4B, tối ưu pin. Lưu ý: Phù hợp cho node cảm biến pin yếu.</w:t>
             </w:r>
           </w:p>
           <w:p>
@@ -1531,7 +1781,7 @@
                 <w:color w:val="0F172A"/>
                 <w:sz w:val="18"/>
               </w:rPr>
-              <w:t>Redpanda / Apache Kafka (:9092): Hàng chờ phân tán bất biến chống tràn dữ liệu. Redpanda viết bằng C++, độ trễ thấp hơn 10x và zero JVM overhead.</w:t>
+              <w:t>Redpanda vs Kafka (9092): Commit log phân tán bất biến. Redpanda viết bằng C++, zero JVM, p99 latency thấp 10x, ngốn &lt;200MB RAM. Lưu ý: Dùng station_id làm Partition Key!</w:t>
             </w:r>
           </w:p>
         </w:tc>
@@ -1539,7 +1789,69 @@
       <w:tr>
         <w:tc>
           <w:tcPr>
-            <w:tcW w:type="dxa" w:w="9792"/>
+            <w:tcW w:type="dxa" w:w="10080"/>
+            <w:shd w:fill="F8FAFC"/>
+            <w:tcMar>
+              <w:top w:w="60" w:type="dxa"/>
+              <w:bottom w:w="60" w:type="dxa"/>
+              <w:left w:w="120" w:type="dxa"/>
+              <w:right w:w="120" w:type="dxa"/>
+            </w:tcMar>
+          </w:tcPr>
+          <w:p>
+            <w:r>
+              <w:rPr>
+                <w:b/>
+                <w:color w:val="0284C7"/>
+                <w:sz w:val="18"/>
+              </w:rPr>
+              <w:t xml:space="preserve">🔍 Phân tích Khái niệm &amp; Cơ chế Kỹ thuật: </w:t>
+            </w:r>
+            <w:r>
+              <w:rPr>
+                <w:color w:val="0F172A"/>
+                <w:sz w:val="18"/>
+              </w:rPr>
+              <w:t>So sánh chi tiết 3 công nghệ Ingestion chủ lực: Định nghĩa, Ưu điểm, Nhược điểm và Lưu ý cấu hình tránh mất gói dữ liệu.</w:t>
+            </w:r>
+          </w:p>
+        </w:tc>
+      </w:tr>
+      <w:tr>
+        <w:tc>
+          <w:tcPr>
+            <w:tcW w:type="dxa" w:w="10080"/>
+            <w:shd w:fill="F1F5F9"/>
+            <w:tcMar>
+              <w:top w:w="60" w:type="dxa"/>
+              <w:bottom w:w="60" w:type="dxa"/>
+              <w:left w:w="120" w:type="dxa"/>
+              <w:right w:w="120" w:type="dxa"/>
+            </w:tcMar>
+          </w:tcPr>
+          <w:p>
+            <w:r>
+              <w:rPr>
+                <w:b/>
+                <w:color w:val="15803D"/>
+                <w:sz w:val="18"/>
+              </w:rPr>
+              <w:t xml:space="preserve">🎨 Visual Design (Nền Trắng Chữ Đen &amp; Bố Cục): </w:t>
+            </w:r>
+            <w:r>
+              <w:rPr>
+                <w:color w:val="0F172A"/>
+                <w:sz w:val="17"/>
+              </w:rPr>
+              <w:t>Lưới 3 cột nền trắng, thẻ bo góc viền màu phân biệt (Xanh lá, Xanh dương, Vàng cam), bảng mini 2 hàng (Xanh: Ưu điểm | Đỏ: Lưu ý Gotchas).</w:t>
+            </w:r>
+          </w:p>
+        </w:tc>
+      </w:tr>
+      <w:tr>
+        <w:tc>
+          <w:tcPr>
+            <w:tcW w:type="dxa" w:w="10080"/>
             <w:shd w:fill="FEF3C7"/>
             <w:tcMar>
               <w:top w:w="60" w:type="dxa"/>
@@ -1563,7 +1875,7 @@
                 <w:color w:val="0F172A"/>
                 <w:sz w:val="18"/>
               </w:rPr>
-              <w:t>"MQTT giúp cảm biến gửi tin siêu nhẹ, Mosquitto tiếp nhận, còn Redpanda/Kafka đảm bảo không mất dữ liệu ngay cả khi nghẽn mạng."</w:t>
+              <w:t>"MQTT giúp cảm biến gửi tin siêu nhẹ, CoAP tối ưu pin, còn Redpanda C++ là cứu cánh giúp bạn chạy Kafka mượt mà trên laptop."</w:t>
             </w:r>
           </w:p>
         </w:tc>
@@ -1577,16 +1889,16 @@
         <w:tblLook w:firstColumn="1" w:firstRow="1" w:lastColumn="0" w:lastRow="0" w:noHBand="0" w:noVBand="1" w:val="04A0"/>
       </w:tblPr>
       <w:tblGrid>
-        <w:gridCol w:w="9936"/>
+        <w:gridCol w:w="10080"/>
       </w:tblGrid>
       <w:tr>
         <w:tc>
           <w:tcPr>
-            <w:tcW w:type="dxa" w:w="9792"/>
+            <w:tcW w:type="dxa" w:w="10080"/>
             <w:shd w:fill="15803D"/>
             <w:tcMar>
-              <w:top w:w="60" w:type="dxa"/>
-              <w:bottom w:w="60" w:type="dxa"/>
+              <w:top w:w="70" w:type="dxa"/>
+              <w:bottom w:w="70" w:type="dxa"/>
               <w:left w:w="100" w:type="dxa"/>
               <w:right w:w="100" w:type="dxa"/>
             </w:tcMar>
@@ -1598,7 +1910,7 @@
                 <w:color w:val="FFFFFF"/>
                 <w:sz w:val="22"/>
               </w:rPr>
-              <w:t>SLIDE 06: STREAM PROCESSING: WATERMARKING &amp; WINDOWING</w:t>
+              <w:t>SLIDE 06: STREAM PROCESSING: WATERMARKING &amp; TIME WINDOWING</w:t>
             </w:r>
           </w:p>
         </w:tc>
@@ -1606,11 +1918,11 @@
       <w:tr>
         <w:tc>
           <w:tcPr>
-            <w:tcW w:type="dxa" w:w="9792"/>
+            <w:tcW w:type="dxa" w:w="10080"/>
             <w:shd w:fill="FFFFFF"/>
             <w:tcMar>
-              <w:top w:w="80" w:type="dxa"/>
-              <w:bottom w:w="80" w:type="dxa"/>
+              <w:top w:w="70" w:type="dxa"/>
+              <w:bottom w:w="70" w:type="dxa"/>
               <w:left w:w="120" w:type="dxa"/>
               <w:right w:w="120" w:type="dxa"/>
             </w:tcMar>
@@ -1634,7 +1946,7 @@
                 <w:color w:val="0F172A"/>
                 <w:sz w:val="18"/>
               </w:rPr>
-              <w:t>Event-Time Processing: Luôn xử lý theo Timestamp tạo dữ liệu của cảm biến thay vì giờ của máy chủ.</w:t>
+              <w:t>Event-Time vs Processing-Time: Luôn xử lý theo giờ tạo dữ liệu của cảm biến (Event-Time) để đảm bảo tính đúng đắn.</w:t>
             </w:r>
           </w:p>
           <w:p>
@@ -1646,7 +1958,7 @@
                 <w:color w:val="0F172A"/>
                 <w:sz w:val="18"/>
               </w:rPr>
-              <w:t>Bounded-Out-Of-Orderness Watermarking: Watermark(t) = max(Event_Time) - T_delay. Xử lý dữ liệu đến trễ.</w:t>
+              <w:t>Bounded Watermarking: Watermark(t) = max(Event_Time) - T_delay. Chấp nhận chờ gói tin trễ 5s. Late data đưa vào Side-Output.</w:t>
             </w:r>
           </w:p>
           <w:p>
@@ -1670,7 +1982,7 @@
                 <w:color w:val="0F172A"/>
                 <w:sz w:val="18"/>
               </w:rPr>
-              <w:t>Sliding Window (5m, trượt 1m): Cửa sổ trượt liên tục tính đạo hàm biến thiên áp suất và tốc độ suy thoái.</w:t>
+              <w:t>Sliding Window (5m, trượt 1m): Cửa sổ trượt liên tục tính đạo hàm biến thiên khí áp Delta P / Delta t báo bão.</w:t>
             </w:r>
           </w:p>
         </w:tc>
@@ -1678,7 +1990,69 @@
       <w:tr>
         <w:tc>
           <w:tcPr>
-            <w:tcW w:type="dxa" w:w="9792"/>
+            <w:tcW w:type="dxa" w:w="10080"/>
+            <w:shd w:fill="F8FAFC"/>
+            <w:tcMar>
+              <w:top w:w="60" w:type="dxa"/>
+              <w:bottom w:w="60" w:type="dxa"/>
+              <w:left w:w="120" w:type="dxa"/>
+              <w:right w:w="120" w:type="dxa"/>
+            </w:tcMar>
+          </w:tcPr>
+          <w:p>
+            <w:r>
+              <w:rPr>
+                <w:b/>
+                <w:color w:val="0284C7"/>
+                <w:sz w:val="18"/>
+              </w:rPr>
+              <w:t xml:space="preserve">🔍 Phân tích Khái niệm &amp; Cơ chế Kỹ thuật: </w:t>
+            </w:r>
+            <w:r>
+              <w:rPr>
+                <w:color w:val="0F172A"/>
+                <w:sz w:val="18"/>
+              </w:rPr>
+              <w:t>Giải thuật xử lý dữ liệu trễ mạng và mô hình tính toán cửa sổ thời gian thực phục vụ phát hiện bất thường.</w:t>
+            </w:r>
+          </w:p>
+        </w:tc>
+      </w:tr>
+      <w:tr>
+        <w:tc>
+          <w:tcPr>
+            <w:tcW w:type="dxa" w:w="10080"/>
+            <w:shd w:fill="F1F5F9"/>
+            <w:tcMar>
+              <w:top w:w="60" w:type="dxa"/>
+              <w:bottom w:w="60" w:type="dxa"/>
+              <w:left w:w="120" w:type="dxa"/>
+              <w:right w:w="120" w:type="dxa"/>
+            </w:tcMar>
+          </w:tcPr>
+          <w:p>
+            <w:r>
+              <w:rPr>
+                <w:b/>
+                <w:color w:val="15803D"/>
+                <w:sz w:val="18"/>
+              </w:rPr>
+              <w:t xml:space="preserve">🎨 Visual Design (Nền Trắng Chữ Đen &amp; Bố Cục): </w:t>
+            </w:r>
+            <w:r>
+              <w:rPr>
+                <w:color w:val="0F172A"/>
+                <w:sz w:val="17"/>
+              </w:rPr>
+              <w:t>Nền trắng (#FFFFFF), biểu đồ trục thời gian minh họa Watermark trễ và 2 sơ đồ cửa sổ Tumbling (nối đuôi) vs Sliding (gối đầu 80%).</w:t>
+            </w:r>
+          </w:p>
+        </w:tc>
+      </w:tr>
+      <w:tr>
+        <w:tc>
+          <w:tcPr>
+            <w:tcW w:type="dxa" w:w="10080"/>
             <w:shd w:fill="FEF3C7"/>
             <w:tcMar>
               <w:top w:w="60" w:type="dxa"/>
@@ -1702,7 +2076,7 @@
                 <w:color w:val="0F172A"/>
                 <w:sz w:val="18"/>
               </w:rPr>
-              <w:t>"Watermarking là vũ khí bí mật giúp các bạn giải quyết triệt để vấn đề mạng trễ, đảm bảo tính toán cửa sổ chính xác tuyệt đối."</w:t>
+              <w:t>"Watermarking là vũ khí giải quyết triệt để bài toán mạng chập chờn, giúp cửa sổ phân tích thời gian thực không bao giờ bị tính sai."</w:t>
             </w:r>
           </w:p>
         </w:tc>
@@ -1716,16 +2090,16 @@
         <w:tblLook w:firstColumn="1" w:firstRow="1" w:lastColumn="0" w:lastRow="0" w:noHBand="0" w:noVBand="1" w:val="04A0"/>
       </w:tblPr>
       <w:tblGrid>
-        <w:gridCol w:w="9936"/>
+        <w:gridCol w:w="10080"/>
       </w:tblGrid>
       <w:tr>
         <w:tc>
           <w:tcPr>
-            <w:tcW w:type="dxa" w:w="9792"/>
+            <w:tcW w:type="dxa" w:w="10080"/>
             <w:shd w:fill="15803D"/>
             <w:tcMar>
-              <w:top w:w="60" w:type="dxa"/>
-              <w:bottom w:w="60" w:type="dxa"/>
+              <w:top w:w="70" w:type="dxa"/>
+              <w:bottom w:w="70" w:type="dxa"/>
               <w:left w:w="100" w:type="dxa"/>
               <w:right w:w="100" w:type="dxa"/>
             </w:tcMar>
@@ -1745,11 +2119,11 @@
       <w:tr>
         <w:tc>
           <w:tcPr>
-            <w:tcW w:type="dxa" w:w="9792"/>
+            <w:tcW w:type="dxa" w:w="10080"/>
             <w:shd w:fill="FFFFFF"/>
             <w:tcMar>
-              <w:top w:w="80" w:type="dxa"/>
-              <w:bottom w:w="80" w:type="dxa"/>
+              <w:top w:w="70" w:type="dxa"/>
+              <w:bottom w:w="70" w:type="dxa"/>
               <w:left w:w="120" w:type="dxa"/>
               <w:right w:w="120" w:type="dxa"/>
             </w:tcMar>
@@ -1773,7 +2147,7 @@
                 <w:color w:val="0F172A"/>
                 <w:sz w:val="18"/>
               </w:rPr>
-              <w:t>Redis Hot Cache (&lt; 1ms): Lưu trữ trạng thái tức thời phục vụ Feature Vectors cho AI Model suy luận.</w:t>
+              <w:t>Redis Streams (Hot Cache &lt; 1ms): Bộ nhớ RAM lưu trữ trạng thái tức thời phục vụ Feature Vectors cho AI Model suy luận. Lưu ý: Cấu hình XADD MAXLEN ~ 1000 chống tràn RAM.</w:t>
             </w:r>
           </w:p>
           <w:p>
@@ -1785,7 +2159,7 @@
                 <w:color w:val="0F172A"/>
                 <w:sz w:val="18"/>
               </w:rPr>
-              <w:t>TimescaleDB Hypertables: Biến PostgreSQL thành CSDL chuỗi thời gian phân vùng tự động.</w:t>
+              <w:t>TimescaleDB (Cold Time-Series Engine): Mở rộng PostgreSQL thành CSDL chuỗi thời gian qua Hypertables. Tự động nén Columnar Compression 90%+ dung lượng đĩa và hỗ trợ 100% SQL chuẩn.</w:t>
             </w:r>
           </w:p>
           <w:p>
@@ -1797,7 +2171,7 @@
                 <w:color w:val="0F172A"/>
                 <w:sz w:val="18"/>
               </w:rPr>
-              <w:t>Columnar Compression: Tự động nén dữ liệu cũ giảm 90%+ dung lượng đĩa và hỗ trợ truy vấn SQL chuẩn.</w:t>
+              <w:t>InfluxDB: CSDL chuyên dụng TSM, ghi cực nhanh nhưng hạn chế High Cardinality và phải học ngôn ngữ Flux mới.</w:t>
             </w:r>
           </w:p>
         </w:tc>
@@ -1805,7 +2179,69 @@
       <w:tr>
         <w:tc>
           <w:tcPr>
-            <w:tcW w:type="dxa" w:w="9792"/>
+            <w:tcW w:type="dxa" w:w="10080"/>
+            <w:shd w:fill="F8FAFC"/>
+            <w:tcMar>
+              <w:top w:w="60" w:type="dxa"/>
+              <w:bottom w:w="60" w:type="dxa"/>
+              <w:left w:w="120" w:type="dxa"/>
+              <w:right w:w="120" w:type="dxa"/>
+            </w:tcMar>
+          </w:tcPr>
+          <w:p>
+            <w:r>
+              <w:rPr>
+                <w:b/>
+                <w:color w:val="0284C7"/>
+                <w:sz w:val="18"/>
+              </w:rPr>
+              <w:t xml:space="preserve">🔍 Phân tích Khái niệm &amp; Cơ chế Kỹ thuật: </w:t>
+            </w:r>
+            <w:r>
+              <w:rPr>
+                <w:color w:val="0F172A"/>
+                <w:sz w:val="18"/>
+              </w:rPr>
+              <w:t>Chiến lược phân tầng lưu trữ Hot/Cold tối ưu hóa chi phí phần cứng và tốc độ truy vấn của hệ thống.</w:t>
+            </w:r>
+          </w:p>
+        </w:tc>
+      </w:tr>
+      <w:tr>
+        <w:tc>
+          <w:tcPr>
+            <w:tcW w:type="dxa" w:w="10080"/>
+            <w:shd w:fill="F1F5F9"/>
+            <w:tcMar>
+              <w:top w:w="60" w:type="dxa"/>
+              <w:bottom w:w="60" w:type="dxa"/>
+              <w:left w:w="120" w:type="dxa"/>
+              <w:right w:w="120" w:type="dxa"/>
+            </w:tcMar>
+          </w:tcPr>
+          <w:p>
+            <w:r>
+              <w:rPr>
+                <w:b/>
+                <w:color w:val="15803D"/>
+                <w:sz w:val="18"/>
+              </w:rPr>
+              <w:t xml:space="preserve">🎨 Visual Design (Nền Trắng Chữ Đen &amp; Bố Cục): </w:t>
+            </w:r>
+            <w:r>
+              <w:rPr>
+                <w:color w:val="0F172A"/>
+                <w:sz w:val="17"/>
+              </w:rPr>
+              <w:t>Bảng so sánh phân tầng Hot (Vàng cam nhạt #FFFBEB) ở trên và Cold (Xanh biển nhạt #F0F9FF) ở dưới, chữ đen rõ nét, cột so sánh Latency, Retention, Compression.</w:t>
+            </w:r>
+          </w:p>
+        </w:tc>
+      </w:tr>
+      <w:tr>
+        <w:tc>
+          <w:tcPr>
+            <w:tcW w:type="dxa" w:w="10080"/>
             <w:shd w:fill="FEF3C7"/>
             <w:tcMar>
               <w:top w:w="60" w:type="dxa"/>
@@ -1829,7 +2265,7 @@
                 <w:color w:val="0F172A"/>
                 <w:sz w:val="18"/>
               </w:rPr>
-              <w:t>"Mô hình Hot/Cold Storage giúp hệ thống vừa phục vụ AI suy luận tức thì dưới 5ms, vừa lưu trữ dữ liệu lịch sử phục vụ train model."</w:t>
+              <w:t>"Mô hình Hot/Cold phân tách rõ ràng: Redis phục vụ AI suy luận dưới 5ms, còn TimescaleDB lưu trữ toàn bộ lịch sử phục vụ đào tạo lại mô hình."</w:t>
             </w:r>
           </w:p>
         </w:tc>
@@ -1843,16 +2279,16 @@
         <w:tblLook w:firstColumn="1" w:firstRow="1" w:lastColumn="0" w:lastRow="0" w:noHBand="0" w:noVBand="1" w:val="04A0"/>
       </w:tblPr>
       <w:tblGrid>
-        <w:gridCol w:w="9936"/>
+        <w:gridCol w:w="10080"/>
       </w:tblGrid>
       <w:tr>
         <w:tc>
           <w:tcPr>
-            <w:tcW w:type="dxa" w:w="9792"/>
+            <w:tcW w:type="dxa" w:w="10080"/>
             <w:shd w:fill="15803D"/>
             <w:tcMar>
-              <w:top w:w="60" w:type="dxa"/>
-              <w:bottom w:w="60" w:type="dxa"/>
+              <w:top w:w="70" w:type="dxa"/>
+              <w:bottom w:w="70" w:type="dxa"/>
               <w:left w:w="100" w:type="dxa"/>
               <w:right w:w="100" w:type="dxa"/>
             </w:tcMar>
@@ -1872,11 +2308,11 @@
       <w:tr>
         <w:tc>
           <w:tcPr>
-            <w:tcW w:type="dxa" w:w="9792"/>
+            <w:tcW w:type="dxa" w:w="10080"/>
             <w:shd w:fill="FFFFFF"/>
             <w:tcMar>
-              <w:top w:w="80" w:type="dxa"/>
-              <w:bottom w:w="80" w:type="dxa"/>
+              <w:top w:w="70" w:type="dxa"/>
+              <w:bottom w:w="70" w:type="dxa"/>
               <w:left w:w="120" w:type="dxa"/>
               <w:right w:w="120" w:type="dxa"/>
             </w:tcMar>
@@ -1900,7 +2336,7 @@
                 <w:color w:val="0F172A"/>
                 <w:sz w:val="18"/>
               </w:rPr>
-              <w:t>1. Feature Extraction: Sliding statistics (Mean, StdDev) &amp; FFT frequency harmonics.</w:t>
+              <w:t>1. Feature Extraction: Rolling statistics (Mean, StdDev) &amp; FFT frequency harmonics.</w:t>
             </w:r>
           </w:p>
           <w:p>
@@ -1912,7 +2348,7 @@
                 <w:color w:val="0F172A"/>
                 <w:sz w:val="18"/>
               </w:rPr>
-              <w:t>2. Anomaly Detection: Isolation Forest &amp; Deep Autoencoder Reconstruction Error.</w:t>
+              <w:t>2. Anomaly Detection: Isolation Forest &amp; Deep Autoencoder Reconstruction Error (MSE &gt; Threshold).</w:t>
             </w:r>
           </w:p>
           <w:p>
@@ -1924,7 +2360,7 @@
                 <w:color w:val="0F172A"/>
                 <w:sz w:val="18"/>
               </w:rPr>
-              <w:t>3. Root Cause Analysis (RCA): SHAP feature attribution &amp; Causal Knowledge Graphs.</w:t>
+              <w:t>3. Root Cause Analysis (RCA): SHAP feature attribution &amp; Causal Knowledge Graphs chỉ rõ linh kiện lỗi.</w:t>
             </w:r>
           </w:p>
           <w:p>
@@ -1936,7 +2372,7 @@
                 <w:color w:val="0F172A"/>
                 <w:sz w:val="18"/>
               </w:rPr>
-              <w:t>4. AI Agent (LLM + Guardrails): Contextual reasoning with strict safety policy checks.</w:t>
+              <w:t>4. AI Agent (LLM + Guardrails): Lập luận logic có bọc Deterministic Safety Guardrails chống ảo giác.</w:t>
             </w:r>
           </w:p>
           <w:p>
@@ -1948,7 +2384,7 @@
                 <w:color w:val="0F172A"/>
                 <w:sz w:val="18"/>
               </w:rPr>
-              <w:t>5. Automated Action Execution: Closed-loop MQTT control dispatches &amp; operator escalation.</w:t>
+              <w:t>5. Automated Action Execution: Closed-loop MQTT control dispatches &amp; bảng điều hành khuyến nghị tự động.</w:t>
             </w:r>
           </w:p>
         </w:tc>
@@ -1956,7 +2392,69 @@
       <w:tr>
         <w:tc>
           <w:tcPr>
-            <w:tcW w:type="dxa" w:w="9792"/>
+            <w:tcW w:type="dxa" w:w="10080"/>
+            <w:shd w:fill="F8FAFC"/>
+            <w:tcMar>
+              <w:top w:w="60" w:type="dxa"/>
+              <w:bottom w:w="60" w:type="dxa"/>
+              <w:left w:w="120" w:type="dxa"/>
+              <w:right w:w="120" w:type="dxa"/>
+            </w:tcMar>
+          </w:tcPr>
+          <w:p>
+            <w:r>
+              <w:rPr>
+                <w:b/>
+                <w:color w:val="0284C7"/>
+                <w:sz w:val="18"/>
+              </w:rPr>
+              <w:t xml:space="preserve">🔍 Phân tích Khái niệm &amp; Cơ chế Kỹ thuật: </w:t>
+            </w:r>
+            <w:r>
+              <w:rPr>
+                <w:color w:val="0F172A"/>
+                <w:sz w:val="18"/>
+              </w:rPr>
+              <w:t>Chuỗi 5 bước khép kín chuyển đổi hoàn toàn tín hiệu cảm biến thô thành hành động điều hành tự động.</w:t>
+            </w:r>
+          </w:p>
+        </w:tc>
+      </w:tr>
+      <w:tr>
+        <w:tc>
+          <w:tcPr>
+            <w:tcW w:type="dxa" w:w="10080"/>
+            <w:shd w:fill="F1F5F9"/>
+            <w:tcMar>
+              <w:top w:w="60" w:type="dxa"/>
+              <w:bottom w:w="60" w:type="dxa"/>
+              <w:left w:w="120" w:type="dxa"/>
+              <w:right w:w="120" w:type="dxa"/>
+            </w:tcMar>
+          </w:tcPr>
+          <w:p>
+            <w:r>
+              <w:rPr>
+                <w:b/>
+                <w:color w:val="15803D"/>
+                <w:sz w:val="18"/>
+              </w:rPr>
+              <w:t xml:space="preserve">🎨 Visual Design (Nền Trắng Chữ Đen &amp; Bố Cục): </w:t>
+            </w:r>
+            <w:r>
+              <w:rPr>
+                <w:color w:val="0F172A"/>
+                <w:sz w:val="17"/>
+              </w:rPr>
+              <w:t>Quy trình 5 khối hình chữ nhật liên hoàn dạng Chevron nối bằng mũi tên xanh lá (#15803D), số thứ tự in đậm, chữ đen than chì.</w:t>
+            </w:r>
+          </w:p>
+        </w:tc>
+      </w:tr>
+      <w:tr>
+        <w:tc>
+          <w:tcPr>
+            <w:tcW w:type="dxa" w:w="10080"/>
             <w:shd w:fill="FEF3C7"/>
             <w:tcMar>
               <w:top w:w="60" w:type="dxa"/>
@@ -1980,7 +2478,7 @@
                 <w:color w:val="0F172A"/>
                 <w:sz w:val="18"/>
               </w:rPr>
-              <w:t>"Đây là trái tim của workshop tối nay. 5 bước nối tiếp chuyển hóa hoàn toàn dữ liệu cảm biến thô thành hành động tự động."</w:t>
+              <w:t>"Đây là linh hồn của buổi workshop. 5 bước nối tiếp chuyển hóa hoàn toàn dữ liệu cảm biến thô thành hành động tự động."</w:t>
             </w:r>
           </w:p>
         </w:tc>
@@ -1994,16 +2492,16 @@
         <w:tblLook w:firstColumn="1" w:firstRow="1" w:lastColumn="0" w:lastRow="0" w:noHBand="0" w:noVBand="1" w:val="04A0"/>
       </w:tblPr>
       <w:tblGrid>
-        <w:gridCol w:w="9936"/>
+        <w:gridCol w:w="10080"/>
       </w:tblGrid>
       <w:tr>
         <w:tc>
           <w:tcPr>
-            <w:tcW w:type="dxa" w:w="9792"/>
+            <w:tcW w:type="dxa" w:w="10080"/>
             <w:shd w:fill="15803D"/>
             <w:tcMar>
-              <w:top w:w="60" w:type="dxa"/>
-              <w:bottom w:w="60" w:type="dxa"/>
+              <w:top w:w="70" w:type="dxa"/>
+              <w:bottom w:w="70" w:type="dxa"/>
               <w:left w:w="100" w:type="dxa"/>
               <w:right w:w="100" w:type="dxa"/>
             </w:tcMar>
@@ -2015,7 +2513,7 @@
                 <w:color w:val="FFFFFF"/>
                 <w:sz w:val="22"/>
               </w:rPr>
-              <w:t>SLIDE 09: ANOMALY DETECTION: ISOLATION FOREST VS AUTOENCODERS</w:t>
+              <w:t>SLIDE 09: STEP 1 &amp; 2: FEATURE EXTRACTION &amp; ANOMALY DETECTION</w:t>
             </w:r>
           </w:p>
         </w:tc>
@@ -2023,11 +2521,11 @@
       <w:tr>
         <w:tc>
           <w:tcPr>
-            <w:tcW w:type="dxa" w:w="9792"/>
+            <w:tcW w:type="dxa" w:w="10080"/>
             <w:shd w:fill="FFFFFF"/>
             <w:tcMar>
-              <w:top w:w="80" w:type="dxa"/>
-              <w:bottom w:w="80" w:type="dxa"/>
+              <w:top w:w="70" w:type="dxa"/>
+              <w:bottom w:w="70" w:type="dxa"/>
               <w:left w:w="120" w:type="dxa"/>
               <w:right w:w="120" w:type="dxa"/>
             </w:tcMar>
@@ -2051,7 +2549,7 @@
                 <w:color w:val="0F172A"/>
                 <w:sz w:val="18"/>
               </w:rPr>
-              <w:t>Isolation Forest (Scikit-Learn): Phân lập điểm dị biệt qua cây ngẫu nhiên O(n log n). Cực nhẹ, chạy mượt trên CPU.</w:t>
+              <w:t>Feature Extraction: Miền thời gian (Rolling Mean/Variance, Z-Score) + Miền tần số (FFT trích xuất Harmonic Peaks rung động động cơ).</w:t>
             </w:r>
           </w:p>
           <w:p>
@@ -2063,7 +2561,7 @@
                 <w:color w:val="0F172A"/>
                 <w:sz w:val="18"/>
               </w:rPr>
-              <w:t>Autoencoder Neural Networks: Học biểu diễn trạng thái bình thường. Khi có lỗi mới, Reconstruction Error (MSE) tăng vọt.</w:t>
+              <w:t>Isolation Forest (Scikit-Learn): Phân lập điểm dị biệt qua cây ngẫu nhiên O(n log n). Cực nhanh, chạy trên CPU, không cần nhãn. Đặt contamination=0.03.</w:t>
             </w:r>
           </w:p>
           <w:p>
@@ -2075,7 +2573,7 @@
                 <w:color w:val="0F172A"/>
                 <w:sz w:val="18"/>
               </w:rPr>
-              <w:t>ONNX Runtime Acceleration: Tối ưu hóa suy luận mô hình đạt độ trễ &lt; 5ms.</w:t>
+              <w:t>Autoencoder Neural Network (PyTorch): Nén Latent Space rồi tái tạo. Bất thường khi Reconstruction Error MSE = ||x - x_hat||^2 &gt; Threshold. Export sang ONNX Runtime để suy luận &lt; 5ms.</w:t>
             </w:r>
           </w:p>
         </w:tc>
@@ -2083,7 +2581,69 @@
       <w:tr>
         <w:tc>
           <w:tcPr>
-            <w:tcW w:type="dxa" w:w="9792"/>
+            <w:tcW w:type="dxa" w:w="10080"/>
+            <w:shd w:fill="F8FAFC"/>
+            <w:tcMar>
+              <w:top w:w="60" w:type="dxa"/>
+              <w:bottom w:w="60" w:type="dxa"/>
+              <w:left w:w="120" w:type="dxa"/>
+              <w:right w:w="120" w:type="dxa"/>
+            </w:tcMar>
+          </w:tcPr>
+          <w:p>
+            <w:r>
+              <w:rPr>
+                <w:b/>
+                <w:color w:val="0284C7"/>
+                <w:sz w:val="18"/>
+              </w:rPr>
+              <w:t xml:space="preserve">🔍 Phân tích Khái niệm &amp; Cơ chế Kỹ thuật: </w:t>
+            </w:r>
+            <w:r>
+              <w:rPr>
+                <w:color w:val="0F172A"/>
+                <w:sz w:val="18"/>
+              </w:rPr>
+              <w:t>So sánh toán học và giải thuật giữa Machine Learning cổ điển (Isolation Forest) và Deep Learning (Autoencoder).</w:t>
+            </w:r>
+          </w:p>
+        </w:tc>
+      </w:tr>
+      <w:tr>
+        <w:tc>
+          <w:tcPr>
+            <w:tcW w:type="dxa" w:w="10080"/>
+            <w:shd w:fill="F1F5F9"/>
+            <w:tcMar>
+              <w:top w:w="60" w:type="dxa"/>
+              <w:bottom w:w="60" w:type="dxa"/>
+              <w:left w:w="120" w:type="dxa"/>
+              <w:right w:w="120" w:type="dxa"/>
+            </w:tcMar>
+          </w:tcPr>
+          <w:p>
+            <w:r>
+              <w:rPr>
+                <w:b/>
+                <w:color w:val="15803D"/>
+                <w:sz w:val="18"/>
+              </w:rPr>
+              <w:t xml:space="preserve">🎨 Visual Design (Nền Trắng Chữ Đen &amp; Bố Cục): </w:t>
+            </w:r>
+            <w:r>
+              <w:rPr>
+                <w:color w:val="0F172A"/>
+                <w:sz w:val="17"/>
+              </w:rPr>
+              <w:t>Chia đôi màn hình (Grid-2) nền trắng, bên trái là biểu đồ cây phân lập Isolation Forest, bên phải là mô hình Autoencoder thắt nút cổ chai (Hourglass).</w:t>
+            </w:r>
+          </w:p>
+        </w:tc>
+      </w:tr>
+      <w:tr>
+        <w:tc>
+          <w:tcPr>
+            <w:tcW w:type="dxa" w:w="10080"/>
             <w:shd w:fill="FEF3C7"/>
             <w:tcMar>
               <w:top w:w="60" w:type="dxa"/>
@@ -2107,7 +2667,7 @@
                 <w:color w:val="0F172A"/>
                 <w:sz w:val="18"/>
               </w:rPr>
-              <w:t>"Isolation Forest nằm ngay trong Scikit-Learn rất nhẹ. Nếu dùng Deep Learning Autoencoder, hãy export ra ONNX Runtime để suy luận nhanh."</w:t>
+              <w:t>"Isolation Forest rất nhẹ và sẵn sàng dùng ngay. Nếu dùng Deep Learning Autoencoder, hãy export ra ONNX Runtime để suy luận nhanh."</w:t>
             </w:r>
           </w:p>
         </w:tc>
@@ -2121,16 +2681,16 @@
         <w:tblLook w:firstColumn="1" w:firstRow="1" w:lastColumn="0" w:lastRow="0" w:noHBand="0" w:noVBand="1" w:val="04A0"/>
       </w:tblPr>
       <w:tblGrid>
-        <w:gridCol w:w="9936"/>
+        <w:gridCol w:w="10080"/>
       </w:tblGrid>
       <w:tr>
         <w:tc>
           <w:tcPr>
-            <w:tcW w:type="dxa" w:w="9792"/>
+            <w:tcW w:type="dxa" w:w="10080"/>
             <w:shd w:fill="15803D"/>
             <w:tcMar>
-              <w:top w:w="60" w:type="dxa"/>
-              <w:bottom w:w="60" w:type="dxa"/>
+              <w:top w:w="70" w:type="dxa"/>
+              <w:bottom w:w="70" w:type="dxa"/>
               <w:left w:w="100" w:type="dxa"/>
               <w:right w:w="100" w:type="dxa"/>
             </w:tcMar>
@@ -2142,7 +2702,7 @@
                 <w:color w:val="FFFFFF"/>
                 <w:sz w:val="22"/>
               </w:rPr>
-              <w:t>SLIDE 10: ROOT CAUSE ANALYSIS (RCA) &amp; EXPLAINABLE AI</w:t>
+              <w:t>SLIDE 10: STEP 3: ROOT CAUSE ANALYSIS (RCA) &amp; EXPLAINABILITY</w:t>
             </w:r>
           </w:p>
         </w:tc>
@@ -2150,11 +2710,11 @@
       <w:tr>
         <w:tc>
           <w:tcPr>
-            <w:tcW w:type="dxa" w:w="9792"/>
+            <w:tcW w:type="dxa" w:w="10080"/>
             <w:shd w:fill="FFFFFF"/>
             <w:tcMar>
-              <w:top w:w="80" w:type="dxa"/>
-              <w:bottom w:w="80" w:type="dxa"/>
+              <w:top w:w="70" w:type="dxa"/>
+              <w:bottom w:w="70" w:type="dxa"/>
               <w:left w:w="120" w:type="dxa"/>
               <w:right w:w="120" w:type="dxa"/>
             </w:tcMar>
@@ -2178,7 +2738,7 @@
                 <w:color w:val="0F172A"/>
                 <w:sz w:val="18"/>
               </w:rPr>
-              <w:t>SHAP (SHapley Additive exPlanations): Bóc tách tỷ lệ % đóng góp của từng cảm biến vào điểm bất thường.</w:t>
+              <w:t>SHAP (Shapley Additive exPlanations): Đo lường mức đóng góp % của từng cảm biến vào điểm bất thường (Ví dụ: Rung trục +78%, Áp suất +14%, Nhiệt độ +8%). Giúp giải thích tường minh (XAI).</w:t>
             </w:r>
           </w:p>
           <w:p>
@@ -2190,19 +2750,7 @@
                 <w:color w:val="0F172A"/>
                 <w:sz w:val="18"/>
               </w:rPr>
-              <w:t>Causal Knowledge Graphs: Biểu diễn quan hệ phụ thuộc vật lý (Ví dụ: Bơm hỏng -&gt; Tản nhiệt tăng nhiệt -&gt; Van quá áp).</w:t>
-            </w:r>
-          </w:p>
-          <w:p>
-            <w:pPr>
-              <w:pStyle w:val="ListBullet"/>
-            </w:pPr>
-            <w:r>
-              <w:rPr>
-                <w:color w:val="0F172A"/>
-                <w:sz w:val="18"/>
-              </w:rPr>
-              <w:t>Lợi ích: Chỉ rõ linh kiện chính bị hỏng thay vì báo lỗi chung chung.</w:t>
+              <w:t>Causal Knowledge Graphs: Đồ thị DAG mô tả quan hệ nhân quả vật lý (Tắc van A -&gt; Tăng áp B -&gt; Quá nhiệt C). Phân biệt chính xác 'Nguyên nhân gốc' vs 'Triệu chứng lan truyền'.</w:t>
             </w:r>
           </w:p>
         </w:tc>
@@ -2210,7 +2758,69 @@
       <w:tr>
         <w:tc>
           <w:tcPr>
-            <w:tcW w:type="dxa" w:w="9792"/>
+            <w:tcW w:type="dxa" w:w="10080"/>
+            <w:shd w:fill="F8FAFC"/>
+            <w:tcMar>
+              <w:top w:w="60" w:type="dxa"/>
+              <w:bottom w:w="60" w:type="dxa"/>
+              <w:left w:w="120" w:type="dxa"/>
+              <w:right w:w="120" w:type="dxa"/>
+            </w:tcMar>
+          </w:tcPr>
+          <w:p>
+            <w:r>
+              <w:rPr>
+                <w:b/>
+                <w:color w:val="0284C7"/>
+                <w:sz w:val="18"/>
+              </w:rPr>
+              <w:t xml:space="preserve">🔍 Phân tích Khái niệm &amp; Cơ chế Kỹ thuật: </w:t>
+            </w:r>
+            <w:r>
+              <w:rPr>
+                <w:color w:val="0F172A"/>
+                <w:sz w:val="18"/>
+              </w:rPr>
+              <w:t>Phương pháp chẩn đoán nguyên nhân gốc rễ và ứng dụng Explainable AI trong bảo trì dự đoán.</w:t>
+            </w:r>
+          </w:p>
+        </w:tc>
+      </w:tr>
+      <w:tr>
+        <w:tc>
+          <w:tcPr>
+            <w:tcW w:type="dxa" w:w="10080"/>
+            <w:shd w:fill="F1F5F9"/>
+            <w:tcMar>
+              <w:top w:w="60" w:type="dxa"/>
+              <w:bottom w:w="60" w:type="dxa"/>
+              <w:left w:w="120" w:type="dxa"/>
+              <w:right w:w="120" w:type="dxa"/>
+            </w:tcMar>
+          </w:tcPr>
+          <w:p>
+            <w:r>
+              <w:rPr>
+                <w:b/>
+                <w:color w:val="15803D"/>
+                <w:sz w:val="18"/>
+              </w:rPr>
+              <w:t xml:space="preserve">🎨 Visual Design (Nền Trắng Chữ Đen &amp; Bố Cục): </w:t>
+            </w:r>
+            <w:r>
+              <w:rPr>
+                <w:color w:val="0F172A"/>
+                <w:sz w:val="17"/>
+              </w:rPr>
+              <w:t>Nền trắng (#FFFFFF), thẻ trái có biểu đồ thanh ngang SHAP Waterfall, thẻ phải có đồ thị nút mạng (Nodes) nối mũi tên đỏ chỉ vào nút gốc.</w:t>
+            </w:r>
+          </w:p>
+        </w:tc>
+      </w:tr>
+      <w:tr>
+        <w:tc>
+          <w:tcPr>
+            <w:tcW w:type="dxa" w:w="10080"/>
             <w:shd w:fill="FEF3C7"/>
             <w:tcMar>
               <w:top w:w="60" w:type="dxa"/>
@@ -2234,7 +2844,7 @@
                 <w:color w:val="0F172A"/>
                 <w:sz w:val="18"/>
               </w:rPr>
-              <w:t>"SHAP values và Knowledge Graphs giúp bạn giải thích cho Giám khảo lý do AI phát hiện đúng linh kiện bị hỏng."</w:t>
+              <w:t>"Đừng chỉ báo lỗi chung chung! Hãy dùng SHAP để chỉ rõ cho Giám khảo thấy linh kiện nào đang gây ra 80% nguyên nhân sự cố."</w:t>
             </w:r>
           </w:p>
         </w:tc>
@@ -2248,16 +2858,16 @@
         <w:tblLook w:firstColumn="1" w:firstRow="1" w:lastColumn="0" w:lastRow="0" w:noHBand="0" w:noVBand="1" w:val="04A0"/>
       </w:tblPr>
       <w:tblGrid>
-        <w:gridCol w:w="9936"/>
+        <w:gridCol w:w="10080"/>
       </w:tblGrid>
       <w:tr>
         <w:tc>
           <w:tcPr>
-            <w:tcW w:type="dxa" w:w="9792"/>
+            <w:tcW w:type="dxa" w:w="10080"/>
             <w:shd w:fill="15803D"/>
             <w:tcMar>
-              <w:top w:w="60" w:type="dxa"/>
-              <w:bottom w:w="60" w:type="dxa"/>
+              <w:top w:w="70" w:type="dxa"/>
+              <w:bottom w:w="70" w:type="dxa"/>
               <w:left w:w="100" w:type="dxa"/>
               <w:right w:w="100" w:type="dxa"/>
             </w:tcMar>
@@ -2269,7 +2879,7 @@
                 <w:color w:val="FFFFFF"/>
                 <w:sz w:val="22"/>
               </w:rPr>
-              <w:t>SLIDE 11: AI AGENTS, LLMS &amp; DETERMINISTIC SAFETY GUARDRAILS</w:t>
+              <w:t>SLIDE 11: STEP 4: AI AGENTS, LLMS &amp; SAFETY GUARDRAILS</w:t>
             </w:r>
           </w:p>
         </w:tc>
@@ -2277,11 +2887,11 @@
       <w:tr>
         <w:tc>
           <w:tcPr>
-            <w:tcW w:type="dxa" w:w="9792"/>
+            <w:tcW w:type="dxa" w:w="10080"/>
             <w:shd w:fill="FFFFFF"/>
             <w:tcMar>
-              <w:top w:w="80" w:type="dxa"/>
-              <w:bottom w:w="80" w:type="dxa"/>
+              <w:top w:w="70" w:type="dxa"/>
+              <w:bottom w:w="70" w:type="dxa"/>
               <w:left w:w="120" w:type="dxa"/>
               <w:right w:w="120" w:type="dxa"/>
             </w:tcMar>
@@ -2305,7 +2915,7 @@
                 <w:color w:val="0F172A"/>
                 <w:sz w:val="18"/>
               </w:rPr>
-              <w:t>LLM Reasoning (Gemini / OpenAI): Tổng hợp dữ liệu RCA, thông số kỹ thuật và cẩm nang vận hành (SOPs).</w:t>
+              <w:t>LLM Reasoning Engine (Gemini / OpenAI): Tiếp nhận chỉ số cảm biến + kết quả RCA SHAP + cẩm nang SOPs để lập luận và chọn tool (Function Calling).</w:t>
             </w:r>
           </w:p>
           <w:p>
@@ -2317,19 +2927,7 @@
                 <w:color w:val="0F172A"/>
                 <w:sz w:val="18"/>
               </w:rPr>
-              <w:t>Safety Guardrails (Rule Engine &amp; Policies): Kiểm soát an toàn bắt buộc trước khi phát lệnh.</w:t>
-            </w:r>
-          </w:p>
-          <w:p>
-            <w:pPr>
-              <w:pStyle w:val="ListBullet"/>
-            </w:pPr>
-            <w:r>
-              <w:rPr>
-                <w:color w:val="0F172A"/>
-                <w:sz w:val="18"/>
-              </w:rPr>
-              <w:t>Quy tắc vàng: Tuyệt đối không để LLM tự do gửi lệnh vật lý mà không qua lớp kiểm duyệt an toàn.</w:t>
+              <w:t>Deterministic Safety Guardrails: Chốt chặn kiểm duyệt an toàn bắt buộc trước khi phát lệnh vật lý (Ví dụ: 'Không đóng van chính nếu áp lực &gt; 100 bar'). Có quyền PHỦ QUYẾT tuyệt đối mọi lệnh vi phạm của LLM.</w:t>
             </w:r>
           </w:p>
         </w:tc>
@@ -2337,7 +2935,69 @@
       <w:tr>
         <w:tc>
           <w:tcPr>
-            <w:tcW w:type="dxa" w:w="9792"/>
+            <w:tcW w:type="dxa" w:w="10080"/>
+            <w:shd w:fill="F8FAFC"/>
+            <w:tcMar>
+              <w:top w:w="60" w:type="dxa"/>
+              <w:bottom w:w="60" w:type="dxa"/>
+              <w:left w:w="120" w:type="dxa"/>
+              <w:right w:w="120" w:type="dxa"/>
+            </w:tcMar>
+          </w:tcPr>
+          <w:p>
+            <w:r>
+              <w:rPr>
+                <w:b/>
+                <w:color w:val="0284C7"/>
+                <w:sz w:val="18"/>
+              </w:rPr>
+              <w:t xml:space="preserve">🔍 Phân tích Khái niệm &amp; Cơ chế Kỹ thuật: </w:t>
+            </w:r>
+            <w:r>
+              <w:rPr>
+                <w:color w:val="0F172A"/>
+                <w:sz w:val="18"/>
+              </w:rPr>
+              <w:t>Cơ chế lập luận ngữ cảnh của AI Agent và lớp kiểm soát an toàn vật lý chống ảo giác (Hallucination).</w:t>
+            </w:r>
+          </w:p>
+        </w:tc>
+      </w:tr>
+      <w:tr>
+        <w:tc>
+          <w:tcPr>
+            <w:tcW w:type="dxa" w:w="10080"/>
+            <w:shd w:fill="F1F5F9"/>
+            <w:tcMar>
+              <w:top w:w="60" w:type="dxa"/>
+              <w:bottom w:w="60" w:type="dxa"/>
+              <w:left w:w="120" w:type="dxa"/>
+              <w:right w:w="120" w:type="dxa"/>
+            </w:tcMar>
+          </w:tcPr>
+          <w:p>
+            <w:r>
+              <w:rPr>
+                <w:b/>
+                <w:color w:val="15803D"/>
+                <w:sz w:val="18"/>
+              </w:rPr>
+              <w:t xml:space="preserve">🎨 Visual Design (Nền Trắng Chữ Đen &amp; Bố Cục): </w:t>
+            </w:r>
+            <w:r>
+              <w:rPr>
+                <w:color w:val="0F172A"/>
+                <w:sz w:val="17"/>
+              </w:rPr>
+              <w:t>Sơ đồ 3 lớp bảo vệ đồng tâm nền trắng, lớp lõi LLM (Xanh dương), lớp bao bọc Guardrails (Vàng viền đỏ #DC2626), lớp ngoài Actuators (Xanh lá).</w:t>
+            </w:r>
+          </w:p>
+        </w:tc>
+      </w:tr>
+      <w:tr>
+        <w:tc>
+          <w:tcPr>
+            <w:tcW w:type="dxa" w:w="10080"/>
             <w:shd w:fill="FEF3C7"/>
             <w:tcMar>
               <w:top w:w="60" w:type="dxa"/>
@@ -2361,7 +3021,7 @@
                 <w:color w:val="0F172A"/>
                 <w:sz w:val="18"/>
               </w:rPr>
-              <w:t>"LLM giúp lập luận ngữ cảnh, còn Safety Guardrails bảo đảm hệ thống không bao giờ bị ảo giác gây sự cố vật lý."</w:t>
+              <w:t>"Mô hình ngôn ngữ lớn rất giỏi suy luận nhưng không thể để nó tự do gửi lệnh vật lý. Lớp Safety Guardrails là chốt chặn an toàn bắt buộc."</w:t>
             </w:r>
           </w:p>
         </w:tc>
@@ -2375,16 +3035,16 @@
         <w:tblLook w:firstColumn="1" w:firstRow="1" w:lastColumn="0" w:lastRow="0" w:noHBand="0" w:noVBand="1" w:val="04A0"/>
       </w:tblPr>
       <w:tblGrid>
-        <w:gridCol w:w="9936"/>
+        <w:gridCol w:w="10080"/>
       </w:tblGrid>
       <w:tr>
         <w:tc>
           <w:tcPr>
-            <w:tcW w:type="dxa" w:w="9792"/>
+            <w:tcW w:type="dxa" w:w="10080"/>
             <w:shd w:fill="15803D"/>
             <w:tcMar>
-              <w:top w:w="60" w:type="dxa"/>
-              <w:bottom w:w="60" w:type="dxa"/>
+              <w:top w:w="70" w:type="dxa"/>
+              <w:bottom w:w="70" w:type="dxa"/>
               <w:left w:w="100" w:type="dxa"/>
               <w:right w:w="100" w:type="dxa"/>
             </w:tcMar>
@@ -2404,11 +3064,11 @@
       <w:tr>
         <w:tc>
           <w:tcPr>
-            <w:tcW w:type="dxa" w:w="9792"/>
+            <w:tcW w:type="dxa" w:w="10080"/>
             <w:shd w:fill="FFFFFF"/>
             <w:tcMar>
-              <w:top w:w="80" w:type="dxa"/>
-              <w:bottom w:w="80" w:type="dxa"/>
+              <w:top w:w="70" w:type="dxa"/>
+              <w:bottom w:w="70" w:type="dxa"/>
               <w:left w:w="120" w:type="dxa"/>
               <w:right w:w="120" w:type="dxa"/>
             </w:tcMar>
@@ -2432,7 +3092,7 @@
                 <w:color w:val="0F172A"/>
                 <w:sz w:val="18"/>
               </w:rPr>
-              <w:t>Automated Closed-Loop: Gửi lệnh MQTT/API ngắt thiết bị khẩn cấp, bật quạt phụ hoặc điều chỉnh bơm.</w:t>
+              <w:t>Automated Closed-Loop: Gửi lệnh MQTT/API ngắt thiết bị khẩn cấp, mở trạm bơm tiêu úng tối đa công suất khi mưa &gt; 40 mm/h, bật phun sương làm mát khi Heat Index &gt;= 40°C.</w:t>
             </w:r>
           </w:p>
           <w:p>
@@ -2444,7 +3104,7 @@
                 <w:color w:val="0F172A"/>
                 <w:sz w:val="18"/>
               </w:rPr>
-              <w:t>Human-in-the-Loop: Đẩy báo cáo ngôn ngữ tự nhiên về Telegram/Dashboard với nút bấm 1-click 'Approve Action'.</w:t>
+              <w:t>Human-in-the-Loop: Đẩy báo cáo Markdown về Telegram/Dashboard với nút bấm 1-chạm 'Xác Nhận Thực Hiện' hoặc 'Từ Chối' cho kỹ sư trưởng.</w:t>
             </w:r>
           </w:p>
         </w:tc>
@@ -2452,7 +3112,69 @@
       <w:tr>
         <w:tc>
           <w:tcPr>
-            <w:tcW w:type="dxa" w:w="9792"/>
+            <w:tcW w:type="dxa" w:w="10080"/>
+            <w:shd w:fill="F8FAFC"/>
+            <w:tcMar>
+              <w:top w:w="60" w:type="dxa"/>
+              <w:bottom w:w="60" w:type="dxa"/>
+              <w:left w:w="120" w:type="dxa"/>
+              <w:right w:w="120" w:type="dxa"/>
+            </w:tcMar>
+          </w:tcPr>
+          <w:p>
+            <w:r>
+              <w:rPr>
+                <w:b/>
+                <w:color w:val="0284C7"/>
+                <w:sz w:val="18"/>
+              </w:rPr>
+              <w:t xml:space="preserve">🔍 Phân tích Khái niệm &amp; Cơ chế Kỹ thuật: </w:t>
+            </w:r>
+            <w:r>
+              <w:rPr>
+                <w:color w:val="0F172A"/>
+                <w:sz w:val="18"/>
+              </w:rPr>
+              <w:t>Hai chế độ thực thi hành động tự động: Tự hành hoàn toàn cho sự cố khẩn cấp và Bán tự động có con người giám sát.</w:t>
+            </w:r>
+          </w:p>
+        </w:tc>
+      </w:tr>
+      <w:tr>
+        <w:tc>
+          <w:tcPr>
+            <w:tcW w:type="dxa" w:w="10080"/>
+            <w:shd w:fill="F1F5F9"/>
+            <w:tcMar>
+              <w:top w:w="60" w:type="dxa"/>
+              <w:bottom w:w="60" w:type="dxa"/>
+              <w:left w:w="120" w:type="dxa"/>
+              <w:right w:w="120" w:type="dxa"/>
+            </w:tcMar>
+          </w:tcPr>
+          <w:p>
+            <w:r>
+              <w:rPr>
+                <w:b/>
+                <w:color w:val="15803D"/>
+                <w:sz w:val="18"/>
+              </w:rPr>
+              <w:t xml:space="preserve">🎨 Visual Design (Nền Trắng Chữ Đen &amp; Bố Cục): </w:t>
+            </w:r>
+            <w:r>
+              <w:rPr>
+                <w:color w:val="0F172A"/>
+                <w:sz w:val="17"/>
+              </w:rPr>
+              <w:t>Nền trắng (#FFFFFF), sơ đồ mũi tên vòng lặp khép kín tuần hoàn lớn màu xanh lá (#15803D) từ Cảm biến -&gt; AI Agent -&gt; Actuator -&gt; Trạng thái an toàn.</w:t>
+            </w:r>
+          </w:p>
+        </w:tc>
+      </w:tr>
+      <w:tr>
+        <w:tc>
+          <w:tcPr>
+            <w:tcW w:type="dxa" w:w="10080"/>
             <w:shd w:fill="FEF3C7"/>
             <w:tcMar>
               <w:top w:w="60" w:type="dxa"/>
@@ -2476,7 +3198,7 @@
                 <w:color w:val="0F172A"/>
                 <w:sz w:val="18"/>
               </w:rPr>
-              <w:t>"Vòng lặp hoàn chỉnh! Từ dữ liệu cảm biến ban đầu, hệ thống đã tự động ra lệnh khắc phục sự cố mà không cần con người can thiệp thủ công."</w:t>
+              <w:t>"Vòng lặp hoàn tất: Dữ liệu cảm biến vào -&gt; AI chẩn đoán -&gt; Lệnh tự động kích hoạt thiết bị xử lý mà không cần con người can thiệp thủ công."</w:t>
             </w:r>
           </w:p>
         </w:tc>
@@ -2490,16 +3212,16 @@
         <w:tblLook w:firstColumn="1" w:firstRow="1" w:lastColumn="0" w:lastRow="0" w:noHBand="0" w:noVBand="1" w:val="04A0"/>
       </w:tblPr>
       <w:tblGrid>
-        <w:gridCol w:w="9936"/>
+        <w:gridCol w:w="10080"/>
       </w:tblGrid>
       <w:tr>
         <w:tc>
           <w:tcPr>
-            <w:tcW w:type="dxa" w:w="9792"/>
+            <w:tcW w:type="dxa" w:w="10080"/>
             <w:shd w:fill="15803D"/>
             <w:tcMar>
-              <w:top w:w="60" w:type="dxa"/>
-              <w:bottom w:w="60" w:type="dxa"/>
+              <w:top w:w="70" w:type="dxa"/>
+              <w:bottom w:w="70" w:type="dxa"/>
               <w:left w:w="100" w:type="dxa"/>
               <w:right w:w="100" w:type="dxa"/>
             </w:tcMar>
@@ -2519,11 +3241,11 @@
       <w:tr>
         <w:tc>
           <w:tcPr>
-            <w:tcW w:type="dxa" w:w="9792"/>
+            <w:tcW w:type="dxa" w:w="10080"/>
             <w:shd w:fill="FFFFFF"/>
             <w:tcMar>
-              <w:top w:w="80" w:type="dxa"/>
-              <w:bottom w:w="80" w:type="dxa"/>
+              <w:top w:w="70" w:type="dxa"/>
+              <w:bottom w:w="70" w:type="dxa"/>
               <w:left w:w="120" w:type="dxa"/>
               <w:right w:w="120" w:type="dxa"/>
             </w:tcMar>
@@ -2547,7 +3269,7 @@
                 <w:color w:val="0F172A"/>
                 <w:sz w:val="18"/>
               </w:rPr>
-              <w:t>Data Producer: Python IoT Simulator (paho-mqtt) giả lập đa trạm vật lý.</w:t>
+              <w:t>Data Producer: weather-simulator (Python asyncio phát đa trạm thời gian thực).</w:t>
             </w:r>
           </w:p>
           <w:p>
@@ -2559,7 +3281,7 @@
                 <w:color w:val="0F172A"/>
                 <w:sz w:val="18"/>
               </w:rPr>
-              <w:t>Broker &amp; Middleware: Mosquitto Broker + Redpanda Event Log + FastAPI.</w:t>
+              <w:t>Ingestion Gateways: weather-mqtt-bridge (:1883) &amp; weather-coap-gateway (:5683 UDP).</w:t>
             </w:r>
           </w:p>
           <w:p>
@@ -2571,7 +3293,7 @@
                 <w:color w:val="0F172A"/>
                 <w:sz w:val="18"/>
               </w:rPr>
-              <w:t>Stream &amp; AI Engine: Bounded Watermarks + ONNX Models + Fallback Heuristics.</w:t>
+              <w:t>Event Broker: weather-redpanda (:9092) + weather-redpanda-console (:8088 Web UI).</w:t>
             </w:r>
           </w:p>
           <w:p>
@@ -2583,7 +3305,19 @@
                 <w:color w:val="0F172A"/>
                 <w:sz w:val="18"/>
               </w:rPr>
-              <w:t>Dashboard: WebSockets + Leaflet Map + Bảng điều hành tự động.</w:t>
+              <w:t>Stream &amp; AI Engine: weather-stream-engine (Watermarking, Windowing, ONNX Inference).</w:t>
+            </w:r>
+          </w:p>
+          <w:p>
+            <w:pPr>
+              <w:pStyle w:val="ListBullet"/>
+            </w:pPr>
+            <w:r>
+              <w:rPr>
+                <w:color w:val="0F172A"/>
+                <w:sz w:val="18"/>
+              </w:rPr>
+              <w:t>Backend &amp; UI: weather-web-dashboard (FastAPI, WebSockets, Leaflet Map :8000).</w:t>
             </w:r>
           </w:p>
         </w:tc>
@@ -2591,7 +3325,69 @@
       <w:tr>
         <w:tc>
           <w:tcPr>
-            <w:tcW w:type="dxa" w:w="9792"/>
+            <w:tcW w:type="dxa" w:w="10080"/>
+            <w:shd w:fill="F8FAFC"/>
+            <w:tcMar>
+              <w:top w:w="60" w:type="dxa"/>
+              <w:bottom w:w="60" w:type="dxa"/>
+              <w:left w:w="120" w:type="dxa"/>
+              <w:right w:w="120" w:type="dxa"/>
+            </w:tcMar>
+          </w:tcPr>
+          <w:p>
+            <w:r>
+              <w:rPr>
+                <w:b/>
+                <w:color w:val="0284C7"/>
+                <w:sz w:val="18"/>
+              </w:rPr>
+              <w:t xml:space="preserve">🔍 Phân tích Khái niệm &amp; Cơ chế Kỹ thuật: </w:t>
+            </w:r>
+            <w:r>
+              <w:rPr>
+                <w:color w:val="0F172A"/>
+                <w:sz w:val="18"/>
+              </w:rPr>
+              <w:t>Bản thiết kế hệ thống hoàn chỉnh 100% container hóa bằng Docker Compose cho các đội thi triển khai ngay.</w:t>
+            </w:r>
+          </w:p>
+        </w:tc>
+      </w:tr>
+      <w:tr>
+        <w:tc>
+          <w:tcPr>
+            <w:tcW w:type="dxa" w:w="10080"/>
+            <w:shd w:fill="F1F5F9"/>
+            <w:tcMar>
+              <w:top w:w="60" w:type="dxa"/>
+              <w:bottom w:w="60" w:type="dxa"/>
+              <w:left w:w="120" w:type="dxa"/>
+              <w:right w:w="120" w:type="dxa"/>
+            </w:tcMar>
+          </w:tcPr>
+          <w:p>
+            <w:r>
+              <w:rPr>
+                <w:b/>
+                <w:color w:val="15803D"/>
+                <w:sz w:val="18"/>
+              </w:rPr>
+              <w:t xml:space="preserve">🎨 Visual Design (Nền Trắng Chữ Đen &amp; Bố Cục): </w:t>
+            </w:r>
+            <w:r>
+              <w:rPr>
+                <w:color w:val="0F172A"/>
+                <w:sz w:val="17"/>
+              </w:rPr>
+              <w:t>Sơ đồ Blueprint toàn diện nền trắng, các container đóng khung viền nét đứt (#94A3B8), cổng kết nối đóng khung vàng (#FEF3C7).</w:t>
+            </w:r>
+          </w:p>
+        </w:tc>
+      </w:tr>
+      <w:tr>
+        <w:tc>
+          <w:tcPr>
+            <w:tcW w:type="dxa" w:w="10080"/>
             <w:shd w:fill="FEF3C7"/>
             <w:tcMar>
               <w:top w:w="60" w:type="dxa"/>
@@ -2629,16 +3425,16 @@
         <w:tblLook w:firstColumn="1" w:firstRow="1" w:lastColumn="0" w:lastRow="0" w:noHBand="0" w:noVBand="1" w:val="04A0"/>
       </w:tblPr>
       <w:tblGrid>
-        <w:gridCol w:w="9936"/>
+        <w:gridCol w:w="10080"/>
       </w:tblGrid>
       <w:tr>
         <w:tc>
           <w:tcPr>
-            <w:tcW w:type="dxa" w:w="9792"/>
+            <w:tcW w:type="dxa" w:w="10080"/>
             <w:shd w:fill="15803D"/>
             <w:tcMar>
-              <w:top w:w="60" w:type="dxa"/>
-              <w:bottom w:w="60" w:type="dxa"/>
+              <w:top w:w="70" w:type="dxa"/>
+              <w:bottom w:w="70" w:type="dxa"/>
               <w:left w:w="100" w:type="dxa"/>
               <w:right w:w="100" w:type="dxa"/>
             </w:tcMar>
@@ -2658,11 +3454,11 @@
       <w:tr>
         <w:tc>
           <w:tcPr>
-            <w:tcW w:type="dxa" w:w="9792"/>
+            <w:tcW w:type="dxa" w:w="10080"/>
             <w:shd w:fill="FFFFFF"/>
             <w:tcMar>
-              <w:top w:w="80" w:type="dxa"/>
-              <w:bottom w:w="80" w:type="dxa"/>
+              <w:top w:w="70" w:type="dxa"/>
+              <w:bottom w:w="70" w:type="dxa"/>
               <w:left w:w="120" w:type="dxa"/>
               <w:right w:w="120" w:type="dxa"/>
             </w:tcMar>
@@ -2686,7 +3482,7 @@
                 <w:color w:val="0F172A"/>
                 <w:sz w:val="18"/>
               </w:rPr>
-              <w:t>FastAPI: Web framework phi đồng bộ siêu nhanh cho REST API &amp; WebSockets.</w:t>
+              <w:t>FastAPI &amp; Paho-MQTT: Backend phi đồng bộ siêu tốc độ xử lý hàng chục nghìn req/s, tích hợp WebSockets và tự sinh tài liệu OpenAPI.</w:t>
             </w:r>
           </w:p>
           <w:p>
@@ -2698,7 +3494,7 @@
                 <w:color w:val="0F172A"/>
                 <w:sz w:val="18"/>
               </w:rPr>
-              <w:t>paho-mqtt: Thư viện client gọn nhẹ để tạo trình giả lập IoT trong Python.</w:t>
+              <w:t>Leaflet.js &amp; Chart.js: Trực quan hóa bản đồ địa lý và biểu đồ dòng dữ liệu trượt 60fps mà không cần framework cồng kềnh.</w:t>
             </w:r>
           </w:p>
           <w:p>
@@ -2710,7 +3506,7 @@
                 <w:color w:val="0F172A"/>
                 <w:sz w:val="18"/>
               </w:rPr>
-              <w:t>TimescaleDB &amp; Redis: Cặp bài trùng lưu trữ Hot/Cold tối ưu.</w:t>
+              <w:t>PyTorch -&gt; ONNX Runtime: Huấn luyện mô hình dễ dàng trong PyTorch rồi xuất file .onnx để suy luận tốc độ C++ &lt; 5ms.</w:t>
             </w:r>
           </w:p>
           <w:p>
@@ -2722,7 +3518,7 @@
                 <w:color w:val="0F172A"/>
                 <w:sz w:val="18"/>
               </w:rPr>
-              <w:t>Leaflet.js &amp; Chart.js: Trực quan hóa bản đồ và dòng dữ liệu thời gian thực.</w:t>
+              <w:t>Docker Compose: Đóng gói toàn bộ 8 services trong 1 file cấu hình, chạy 1-Click docker compose up -d.</w:t>
             </w:r>
           </w:p>
         </w:tc>
@@ -2730,7 +3526,69 @@
       <w:tr>
         <w:tc>
           <w:tcPr>
-            <w:tcW w:type="dxa" w:w="9792"/>
+            <w:tcW w:type="dxa" w:w="10080"/>
+            <w:shd w:fill="F8FAFC"/>
+            <w:tcMar>
+              <w:top w:w="60" w:type="dxa"/>
+              <w:bottom w:w="60" w:type="dxa"/>
+              <w:left w:w="120" w:type="dxa"/>
+              <w:right w:w="120" w:type="dxa"/>
+            </w:tcMar>
+          </w:tcPr>
+          <w:p>
+            <w:r>
+              <w:rPr>
+                <w:b/>
+                <w:color w:val="0284C7"/>
+                <w:sz w:val="18"/>
+              </w:rPr>
+              <w:t xml:space="preserve">🔍 Phân tích Khái niệm &amp; Cơ chế Kỹ thuật: </w:t>
+            </w:r>
+            <w:r>
+              <w:rPr>
+                <w:color w:val="0F172A"/>
+                <w:sz w:val="18"/>
+              </w:rPr>
+              <w:t>Phân tích lý do lựa chọn bộ công cụ nhẹ, hiệu năng cao, ít tốn RAM và dễ debug trong 48 giờ thi.</w:t>
+            </w:r>
+          </w:p>
+        </w:tc>
+      </w:tr>
+      <w:tr>
+        <w:tc>
+          <w:tcPr>
+            <w:tcW w:type="dxa" w:w="10080"/>
+            <w:shd w:fill="F1F5F9"/>
+            <w:tcMar>
+              <w:top w:w="60" w:type="dxa"/>
+              <w:bottom w:w="60" w:type="dxa"/>
+              <w:left w:w="120" w:type="dxa"/>
+              <w:right w:w="120" w:type="dxa"/>
+            </w:tcMar>
+          </w:tcPr>
+          <w:p>
+            <w:r>
+              <w:rPr>
+                <w:b/>
+                <w:color w:val="15803D"/>
+                <w:sz w:val="18"/>
+              </w:rPr>
+              <w:t xml:space="preserve">🎨 Visual Design (Nền Trắng Chữ Đen &amp; Bố Cục): </w:t>
+            </w:r>
+            <w:r>
+              <w:rPr>
+                <w:color w:val="0F172A"/>
+                <w:sz w:val="17"/>
+              </w:rPr>
+              <w:t>Lưới 4 thẻ công nghệ (Grid-4) nền trắng, icon nhận diện thương hiệu, danh sách 3 tính năng cốt lõi và thanh đánh giá hiệu năng.</w:t>
+            </w:r>
+          </w:p>
+        </w:tc>
+      </w:tr>
+      <w:tr>
+        <w:tc>
+          <w:tcPr>
+            <w:tcW w:type="dxa" w:w="10080"/>
             <w:shd w:fill="FEF3C7"/>
             <w:tcMar>
               <w:top w:w="60" w:type="dxa"/>
@@ -2768,16 +3626,16 @@
         <w:tblLook w:firstColumn="1" w:firstRow="1" w:lastColumn="0" w:lastRow="0" w:noHBand="0" w:noVBand="1" w:val="04A0"/>
       </w:tblPr>
       <w:tblGrid>
-        <w:gridCol w:w="9936"/>
+        <w:gridCol w:w="10080"/>
       </w:tblGrid>
       <w:tr>
         <w:tc>
           <w:tcPr>
-            <w:tcW w:type="dxa" w:w="9792"/>
+            <w:tcW w:type="dxa" w:w="10080"/>
             <w:shd w:fill="15803D"/>
             <w:tcMar>
-              <w:top w:w="60" w:type="dxa"/>
-              <w:bottom w:w="60" w:type="dxa"/>
+              <w:top w:w="70" w:type="dxa"/>
+              <w:bottom w:w="70" w:type="dxa"/>
               <w:left w:w="100" w:type="dxa"/>
               <w:right w:w="100" w:type="dxa"/>
             </w:tcMar>
@@ -2789,7 +3647,7 @@
                 <w:color w:val="FFFFFF"/>
                 <w:sz w:val="22"/>
               </w:rPr>
-              <w:t>SLIDE 15: SECRET WEAPON: DEMO 'LIVE ANOMALY INJECTION'</w:t>
+              <w:t>SLIDE 15: SECRET WEAPON: THE 'LIVE ANOMALY INJECTION' PITCH</w:t>
             </w:r>
           </w:p>
         </w:tc>
@@ -2797,11 +3655,11 @@
       <w:tr>
         <w:tc>
           <w:tcPr>
-            <w:tcW w:type="dxa" w:w="9792"/>
+            <w:tcW w:type="dxa" w:w="10080"/>
             <w:shd w:fill="FFFFFF"/>
             <w:tcMar>
-              <w:top w:w="80" w:type="dxa"/>
-              <w:bottom w:w="80" w:type="dxa"/>
+              <w:top w:w="70" w:type="dxa"/>
+              <w:bottom w:w="70" w:type="dxa"/>
               <w:left w:w="120" w:type="dxa"/>
               <w:right w:w="120" w:type="dxa"/>
             </w:tcMar>
@@ -2837,7 +3695,7 @@
                 <w:color w:val="0F172A"/>
                 <w:sz w:val="18"/>
               </w:rPr>
-              <w:t>Kịch bản Pitching 5 phút: 1. Hệ thống bình thường (Xanh) -&gt; 2. Bấm Tiêm Lỗi -&gt; 3. Đồ thị đổi màu, phát hiện sụt áp -&gt; 4. AI chẩn đoán nguyên nhân -&gt; 5. Tự động phát lệnh xử lý thành công.</w:t>
+              <w:t>Kịch bản Pitching 5 phút: 1. Hệ thống bình thường (Xanh) -&gt; 2. Bấm Tiêm Lỗi bão nhiệt đới -&gt; 3. Đồ thị đổi màu cam, phát hiện sụt áp -&gt; 4. AI chẩn đoán nguyên nhân trong &lt;100ms -&gt; 5. Tự động phát lệnh mở bơm tiêu úng thành công.</w:t>
             </w:r>
           </w:p>
         </w:tc>
@@ -2845,7 +3703,69 @@
       <w:tr>
         <w:tc>
           <w:tcPr>
-            <w:tcW w:type="dxa" w:w="9792"/>
+            <w:tcW w:type="dxa" w:w="10080"/>
+            <w:shd w:fill="F8FAFC"/>
+            <w:tcMar>
+              <w:top w:w="60" w:type="dxa"/>
+              <w:bottom w:w="60" w:type="dxa"/>
+              <w:left w:w="120" w:type="dxa"/>
+              <w:right w:w="120" w:type="dxa"/>
+            </w:tcMar>
+          </w:tcPr>
+          <w:p>
+            <w:r>
+              <w:rPr>
+                <w:b/>
+                <w:color w:val="0284C7"/>
+                <w:sz w:val="18"/>
+              </w:rPr>
+              <w:t xml:space="preserve">🔍 Phân tích Khái niệm &amp; Cơ chế Kỹ thuật: </w:t>
+            </w:r>
+            <w:r>
+              <w:rPr>
+                <w:color w:val="0F172A"/>
+                <w:sz w:val="18"/>
+              </w:rPr>
+              <w:t>Chiến lược thuyết trình 5 phút ấn tượng nhất: Biểu diễn sự cố xảy ra trực tiếp và AI tự động giải quyết trước mắt Ban Giám Khảo.</w:t>
+            </w:r>
+          </w:p>
+        </w:tc>
+      </w:tr>
+      <w:tr>
+        <w:tc>
+          <w:tcPr>
+            <w:tcW w:type="dxa" w:w="10080"/>
+            <w:shd w:fill="F1F5F9"/>
+            <w:tcMar>
+              <w:top w:w="60" w:type="dxa"/>
+              <w:bottom w:w="60" w:type="dxa"/>
+              <w:left w:w="120" w:type="dxa"/>
+              <w:right w:w="120" w:type="dxa"/>
+            </w:tcMar>
+          </w:tcPr>
+          <w:p>
+            <w:r>
+              <w:rPr>
+                <w:b/>
+                <w:color w:val="15803D"/>
+                <w:sz w:val="18"/>
+              </w:rPr>
+              <w:t xml:space="preserve">🎨 Visual Design (Nền Trắng Chữ Đen &amp; Bố Cục): </w:t>
+            </w:r>
+            <w:r>
+              <w:rPr>
+                <w:color w:val="0F172A"/>
+                <w:sz w:val="17"/>
+              </w:rPr>
+              <w:t>Kịch bản phân cảnh 5 bước (5-Step Storyboard) nền trắng, nút bấm tiêm lỗi nổi bật màu đỏ rực (#DC2626), mũi tên tiến trình rõ ràng.</w:t>
+            </w:r>
+          </w:p>
+        </w:tc>
+      </w:tr>
+      <w:tr>
+        <w:tc>
+          <w:tcPr>
+            <w:tcW w:type="dxa" w:w="10080"/>
             <w:shd w:fill="FEF3C7"/>
             <w:tcMar>
               <w:top w:w="60" w:type="dxa"/>
@@ -2883,16 +3803,16 @@
         <w:tblLook w:firstColumn="1" w:firstRow="1" w:lastColumn="0" w:lastRow="0" w:noHBand="0" w:noVBand="1" w:val="04A0"/>
       </w:tblPr>
       <w:tblGrid>
-        <w:gridCol w:w="9936"/>
+        <w:gridCol w:w="10080"/>
       </w:tblGrid>
       <w:tr>
         <w:tc>
           <w:tcPr>
-            <w:tcW w:type="dxa" w:w="9792"/>
+            <w:tcW w:type="dxa" w:w="10080"/>
             <w:shd w:fill="15803D"/>
             <w:tcMar>
-              <w:top w:w="60" w:type="dxa"/>
-              <w:bottom w:w="60" w:type="dxa"/>
+              <w:top w:w="70" w:type="dxa"/>
+              <w:bottom w:w="70" w:type="dxa"/>
               <w:left w:w="100" w:type="dxa"/>
               <w:right w:w="100" w:type="dxa"/>
             </w:tcMar>
@@ -2912,11 +3832,11 @@
       <w:tr>
         <w:tc>
           <w:tcPr>
-            <w:tcW w:type="dxa" w:w="9792"/>
+            <w:tcW w:type="dxa" w:w="10080"/>
             <w:shd w:fill="FFFFFF"/>
             <w:tcMar>
-              <w:top w:w="80" w:type="dxa"/>
-              <w:bottom w:w="80" w:type="dxa"/>
+              <w:top w:w="70" w:type="dxa"/>
+              <w:bottom w:w="70" w:type="dxa"/>
               <w:left w:w="120" w:type="dxa"/>
               <w:right w:w="120" w:type="dxa"/>
             </w:tcMar>
@@ -2940,7 +3860,7 @@
                 <w:color w:val="0F172A"/>
                 <w:sz w:val="18"/>
               </w:rPr>
-              <w:t>❌ Pitfall 1: Dành 80% thời gian hàn mạch phần cứng thay vì tập trung vào luồng dữ liệu &amp; AI Engine.</w:t>
+              <w:t>❌ Bẫy 1 - Quá sa đà vào hàn mạch phần cứng: Dành 80% thời gian ngồi hàn ESP32/Arduino -&gt; Khắc phục: Dùng Python Simulator phát qua MQTT.</w:t>
             </w:r>
           </w:p>
           <w:p>
@@ -2952,7 +3872,7 @@
                 <w:color w:val="0F172A"/>
                 <w:sz w:val="18"/>
               </w:rPr>
-              <w:t>❌ Pitfall 2: Dùng mô hình Deep Learning/LLM quá nặng gây đơ 30 giây khi pitching trực tiếp.</w:t>
+              <w:t>❌ Bẫy 2 - Dùng mô hình LLM quá nặng: Dùng model 70B khiến API đơ 30s khi demo -&gt; Khắc phục: Dùng Gemini-Flash + Heuristic Fallback offline.</w:t>
             </w:r>
           </w:p>
           <w:p>
@@ -2964,7 +3884,7 @@
                 <w:color w:val="0F172A"/>
                 <w:sz w:val="18"/>
               </w:rPr>
-              <w:t>❌ Pitfall 3: Chỉ làm Dashboard tĩnh không có vòng lặp tự động hóa hành động.</w:t>
+              <w:t>❌ Bẫy 3 - Làm Dashboard tĩnh: Chỉ vẽ biểu đồ không có hành động -&gt; Khắc phục: Xây dựng thẻ hành động điều hành tự động qua MQTT.</w:t>
             </w:r>
           </w:p>
         </w:tc>
@@ -2972,7 +3892,69 @@
       <w:tr>
         <w:tc>
           <w:tcPr>
-            <w:tcW w:type="dxa" w:w="9792"/>
+            <w:tcW w:type="dxa" w:w="10080"/>
+            <w:shd w:fill="F8FAFC"/>
+            <w:tcMar>
+              <w:top w:w="60" w:type="dxa"/>
+              <w:bottom w:w="60" w:type="dxa"/>
+              <w:left w:w="120" w:type="dxa"/>
+              <w:right w:w="120" w:type="dxa"/>
+            </w:tcMar>
+          </w:tcPr>
+          <w:p>
+            <w:r>
+              <w:rPr>
+                <w:b/>
+                <w:color w:val="0284C7"/>
+                <w:sz w:val="18"/>
+              </w:rPr>
+              <w:t xml:space="preserve">🔍 Phân tích Khái niệm &amp; Cơ chế Kỹ thuật: </w:t>
+            </w:r>
+            <w:r>
+              <w:rPr>
+                <w:color w:val="0F172A"/>
+                <w:sz w:val="18"/>
+              </w:rPr>
+              <w:t>3 sai lầm kinh điển khiến các đội thi mất điểm và giải pháp khắc phục thực chiến.</w:t>
+            </w:r>
+          </w:p>
+        </w:tc>
+      </w:tr>
+      <w:tr>
+        <w:tc>
+          <w:tcPr>
+            <w:tcW w:type="dxa" w:w="10080"/>
+            <w:shd w:fill="F1F5F9"/>
+            <w:tcMar>
+              <w:top w:w="60" w:type="dxa"/>
+              <w:bottom w:w="60" w:type="dxa"/>
+              <w:left w:w="120" w:type="dxa"/>
+              <w:right w:w="120" w:type="dxa"/>
+            </w:tcMar>
+          </w:tcPr>
+          <w:p>
+            <w:r>
+              <w:rPr>
+                <w:b/>
+                <w:color w:val="15803D"/>
+                <w:sz w:val="18"/>
+              </w:rPr>
+              <w:t xml:space="preserve">🎨 Visual Design (Nền Trắng Chữ Đen &amp; Bố Cục): </w:t>
+            </w:r>
+            <w:r>
+              <w:rPr>
+                <w:color w:val="0F172A"/>
+                <w:sz w:val="17"/>
+              </w:rPr>
+              <w:t>Bảng 3 cột so sánh lỗi sai (Đỏ nhạt #FEE2E2, Vàng cam nhạt #FEF3C7) và giải pháp chuẩn (Xanh lá nhạt #DCFCE7), chữ đen rõ ràng.</w:t>
+            </w:r>
+          </w:p>
+        </w:tc>
+      </w:tr>
+      <w:tr>
+        <w:tc>
+          <w:tcPr>
+            <w:tcW w:type="dxa" w:w="10080"/>
             <w:shd w:fill="FEF3C7"/>
             <w:tcMar>
               <w:top w:w="60" w:type="dxa"/>
@@ -3010,16 +3992,16 @@
         <w:tblLook w:firstColumn="1" w:firstRow="1" w:lastColumn="0" w:lastRow="0" w:noHBand="0" w:noVBand="1" w:val="04A0"/>
       </w:tblPr>
       <w:tblGrid>
-        <w:gridCol w:w="9936"/>
+        <w:gridCol w:w="10080"/>
       </w:tblGrid>
       <w:tr>
         <w:tc>
           <w:tcPr>
-            <w:tcW w:type="dxa" w:w="9792"/>
+            <w:tcW w:type="dxa" w:w="10080"/>
             <w:shd w:fill="15803D"/>
             <w:tcMar>
-              <w:top w:w="60" w:type="dxa"/>
-              <w:bottom w:w="60" w:type="dxa"/>
+              <w:top w:w="70" w:type="dxa"/>
+              <w:bottom w:w="70" w:type="dxa"/>
               <w:left w:w="100" w:type="dxa"/>
               <w:right w:w="100" w:type="dxa"/>
             </w:tcMar>
@@ -3039,11 +4021,11 @@
       <w:tr>
         <w:tc>
           <w:tcPr>
-            <w:tcW w:type="dxa" w:w="9792"/>
+            <w:tcW w:type="dxa" w:w="10080"/>
             <w:shd w:fill="FFFFFF"/>
             <w:tcMar>
-              <w:top w:w="80" w:type="dxa"/>
-              <w:bottom w:w="80" w:type="dxa"/>
+              <w:top w:w="70" w:type="dxa"/>
+              <w:bottom w:w="70" w:type="dxa"/>
               <w:left w:w="120" w:type="dxa"/>
               <w:right w:w="120" w:type="dxa"/>
             </w:tcMar>
@@ -3099,7 +4081,69 @@
       <w:tr>
         <w:tc>
           <w:tcPr>
-            <w:tcW w:type="dxa" w:w="9792"/>
+            <w:tcW w:type="dxa" w:w="10080"/>
+            <w:shd w:fill="F8FAFC"/>
+            <w:tcMar>
+              <w:top w:w="60" w:type="dxa"/>
+              <w:bottom w:w="60" w:type="dxa"/>
+              <w:left w:w="120" w:type="dxa"/>
+              <w:right w:w="120" w:type="dxa"/>
+            </w:tcMar>
+          </w:tcPr>
+          <w:p>
+            <w:r>
+              <w:rPr>
+                <w:b/>
+                <w:color w:val="0284C7"/>
+                <w:sz w:val="18"/>
+              </w:rPr>
+              <w:t xml:space="preserve">🔍 Phân tích Khái niệm &amp; Cơ chế Kỹ thuật: </w:t>
+            </w:r>
+            <w:r>
+              <w:rPr>
+                <w:color w:val="0F172A"/>
+                <w:sz w:val="18"/>
+              </w:rPr>
+              <w:t>Phiên cố vấn kỹ thuật và tháo gỡ khó khăn trực tiếp giữa Diễn giả và các đội thi.</w:t>
+            </w:r>
+          </w:p>
+        </w:tc>
+      </w:tr>
+      <w:tr>
+        <w:tc>
+          <w:tcPr>
+            <w:tcW w:type="dxa" w:w="10080"/>
+            <w:shd w:fill="F1F5F9"/>
+            <w:tcMar>
+              <w:top w:w="60" w:type="dxa"/>
+              <w:bottom w:w="60" w:type="dxa"/>
+              <w:left w:w="120" w:type="dxa"/>
+              <w:right w:w="120" w:type="dxa"/>
+            </w:tcMar>
+          </w:tcPr>
+          <w:p>
+            <w:r>
+              <w:rPr>
+                <w:b/>
+                <w:color w:val="15803D"/>
+                <w:sz w:val="18"/>
+              </w:rPr>
+              <w:t xml:space="preserve">🎨 Visual Design (Nền Trắng Chữ Đen &amp; Bố Cục): </w:t>
+            </w:r>
+            <w:r>
+              <w:rPr>
+                <w:color w:val="0F172A"/>
+                <w:sz w:val="17"/>
+              </w:rPr>
+              <w:t>Nền trắng (#FFFFFF), chữ đen than chì, biểu tượng micro và bong bóng trò chuyện (Chat Bubbles), khung thông tin liên hệ trang trọng.</w:t>
+            </w:r>
+          </w:p>
+        </w:tc>
+      </w:tr>
+      <w:tr>
+        <w:tc>
+          <w:tcPr>
+            <w:tcW w:type="dxa" w:w="10080"/>
             <w:shd w:fill="FEF3C7"/>
             <w:tcMar>
               <w:top w:w="60" w:type="dxa"/>
@@ -3137,16 +4181,16 @@
         <w:tblLook w:firstColumn="1" w:firstRow="1" w:lastColumn="0" w:lastRow="0" w:noHBand="0" w:noVBand="1" w:val="04A0"/>
       </w:tblPr>
       <w:tblGrid>
-        <w:gridCol w:w="9936"/>
+        <w:gridCol w:w="10080"/>
       </w:tblGrid>
       <w:tr>
         <w:tc>
           <w:tcPr>
-            <w:tcW w:type="dxa" w:w="9792"/>
+            <w:tcW w:type="dxa" w:w="10080"/>
             <w:shd w:fill="15803D"/>
             <w:tcMar>
-              <w:top w:w="60" w:type="dxa"/>
-              <w:bottom w:w="60" w:type="dxa"/>
+              <w:top w:w="70" w:type="dxa"/>
+              <w:bottom w:w="70" w:type="dxa"/>
               <w:left w:w="100" w:type="dxa"/>
               <w:right w:w="100" w:type="dxa"/>
             </w:tcMar>
@@ -3158,7 +4202,7 @@
                 <w:color w:val="FFFFFF"/>
                 <w:sz w:val="22"/>
               </w:rPr>
-              <w:t>SLIDE 18: CLOSING &amp; CONTACT</w:t>
+              <w:t>SLIDE 18: CLOSING &amp; BEST WISHES</w:t>
             </w:r>
           </w:p>
         </w:tc>
@@ -3166,11 +4210,11 @@
       <w:tr>
         <w:tc>
           <w:tcPr>
-            <w:tcW w:type="dxa" w:w="9792"/>
+            <w:tcW w:type="dxa" w:w="10080"/>
             <w:shd w:fill="FFFFFF"/>
             <w:tcMar>
-              <w:top w:w="80" w:type="dxa"/>
-              <w:bottom w:w="80" w:type="dxa"/>
+              <w:top w:w="70" w:type="dxa"/>
+              <w:bottom w:w="70" w:type="dxa"/>
               <w:left w:w="120" w:type="dxa"/>
               <w:right w:w="120" w:type="dxa"/>
             </w:tcMar>
@@ -3238,7 +4282,69 @@
       <w:tr>
         <w:tc>
           <w:tcPr>
-            <w:tcW w:type="dxa" w:w="9792"/>
+            <w:tcW w:type="dxa" w:w="10080"/>
+            <w:shd w:fill="F8FAFC"/>
+            <w:tcMar>
+              <w:top w:w="60" w:type="dxa"/>
+              <w:bottom w:w="60" w:type="dxa"/>
+              <w:left w:w="120" w:type="dxa"/>
+              <w:right w:w="120" w:type="dxa"/>
+            </w:tcMar>
+          </w:tcPr>
+          <w:p>
+            <w:r>
+              <w:rPr>
+                <w:b/>
+                <w:color w:val="0284C7"/>
+                <w:sz w:val="18"/>
+              </w:rPr>
+              <w:t xml:space="preserve">🔍 Phân tích Khái niệm &amp; Cơ chế Kỹ thuật: </w:t>
+            </w:r>
+            <w:r>
+              <w:rPr>
+                <w:color w:val="0F172A"/>
+                <w:sz w:val="18"/>
+              </w:rPr>
+              <w:t>Lời chúc bế mạc và công bố kho lưu trữ mã nguồn mẫu tham khảo.</w:t>
+            </w:r>
+          </w:p>
+        </w:tc>
+      </w:tr>
+      <w:tr>
+        <w:tc>
+          <w:tcPr>
+            <w:tcW w:type="dxa" w:w="10080"/>
+            <w:shd w:fill="F1F5F9"/>
+            <w:tcMar>
+              <w:top w:w="60" w:type="dxa"/>
+              <w:bottom w:w="60" w:type="dxa"/>
+              <w:left w:w="120" w:type="dxa"/>
+              <w:right w:w="120" w:type="dxa"/>
+            </w:tcMar>
+          </w:tcPr>
+          <w:p>
+            <w:r>
+              <w:rPr>
+                <w:b/>
+                <w:color w:val="15803D"/>
+                <w:sz w:val="18"/>
+              </w:rPr>
+              <w:t xml:space="preserve">🎨 Visual Design (Nền Trắng Chữ Đen &amp; Bố Cục): </w:t>
+            </w:r>
+            <w:r>
+              <w:rPr>
+                <w:color w:val="0F172A"/>
+                <w:sz w:val="17"/>
+              </w:rPr>
+              <w:t>Slide bế mạc nền trắng trang nhã, thông điệp truyền cảm hứng in đậm màu xanh lá (#15803D), mã link repository nổi bật ở trung tâm.</w:t>
+            </w:r>
+          </w:p>
+        </w:tc>
+      </w:tr>
+      <w:tr>
+        <w:tc>
+          <w:tcPr>
+            <w:tcW w:type="dxa" w:w="10080"/>
             <w:shd w:fill="FEF3C7"/>
             <w:tcMar>
               <w:top w:w="60" w:type="dxa"/>
@@ -3277,7 +4383,7 @@
         <w:rPr>
           <w:color w:val="15803D"/>
         </w:rPr>
-        <w:t>PHẦN IV: BẢNG MA TRẬN SO SÁNH CÔNG NGHỆ (TECH STACK MATRIX)</w:t>
+        <w:t>PHẦN IV: BẢNG MA TRẬN SO SÁNH CÔNG NGHỆ CHUYÊN SÂU (TECH STACK MATRIX)</w:t>
       </w:r>
     </w:p>
     <w:tbl>
@@ -3287,21 +4393,22 @@
         <w:tblLook w:firstColumn="1" w:firstRow="1" w:lastColumn="0" w:lastRow="0" w:noHBand="0" w:noVBand="1" w:val="04A0"/>
       </w:tblPr>
       <w:tblGrid>
-        <w:gridCol w:w="2484"/>
-        <w:gridCol w:w="2484"/>
-        <w:gridCol w:w="2484"/>
-        <w:gridCol w:w="2484"/>
+        <w:gridCol w:w="2016"/>
+        <w:gridCol w:w="2016"/>
+        <w:gridCol w:w="2016"/>
+        <w:gridCol w:w="2016"/>
+        <w:gridCol w:w="2016"/>
       </w:tblGrid>
       <w:tr>
         <w:tc>
           <w:tcPr>
-            <w:tcW w:type="dxa" w:w="2160"/>
+            <w:tcW w:type="dxa" w:w="1728"/>
             <w:shd w:fill="0F172A"/>
             <w:tcMar>
               <w:top w:w="80" w:type="dxa"/>
               <w:bottom w:w="80" w:type="dxa"/>
-              <w:left w:w="100" w:type="dxa"/>
-              <w:right w:w="100" w:type="dxa"/>
+              <w:left w:w="80" w:type="dxa"/>
+              <w:right w:w="80" w:type="dxa"/>
             </w:tcMar>
           </w:tcPr>
           <w:p>
@@ -3309,7 +4416,7 @@
               <w:rPr>
                 <w:b/>
                 <w:color w:val="FFFFFF"/>
-                <w:sz w:val="18"/>
+                <w:sz w:val="17"/>
               </w:rPr>
               <w:t>Tầng Kiến Trúc</w:t>
             </w:r>
@@ -3317,13 +4424,13 @@
         </w:tc>
         <w:tc>
           <w:tcPr>
-            <w:tcW w:type="dxa" w:w="2016"/>
+            <w:tcW w:type="dxa" w:w="1584"/>
             <w:shd w:fill="0F172A"/>
             <w:tcMar>
               <w:top w:w="80" w:type="dxa"/>
               <w:bottom w:w="80" w:type="dxa"/>
-              <w:left w:w="100" w:type="dxa"/>
-              <w:right w:w="100" w:type="dxa"/>
+              <w:left w:w="80" w:type="dxa"/>
+              <w:right w:w="80" w:type="dxa"/>
             </w:tcMar>
           </w:tcPr>
           <w:p>
@@ -3331,7 +4438,7 @@
               <w:rPr>
                 <w:b/>
                 <w:color w:val="FFFFFF"/>
-                <w:sz w:val="18"/>
+                <w:sz w:val="17"/>
               </w:rPr>
               <w:t>Công Nghệ</w:t>
             </w:r>
@@ -3339,13 +4446,13 @@
         </w:tc>
         <w:tc>
           <w:tcPr>
-            <w:tcW w:type="dxa" w:w="3744"/>
+            <w:tcW w:type="dxa" w:w="2592"/>
             <w:shd w:fill="0F172A"/>
             <w:tcMar>
               <w:top w:w="80" w:type="dxa"/>
               <w:bottom w:w="80" w:type="dxa"/>
-              <w:left w:w="100" w:type="dxa"/>
-              <w:right w:w="100" w:type="dxa"/>
+              <w:left w:w="80" w:type="dxa"/>
+              <w:right w:w="80" w:type="dxa"/>
             </w:tcMar>
           </w:tcPr>
           <w:p>
@@ -3353,9 +4460,31 @@
               <w:rPr>
                 <w:b/>
                 <w:color w:val="FFFFFF"/>
-                <w:sz w:val="18"/>
-              </w:rPr>
-              <w:t>Ưu Điểm &amp; Vai Trò</w:t>
+                <w:sz w:val="17"/>
+              </w:rPr>
+              <w:t>Định Nghĩa &amp; Cơ Chế</w:t>
+            </w:r>
+          </w:p>
+        </w:tc>
+        <w:tc>
+          <w:tcPr>
+            <w:tcW w:type="dxa" w:w="2304"/>
+            <w:shd w:fill="0F172A"/>
+            <w:tcMar>
+              <w:top w:w="80" w:type="dxa"/>
+              <w:bottom w:w="80" w:type="dxa"/>
+              <w:left w:w="80" w:type="dxa"/>
+              <w:right w:w="80" w:type="dxa"/>
+            </w:tcMar>
+          </w:tcPr>
+          <w:p>
+            <w:r>
+              <w:rPr>
+                <w:b/>
+                <w:color w:val="FFFFFF"/>
+                <w:sz w:val="17"/>
+              </w:rPr>
+              <w:t>Ưu Điểm &amp; Nhược Điểm</w:t>
             </w:r>
           </w:p>
         </w:tc>
@@ -3366,8 +4495,8 @@
             <w:tcMar>
               <w:top w:w="80" w:type="dxa"/>
               <w:bottom w:w="80" w:type="dxa"/>
-              <w:left w:w="100" w:type="dxa"/>
-              <w:right w:w="100" w:type="dxa"/>
+              <w:left w:w="80" w:type="dxa"/>
+              <w:right w:w="80" w:type="dxa"/>
             </w:tcMar>
           </w:tcPr>
           <w:p>
@@ -3375,9 +4504,9 @@
               <w:rPr>
                 <w:b/>
                 <w:color w:val="FFFFFF"/>
-                <w:sz w:val="18"/>
-              </w:rPr>
-              <w:t>Đánh Giá Cho Hackathon</w:t>
+                <w:sz w:val="17"/>
+              </w:rPr>
+              <w:t>Lưu Ý Thực Chiến (Gotchas)</w:t>
             </w:r>
           </w:p>
         </w:tc>
@@ -3385,34 +4514,34 @@
       <w:tr>
         <w:tc>
           <w:tcPr>
-            <w:tcW w:type="dxa" w:w="2160"/>
+            <w:tcW w:type="dxa" w:w="1728"/>
             <w:shd w:fill="FFFFFF"/>
             <w:tcMar>
-              <w:top w:w="60" w:type="dxa"/>
-              <w:bottom w:w="60" w:type="dxa"/>
-              <w:left w:w="100" w:type="dxa"/>
-              <w:right w:w="100" w:type="dxa"/>
+              <w:top w:w="50" w:type="dxa"/>
+              <w:bottom w:w="50" w:type="dxa"/>
+              <w:left w:w="60" w:type="dxa"/>
+              <w:right w:w="60" w:type="dxa"/>
             </w:tcMar>
           </w:tcPr>
           <w:p>
             <w:r>
               <w:rPr>
                 <w:color w:val="0F172A"/>
-                <w:sz w:val="17"/>
-              </w:rPr>
-              <w:t>Ingestion Protocol</w:t>
+                <w:sz w:val="16"/>
+              </w:rPr>
+              <w:t>Ingestion</w:t>
             </w:r>
           </w:p>
         </w:tc>
         <w:tc>
           <w:tcPr>
-            <w:tcW w:type="dxa" w:w="2016"/>
+            <w:tcW w:type="dxa" w:w="1584"/>
             <w:shd w:fill="FFFFFF"/>
             <w:tcMar>
-              <w:top w:w="60" w:type="dxa"/>
-              <w:bottom w:w="60" w:type="dxa"/>
-              <w:left w:w="100" w:type="dxa"/>
-              <w:right w:w="100" w:type="dxa"/>
+              <w:top w:w="50" w:type="dxa"/>
+              <w:bottom w:w="50" w:type="dxa"/>
+              <w:left w:w="60" w:type="dxa"/>
+              <w:right w:w="60" w:type="dxa"/>
             </w:tcMar>
           </w:tcPr>
           <w:p>
@@ -3420,30 +4549,53 @@
               <w:rPr>
                 <w:b/>
                 <w:color w:val="0F172A"/>
-                <w:sz w:val="17"/>
-              </w:rPr>
-              <w:t>MQTT (1883)</w:t>
+                <w:sz w:val="16"/>
+              </w:rPr>
+              <w:t>MQTT (:1883)</w:t>
             </w:r>
           </w:p>
         </w:tc>
         <w:tc>
           <w:tcPr>
-            <w:tcW w:type="dxa" w:w="3744"/>
+            <w:tcW w:type="dxa" w:w="2592"/>
             <w:shd w:fill="FFFFFF"/>
             <w:tcMar>
-              <w:top w:w="60" w:type="dxa"/>
-              <w:bottom w:w="60" w:type="dxa"/>
-              <w:left w:w="100" w:type="dxa"/>
-              <w:right w:w="100" w:type="dxa"/>
+              <w:top w:w="50" w:type="dxa"/>
+              <w:bottom w:w="50" w:type="dxa"/>
+              <w:left w:w="60" w:type="dxa"/>
+              <w:right w:w="60" w:type="dxa"/>
             </w:tcMar>
           </w:tcPr>
           <w:p>
             <w:r>
               <w:rPr>
                 <w:color w:val="0F172A"/>
-                <w:sz w:val="17"/>
-              </w:rPr>
-              <w:t>Header 2 bytes siêu nhẹ, Pub/Sub linh hoạt, tiết kiệm băng thông.</w:t>
+                <w:sz w:val="16"/>
+              </w:rPr>
+              <w:t>Giao thức Pub/Sub TCP, header 2B.</w:t>
+            </w:r>
+          </w:p>
+        </w:tc>
+        <w:tc>
+          <w:tcPr>
+            <w:tcW w:type="dxa" w:w="2304"/>
+            <w:shd w:fill="FFFFFF"/>
+            <w:tcMar>
+              <w:top w:w="50" w:type="dxa"/>
+              <w:bottom w:w="50" w:type="dxa"/>
+              <w:left w:w="60" w:type="dxa"/>
+              <w:right w:w="60" w:type="dxa"/>
+            </w:tcMar>
+          </w:tcPr>
+          <w:p>
+            <w:r>
+              <w:rPr>
+                <w:color w:val="0F172A"/>
+                <w:sz w:val="16"/>
+              </w:rPr>
+              <w:t>Ưu: Tiết kiệm băng thông, Keepalive, QoS 0/1/2.</w:t>
+              <w:br/>
+              <w:t>Nhược: Chạy TCP tốn pin hơn UDP.</w:t>
             </w:r>
           </w:p>
         </w:tc>
@@ -3452,20 +4604,19 @@
             <w:tcW w:type="dxa" w:w="1872"/>
             <w:shd w:fill="FFFFFF"/>
             <w:tcMar>
-              <w:top w:w="60" w:type="dxa"/>
-              <w:bottom w:w="60" w:type="dxa"/>
-              <w:left w:w="100" w:type="dxa"/>
-              <w:right w:w="100" w:type="dxa"/>
+              <w:top w:w="50" w:type="dxa"/>
+              <w:bottom w:w="50" w:type="dxa"/>
+              <w:left w:w="60" w:type="dxa"/>
+              <w:right w:w="60" w:type="dxa"/>
             </w:tcMar>
           </w:tcPr>
           <w:p>
             <w:r>
               <w:rPr>
-                <w:b/>
                 <w:color w:val="0F172A"/>
-                <w:sz w:val="17"/>
-              </w:rPr>
-              <w:t>⭐ Khuyên dùng số 1</w:t>
+                <w:sz w:val="16"/>
+              </w:rPr>
+              <w:t>Dùng QoS 1 + event_time; cấu hình LWT phát hiện mất mạng.</w:t>
             </w:r>
           </w:p>
         </w:tc>
@@ -3473,34 +4624,34 @@
       <w:tr>
         <w:tc>
           <w:tcPr>
-            <w:tcW w:type="dxa" w:w="2160"/>
+            <w:tcW w:type="dxa" w:w="1728"/>
             <w:shd w:fill="F8FAFC"/>
             <w:tcMar>
-              <w:top w:w="60" w:type="dxa"/>
-              <w:bottom w:w="60" w:type="dxa"/>
-              <w:left w:w="100" w:type="dxa"/>
-              <w:right w:w="100" w:type="dxa"/>
+              <w:top w:w="50" w:type="dxa"/>
+              <w:bottom w:w="50" w:type="dxa"/>
+              <w:left w:w="60" w:type="dxa"/>
+              <w:right w:w="60" w:type="dxa"/>
             </w:tcMar>
           </w:tcPr>
           <w:p>
             <w:r>
               <w:rPr>
                 <w:color w:val="0F172A"/>
-                <w:sz w:val="17"/>
-              </w:rPr>
-              <w:t>Ingestion Protocol</w:t>
+                <w:sz w:val="16"/>
+              </w:rPr>
+              <w:t>Ingestion</w:t>
             </w:r>
           </w:p>
         </w:tc>
         <w:tc>
           <w:tcPr>
-            <w:tcW w:type="dxa" w:w="2016"/>
+            <w:tcW w:type="dxa" w:w="1584"/>
             <w:shd w:fill="F8FAFC"/>
             <w:tcMar>
-              <w:top w:w="60" w:type="dxa"/>
-              <w:bottom w:w="60" w:type="dxa"/>
-              <w:left w:w="100" w:type="dxa"/>
-              <w:right w:w="100" w:type="dxa"/>
+              <w:top w:w="50" w:type="dxa"/>
+              <w:bottom w:w="50" w:type="dxa"/>
+              <w:left w:w="60" w:type="dxa"/>
+              <w:right w:w="60" w:type="dxa"/>
             </w:tcMar>
           </w:tcPr>
           <w:p>
@@ -3508,30 +4659,53 @@
               <w:rPr>
                 <w:b/>
                 <w:color w:val="0F172A"/>
-                <w:sz w:val="17"/>
-              </w:rPr>
-              <w:t>CoAP (5683 UDP)</w:t>
+                <w:sz w:val="16"/>
+              </w:rPr>
+              <w:t>CoAP (:5683 UDP)</w:t>
             </w:r>
           </w:p>
         </w:tc>
         <w:tc>
           <w:tcPr>
-            <w:tcW w:type="dxa" w:w="3744"/>
+            <w:tcW w:type="dxa" w:w="2592"/>
             <w:shd w:fill="F8FAFC"/>
             <w:tcMar>
-              <w:top w:w="60" w:type="dxa"/>
-              <w:bottom w:w="60" w:type="dxa"/>
-              <w:left w:w="100" w:type="dxa"/>
-              <w:right w:w="100" w:type="dxa"/>
+              <w:top w:w="50" w:type="dxa"/>
+              <w:bottom w:w="50" w:type="dxa"/>
+              <w:left w:w="60" w:type="dxa"/>
+              <w:right w:w="60" w:type="dxa"/>
             </w:tcMar>
           </w:tcPr>
           <w:p>
             <w:r>
               <w:rPr>
                 <w:color w:val="0F172A"/>
-                <w:sz w:val="17"/>
-              </w:rPr>
-              <w:t>Chạy trên UDP, tối ưu cho cảm biến pin yếu (NB-IoT/LPWAN).</w:t>
+                <w:sz w:val="16"/>
+              </w:rPr>
+              <w:t>RESTful nhị phân chạy trên UDP.</w:t>
+            </w:r>
+          </w:p>
+        </w:tc>
+        <w:tc>
+          <w:tcPr>
+            <w:tcW w:type="dxa" w:w="2304"/>
+            <w:shd w:fill="F8FAFC"/>
+            <w:tcMar>
+              <w:top w:w="50" w:type="dxa"/>
+              <w:bottom w:w="50" w:type="dxa"/>
+              <w:left w:w="60" w:type="dxa"/>
+              <w:right w:w="60" w:type="dxa"/>
+            </w:tcMar>
+          </w:tcPr>
+          <w:p>
+            <w:r>
+              <w:rPr>
+                <w:color w:val="0F172A"/>
+                <w:sz w:val="16"/>
+              </w:rPr>
+              <w:t>Ưu: Header 4B, siêu tiết kiệm pin.</w:t>
+              <w:br/>
+              <w:t>Nhược: Dễ rớt gói trên mạng chập chờn.</w:t>
             </w:r>
           </w:p>
         </w:tc>
@@ -3540,20 +4714,19 @@
             <w:tcW w:type="dxa" w:w="1872"/>
             <w:shd w:fill="F8FAFC"/>
             <w:tcMar>
-              <w:top w:w="60" w:type="dxa"/>
-              <w:bottom w:w="60" w:type="dxa"/>
-              <w:left w:w="100" w:type="dxa"/>
-              <w:right w:w="100" w:type="dxa"/>
+              <w:top w:w="50" w:type="dxa"/>
+              <w:bottom w:w="50" w:type="dxa"/>
+              <w:left w:w="60" w:type="dxa"/>
+              <w:right w:w="60" w:type="dxa"/>
             </w:tcMar>
           </w:tcPr>
           <w:p>
             <w:r>
               <w:rPr>
-                <w:b/>
                 <w:color w:val="0F172A"/>
-                <w:sz w:val="17"/>
-              </w:rPr>
-              <w:t>Tốt cho sensor pin yếu</w:t>
+                <w:sz w:val="16"/>
+              </w:rPr>
+              <w:t>Tối ưu cho node cảm biến nông nghiệp/môi trường pin yếu.</w:t>
             </w:r>
           </w:p>
         </w:tc>
@@ -3561,20 +4734,20 @@
       <w:tr>
         <w:tc>
           <w:tcPr>
-            <w:tcW w:type="dxa" w:w="2160"/>
+            <w:tcW w:type="dxa" w:w="1728"/>
             <w:shd w:fill="FFFFFF"/>
             <w:tcMar>
-              <w:top w:w="60" w:type="dxa"/>
-              <w:bottom w:w="60" w:type="dxa"/>
-              <w:left w:w="100" w:type="dxa"/>
-              <w:right w:w="100" w:type="dxa"/>
+              <w:top w:w="50" w:type="dxa"/>
+              <w:bottom w:w="50" w:type="dxa"/>
+              <w:left w:w="60" w:type="dxa"/>
+              <w:right w:w="60" w:type="dxa"/>
             </w:tcMar>
           </w:tcPr>
           <w:p>
             <w:r>
               <w:rPr>
                 <w:color w:val="0F172A"/>
-                <w:sz w:val="17"/>
+                <w:sz w:val="16"/>
               </w:rPr>
               <w:t>Streaming Buffer</w:t>
             </w:r>
@@ -3582,13 +4755,13 @@
         </w:tc>
         <w:tc>
           <w:tcPr>
-            <w:tcW w:type="dxa" w:w="2016"/>
+            <w:tcW w:type="dxa" w:w="1584"/>
             <w:shd w:fill="FFFFFF"/>
             <w:tcMar>
-              <w:top w:w="60" w:type="dxa"/>
-              <w:bottom w:w="60" w:type="dxa"/>
-              <w:left w:w="100" w:type="dxa"/>
-              <w:right w:w="100" w:type="dxa"/>
+              <w:top w:w="50" w:type="dxa"/>
+              <w:bottom w:w="50" w:type="dxa"/>
+              <w:left w:w="60" w:type="dxa"/>
+              <w:right w:w="60" w:type="dxa"/>
             </w:tcMar>
           </w:tcPr>
           <w:p>
@@ -3596,30 +4769,53 @@
               <w:rPr>
                 <w:b/>
                 <w:color w:val="0F172A"/>
-                <w:sz w:val="17"/>
-              </w:rPr>
-              <w:t>Redpanda (9092)</w:t>
+                <w:sz w:val="16"/>
+              </w:rPr>
+              <w:t>Redpanda (:9092)</w:t>
             </w:r>
           </w:p>
         </w:tc>
         <w:tc>
           <w:tcPr>
-            <w:tcW w:type="dxa" w:w="3744"/>
+            <w:tcW w:type="dxa" w:w="2592"/>
             <w:shd w:fill="FFFFFF"/>
             <w:tcMar>
-              <w:top w:w="60" w:type="dxa"/>
-              <w:bottom w:w="60" w:type="dxa"/>
-              <w:left w:w="100" w:type="dxa"/>
-              <w:right w:w="100" w:type="dxa"/>
+              <w:top w:w="50" w:type="dxa"/>
+              <w:bottom w:w="50" w:type="dxa"/>
+              <w:left w:w="60" w:type="dxa"/>
+              <w:right w:w="60" w:type="dxa"/>
             </w:tcMar>
           </w:tcPr>
           <w:p>
             <w:r>
               <w:rPr>
                 <w:color w:val="0F172A"/>
-                <w:sz w:val="17"/>
-              </w:rPr>
-              <w:t>Viết bằng C++, zero JVM, p99 latency cực thấp, tương thích 100% Kafka.</w:t>
+                <w:sz w:val="16"/>
+              </w:rPr>
+              <w:t>Commit Log phân tán viết bằng C++.</w:t>
+            </w:r>
+          </w:p>
+        </w:tc>
+        <w:tc>
+          <w:tcPr>
+            <w:tcW w:type="dxa" w:w="2304"/>
+            <w:shd w:fill="FFFFFF"/>
+            <w:tcMar>
+              <w:top w:w="50" w:type="dxa"/>
+              <w:bottom w:w="50" w:type="dxa"/>
+              <w:left w:w="60" w:type="dxa"/>
+              <w:right w:w="60" w:type="dxa"/>
+            </w:tcMar>
+          </w:tcPr>
+          <w:p>
+            <w:r>
+              <w:rPr>
+                <w:color w:val="0F172A"/>
+                <w:sz w:val="16"/>
+              </w:rPr>
+              <w:t>Ưu: Zero JVM, p99 latency thấp 10x, ngốn &lt;200MB RAM.</w:t>
+              <w:br/>
+              <w:t>Nhược: Mới hơn Kafka.</w:t>
             </w:r>
           </w:p>
         </w:tc>
@@ -3628,20 +4824,19 @@
             <w:tcW w:type="dxa" w:w="1872"/>
             <w:shd w:fill="FFFFFF"/>
             <w:tcMar>
-              <w:top w:w="60" w:type="dxa"/>
-              <w:bottom w:w="60" w:type="dxa"/>
-              <w:left w:w="100" w:type="dxa"/>
-              <w:right w:w="100" w:type="dxa"/>
+              <w:top w:w="50" w:type="dxa"/>
+              <w:bottom w:w="50" w:type="dxa"/>
+              <w:left w:w="60" w:type="dxa"/>
+              <w:right w:w="60" w:type="dxa"/>
             </w:tcMar>
           </w:tcPr>
           <w:p>
             <w:r>
               <w:rPr>
-                <w:b/>
                 <w:color w:val="0F172A"/>
-                <w:sz w:val="17"/>
-              </w:rPr>
-              <w:t>⭐ Tối ưu cho Docker</w:t>
+                <w:sz w:val="16"/>
+              </w:rPr>
+              <w:t>⭐ Khuyên dùng số 1 cho Hackathon; đặt key theo station_id.</w:t>
             </w:r>
           </w:p>
         </w:tc>
@@ -3649,20 +4844,20 @@
       <w:tr>
         <w:tc>
           <w:tcPr>
-            <w:tcW w:type="dxa" w:w="2160"/>
+            <w:tcW w:type="dxa" w:w="1728"/>
             <w:shd w:fill="F8FAFC"/>
             <w:tcMar>
-              <w:top w:w="60" w:type="dxa"/>
-              <w:bottom w:w="60" w:type="dxa"/>
-              <w:left w:w="100" w:type="dxa"/>
-              <w:right w:w="100" w:type="dxa"/>
+              <w:top w:w="50" w:type="dxa"/>
+              <w:bottom w:w="50" w:type="dxa"/>
+              <w:left w:w="60" w:type="dxa"/>
+              <w:right w:w="60" w:type="dxa"/>
             </w:tcMar>
           </w:tcPr>
           <w:p>
             <w:r>
               <w:rPr>
                 <w:color w:val="0F172A"/>
-                <w:sz w:val="17"/>
+                <w:sz w:val="16"/>
               </w:rPr>
               <w:t>Streaming Buffer</w:t>
             </w:r>
@@ -3670,13 +4865,13 @@
         </w:tc>
         <w:tc>
           <w:tcPr>
-            <w:tcW w:type="dxa" w:w="2016"/>
+            <w:tcW w:type="dxa" w:w="1584"/>
             <w:shd w:fill="F8FAFC"/>
             <w:tcMar>
-              <w:top w:w="60" w:type="dxa"/>
-              <w:bottom w:w="60" w:type="dxa"/>
-              <w:left w:w="100" w:type="dxa"/>
-              <w:right w:w="100" w:type="dxa"/>
+              <w:top w:w="50" w:type="dxa"/>
+              <w:bottom w:w="50" w:type="dxa"/>
+              <w:left w:w="60" w:type="dxa"/>
+              <w:right w:w="60" w:type="dxa"/>
             </w:tcMar>
           </w:tcPr>
           <w:p>
@@ -3684,30 +4879,53 @@
               <w:rPr>
                 <w:b/>
                 <w:color w:val="0F172A"/>
-                <w:sz w:val="17"/>
-              </w:rPr>
-              <w:t>Redis Streams</w:t>
+                <w:sz w:val="16"/>
+              </w:rPr>
+              <w:t>Apache Kafka</w:t>
             </w:r>
           </w:p>
         </w:tc>
         <w:tc>
           <w:tcPr>
-            <w:tcW w:type="dxa" w:w="3744"/>
+            <w:tcW w:type="dxa" w:w="2592"/>
             <w:shd w:fill="F8FAFC"/>
             <w:tcMar>
-              <w:top w:w="60" w:type="dxa"/>
-              <w:bottom w:w="60" w:type="dxa"/>
-              <w:left w:w="100" w:type="dxa"/>
-              <w:right w:w="100" w:type="dxa"/>
+              <w:top w:w="50" w:type="dxa"/>
+              <w:bottom w:w="50" w:type="dxa"/>
+              <w:left w:w="60" w:type="dxa"/>
+              <w:right w:w="60" w:type="dxa"/>
             </w:tcMar>
           </w:tcPr>
           <w:p>
             <w:r>
               <w:rPr>
                 <w:color w:val="0F172A"/>
-                <w:sz w:val="17"/>
-              </w:rPr>
-              <w:t>Chạy trực tiếp trong RAM, sub-millisecond latency, dễ dựng prototype.</w:t>
+                <w:sz w:val="16"/>
+              </w:rPr>
+              <w:t>Distributed Event Streaming trên JVM.</w:t>
+            </w:r>
+          </w:p>
+        </w:tc>
+        <w:tc>
+          <w:tcPr>
+            <w:tcW w:type="dxa" w:w="2304"/>
+            <w:shd w:fill="F8FAFC"/>
+            <w:tcMar>
+              <w:top w:w="50" w:type="dxa"/>
+              <w:bottom w:w="50" w:type="dxa"/>
+              <w:left w:w="60" w:type="dxa"/>
+              <w:right w:w="60" w:type="dxa"/>
+            </w:tcMar>
+          </w:tcPr>
+          <w:p>
+            <w:r>
+              <w:rPr>
+                <w:color w:val="0F172A"/>
+                <w:sz w:val="16"/>
+              </w:rPr>
+              <w:t>Ưu: Chuẩn công nghiệp số 1, tải cực lớn.</w:t>
+              <w:br/>
+              <w:t>Nhược: Ngốn 2GB+ RAM, cấu hình nặng.</w:t>
             </w:r>
           </w:p>
         </w:tc>
@@ -3716,20 +4934,19 @@
             <w:tcW w:type="dxa" w:w="1872"/>
             <w:shd w:fill="F8FAFC"/>
             <w:tcMar>
-              <w:top w:w="60" w:type="dxa"/>
-              <w:bottom w:w="60" w:type="dxa"/>
-              <w:left w:w="100" w:type="dxa"/>
-              <w:right w:w="100" w:type="dxa"/>
+              <w:top w:w="50" w:type="dxa"/>
+              <w:bottom w:w="50" w:type="dxa"/>
+              <w:left w:w="60" w:type="dxa"/>
+              <w:right w:w="60" w:type="dxa"/>
             </w:tcMar>
           </w:tcPr>
           <w:p>
             <w:r>
               <w:rPr>
-                <w:b/>
                 <w:color w:val="0F172A"/>
-                <w:sz w:val="17"/>
-              </w:rPr>
-              <w:t>Rất tốt cho demo nhanh</w:t>
+                <w:sz w:val="16"/>
+              </w:rPr>
+              <w:t>Cần máy cấu hình mạnh; cẩn thận lỗi JVM OOM Heap.</w:t>
             </w:r>
           </w:p>
         </w:tc>
@@ -3737,34 +4954,34 @@
       <w:tr>
         <w:tc>
           <w:tcPr>
-            <w:tcW w:type="dxa" w:w="2160"/>
+            <w:tcW w:type="dxa" w:w="1728"/>
             <w:shd w:fill="FFFFFF"/>
             <w:tcMar>
-              <w:top w:w="60" w:type="dxa"/>
-              <w:bottom w:w="60" w:type="dxa"/>
-              <w:left w:w="100" w:type="dxa"/>
-              <w:right w:w="100" w:type="dxa"/>
+              <w:top w:w="50" w:type="dxa"/>
+              <w:bottom w:w="50" w:type="dxa"/>
+              <w:left w:w="60" w:type="dxa"/>
+              <w:right w:w="60" w:type="dxa"/>
             </w:tcMar>
           </w:tcPr>
           <w:p>
             <w:r>
               <w:rPr>
                 <w:color w:val="0F172A"/>
-                <w:sz w:val="17"/>
-              </w:rPr>
-              <w:t>Stream Processing</w:t>
+                <w:sz w:val="16"/>
+              </w:rPr>
+              <w:t>Streaming Buffer</w:t>
             </w:r>
           </w:p>
         </w:tc>
         <w:tc>
           <w:tcPr>
-            <w:tcW w:type="dxa" w:w="2016"/>
+            <w:tcW w:type="dxa" w:w="1584"/>
             <w:shd w:fill="FFFFFF"/>
             <w:tcMar>
-              <w:top w:w="60" w:type="dxa"/>
-              <w:bottom w:w="60" w:type="dxa"/>
-              <w:left w:w="100" w:type="dxa"/>
-              <w:right w:w="100" w:type="dxa"/>
+              <w:top w:w="50" w:type="dxa"/>
+              <w:bottom w:w="50" w:type="dxa"/>
+              <w:left w:w="60" w:type="dxa"/>
+              <w:right w:w="60" w:type="dxa"/>
             </w:tcMar>
           </w:tcPr>
           <w:p>
@@ -3772,30 +4989,53 @@
               <w:rPr>
                 <w:b/>
                 <w:color w:val="0F172A"/>
-                <w:sz w:val="17"/>
-              </w:rPr>
-              <w:t>Async Window Engine</w:t>
+                <w:sz w:val="16"/>
+              </w:rPr>
+              <w:t>Redis Streams</w:t>
             </w:r>
           </w:p>
         </w:tc>
         <w:tc>
           <w:tcPr>
-            <w:tcW w:type="dxa" w:w="3744"/>
+            <w:tcW w:type="dxa" w:w="2592"/>
             <w:shd w:fill="FFFFFF"/>
             <w:tcMar>
-              <w:top w:w="60" w:type="dxa"/>
-              <w:bottom w:w="60" w:type="dxa"/>
-              <w:left w:w="100" w:type="dxa"/>
-              <w:right w:w="100" w:type="dxa"/>
+              <w:top w:w="50" w:type="dxa"/>
+              <w:bottom w:w="50" w:type="dxa"/>
+              <w:left w:w="60" w:type="dxa"/>
+              <w:right w:w="60" w:type="dxa"/>
             </w:tcMar>
           </w:tcPr>
           <w:p>
             <w:r>
               <w:rPr>
                 <w:color w:val="0F172A"/>
-                <w:sz w:val="17"/>
-              </w:rPr>
-              <w:t>Tích hợp trực tiếp trong Python, xử lý Watermarking &amp; Windowing linh hoạt.</w:t>
+                <w:sz w:val="16"/>
+              </w:rPr>
+              <w:t>Append-only Log trực tiếp trong RAM.</w:t>
+            </w:r>
+          </w:p>
+        </w:tc>
+        <w:tc>
+          <w:tcPr>
+            <w:tcW w:type="dxa" w:w="2304"/>
+            <w:shd w:fill="FFFFFF"/>
+            <w:tcMar>
+              <w:top w:w="50" w:type="dxa"/>
+              <w:bottom w:w="50" w:type="dxa"/>
+              <w:left w:w="60" w:type="dxa"/>
+              <w:right w:w="60" w:type="dxa"/>
+            </w:tcMar>
+          </w:tcPr>
+          <w:p>
+            <w:r>
+              <w:rPr>
+                <w:color w:val="0F172A"/>
+                <w:sz w:val="16"/>
+              </w:rPr>
+              <w:t>Ưu: Độ trễ &lt;1ms, cực nhẹ.</w:t>
+              <w:br/>
+              <w:t>Nhược: Dữ liệu giới hạn trong RAM.</w:t>
             </w:r>
           </w:p>
         </w:tc>
@@ -3804,20 +5044,19 @@
             <w:tcW w:type="dxa" w:w="1872"/>
             <w:shd w:fill="FFFFFF"/>
             <w:tcMar>
-              <w:top w:w="60" w:type="dxa"/>
-              <w:bottom w:w="60" w:type="dxa"/>
-              <w:left w:w="100" w:type="dxa"/>
-              <w:right w:w="100" w:type="dxa"/>
+              <w:top w:w="50" w:type="dxa"/>
+              <w:bottom w:w="50" w:type="dxa"/>
+              <w:left w:w="60" w:type="dxa"/>
+              <w:right w:w="60" w:type="dxa"/>
             </w:tcMar>
           </w:tcPr>
           <w:p>
             <w:r>
               <w:rPr>
-                <w:b/>
                 <w:color w:val="0F172A"/>
-                <w:sz w:val="17"/>
-              </w:rPr>
-              <w:t>⭐ Khuyên dùng cho thi</w:t>
+                <w:sz w:val="16"/>
+              </w:rPr>
+              <w:t>Luôn dùng XADD MAXLEN ~ 1000 để chống tràn bộ nhớ.</w:t>
             </w:r>
           </w:p>
         </w:tc>
@@ -3825,34 +5064,34 @@
       <w:tr>
         <w:tc>
           <w:tcPr>
-            <w:tcW w:type="dxa" w:w="2160"/>
+            <w:tcW w:type="dxa" w:w="1728"/>
             <w:shd w:fill="F8FAFC"/>
             <w:tcMar>
-              <w:top w:w="60" w:type="dxa"/>
-              <w:bottom w:w="60" w:type="dxa"/>
-              <w:left w:w="100" w:type="dxa"/>
-              <w:right w:w="100" w:type="dxa"/>
+              <w:top w:w="50" w:type="dxa"/>
+              <w:bottom w:w="50" w:type="dxa"/>
+              <w:left w:w="60" w:type="dxa"/>
+              <w:right w:w="60" w:type="dxa"/>
             </w:tcMar>
           </w:tcPr>
           <w:p>
             <w:r>
               <w:rPr>
                 <w:color w:val="0F172A"/>
-                <w:sz w:val="17"/>
-              </w:rPr>
-              <w:t>Time-Series DB</w:t>
+                <w:sz w:val="16"/>
+              </w:rPr>
+              <w:t>Stream Engine</w:t>
             </w:r>
           </w:p>
         </w:tc>
         <w:tc>
           <w:tcPr>
-            <w:tcW w:type="dxa" w:w="2016"/>
+            <w:tcW w:type="dxa" w:w="1584"/>
             <w:shd w:fill="F8FAFC"/>
             <w:tcMar>
-              <w:top w:w="60" w:type="dxa"/>
-              <w:bottom w:w="60" w:type="dxa"/>
-              <w:left w:w="100" w:type="dxa"/>
-              <w:right w:w="100" w:type="dxa"/>
+              <w:top w:w="50" w:type="dxa"/>
+              <w:bottom w:w="50" w:type="dxa"/>
+              <w:left w:w="60" w:type="dxa"/>
+              <w:right w:w="60" w:type="dxa"/>
             </w:tcMar>
           </w:tcPr>
           <w:p>
@@ -3860,30 +5099,53 @@
               <w:rPr>
                 <w:b/>
                 <w:color w:val="0F172A"/>
-                <w:sz w:val="17"/>
-              </w:rPr>
-              <w:t>TimescaleDB</w:t>
+                <w:sz w:val="16"/>
+              </w:rPr>
+              <w:t>Async Window Engine</w:t>
             </w:r>
           </w:p>
         </w:tc>
         <w:tc>
           <w:tcPr>
-            <w:tcW w:type="dxa" w:w="3744"/>
+            <w:tcW w:type="dxa" w:w="2592"/>
             <w:shd w:fill="F8FAFC"/>
             <w:tcMar>
-              <w:top w:w="60" w:type="dxa"/>
-              <w:bottom w:w="60" w:type="dxa"/>
-              <w:left w:w="100" w:type="dxa"/>
-              <w:right w:w="100" w:type="dxa"/>
+              <w:top w:w="50" w:type="dxa"/>
+              <w:bottom w:w="50" w:type="dxa"/>
+              <w:left w:w="60" w:type="dxa"/>
+              <w:right w:w="60" w:type="dxa"/>
             </w:tcMar>
           </w:tcPr>
           <w:p>
             <w:r>
               <w:rPr>
                 <w:color w:val="0F172A"/>
-                <w:sz w:val="17"/>
-              </w:rPr>
-              <w:t>Hypertables phân vùng tự động, nén cột 90%, SQL chuẩn của PostgreSQL.</w:t>
+                <w:sz w:val="16"/>
+              </w:rPr>
+              <w:t>Xử lý dòng dữ liệu phi đồng bộ Python.</w:t>
+            </w:r>
+          </w:p>
+        </w:tc>
+        <w:tc>
+          <w:tcPr>
+            <w:tcW w:type="dxa" w:w="2304"/>
+            <w:shd w:fill="F8FAFC"/>
+            <w:tcMar>
+              <w:top w:w="50" w:type="dxa"/>
+              <w:bottom w:w="50" w:type="dxa"/>
+              <w:left w:w="60" w:type="dxa"/>
+              <w:right w:w="60" w:type="dxa"/>
+            </w:tcMar>
+          </w:tcPr>
+          <w:p>
+            <w:r>
+              <w:rPr>
+                <w:color w:val="0F172A"/>
+                <w:sz w:val="16"/>
+              </w:rPr>
+              <w:t>Ưu: Tích hợp trực tiếp AI, kiểm soát Watermark linh hoạt.</w:t>
+              <w:br/>
+              <w:t>Nhược: Tự quản lý state.</w:t>
             </w:r>
           </w:p>
         </w:tc>
@@ -3892,20 +5154,19 @@
             <w:tcW w:type="dxa" w:w="1872"/>
             <w:shd w:fill="F8FAFC"/>
             <w:tcMar>
-              <w:top w:w="60" w:type="dxa"/>
-              <w:bottom w:w="60" w:type="dxa"/>
-              <w:left w:w="100" w:type="dxa"/>
-              <w:right w:w="100" w:type="dxa"/>
+              <w:top w:w="50" w:type="dxa"/>
+              <w:bottom w:w="50" w:type="dxa"/>
+              <w:left w:w="60" w:type="dxa"/>
+              <w:right w:w="60" w:type="dxa"/>
             </w:tcMar>
           </w:tcPr>
           <w:p>
             <w:r>
               <w:rPr>
-                <w:b/>
                 <w:color w:val="0F172A"/>
-                <w:sz w:val="17"/>
-              </w:rPr>
-              <w:t>⭐ Khuyên dùng số 1</w:t>
+                <w:sz w:val="16"/>
+              </w:rPr>
+              <w:t>Cấu hình allowed_delay 5s để gom dữ liệu trễ mạng.</w:t>
             </w:r>
           </w:p>
         </w:tc>
@@ -3913,34 +5174,34 @@
       <w:tr>
         <w:tc>
           <w:tcPr>
-            <w:tcW w:type="dxa" w:w="2160"/>
+            <w:tcW w:type="dxa" w:w="1728"/>
             <w:shd w:fill="FFFFFF"/>
             <w:tcMar>
-              <w:top w:w="60" w:type="dxa"/>
-              <w:bottom w:w="60" w:type="dxa"/>
-              <w:left w:w="100" w:type="dxa"/>
-              <w:right w:w="100" w:type="dxa"/>
+              <w:top w:w="50" w:type="dxa"/>
+              <w:bottom w:w="50" w:type="dxa"/>
+              <w:left w:w="60" w:type="dxa"/>
+              <w:right w:w="60" w:type="dxa"/>
             </w:tcMar>
           </w:tcPr>
           <w:p>
             <w:r>
               <w:rPr>
                 <w:color w:val="0F172A"/>
-                <w:sz w:val="17"/>
-              </w:rPr>
-              <w:t>AI Anomaly Engine</w:t>
+                <w:sz w:val="16"/>
+              </w:rPr>
+              <w:t>Stream Engine</w:t>
             </w:r>
           </w:p>
         </w:tc>
         <w:tc>
           <w:tcPr>
-            <w:tcW w:type="dxa" w:w="2016"/>
+            <w:tcW w:type="dxa" w:w="1584"/>
             <w:shd w:fill="FFFFFF"/>
             <w:tcMar>
-              <w:top w:w="60" w:type="dxa"/>
-              <w:bottom w:w="60" w:type="dxa"/>
-              <w:left w:w="100" w:type="dxa"/>
-              <w:right w:w="100" w:type="dxa"/>
+              <w:top w:w="50" w:type="dxa"/>
+              <w:bottom w:w="50" w:type="dxa"/>
+              <w:left w:w="60" w:type="dxa"/>
+              <w:right w:w="60" w:type="dxa"/>
             </w:tcMar>
           </w:tcPr>
           <w:p>
@@ -3948,30 +5209,53 @@
               <w:rPr>
                 <w:b/>
                 <w:color w:val="0F172A"/>
-                <w:sz w:val="17"/>
-              </w:rPr>
-              <w:t>Isolation Forest</w:t>
+                <w:sz w:val="16"/>
+              </w:rPr>
+              <w:t>Apache Flink</w:t>
             </w:r>
           </w:p>
         </w:tc>
         <w:tc>
           <w:tcPr>
-            <w:tcW w:type="dxa" w:w="3744"/>
+            <w:tcW w:type="dxa" w:w="2592"/>
             <w:shd w:fill="FFFFFF"/>
             <w:tcMar>
-              <w:top w:w="60" w:type="dxa"/>
-              <w:bottom w:w="60" w:type="dxa"/>
-              <w:left w:w="100" w:type="dxa"/>
-              <w:right w:w="100" w:type="dxa"/>
+              <w:top w:w="50" w:type="dxa"/>
+              <w:bottom w:w="50" w:type="dxa"/>
+              <w:left w:w="60" w:type="dxa"/>
+              <w:right w:w="60" w:type="dxa"/>
             </w:tcMar>
           </w:tcPr>
           <w:p>
             <w:r>
               <w:rPr>
                 <w:color w:val="0F172A"/>
-                <w:sz w:val="17"/>
-              </w:rPr>
-              <w:t>Huấn luyện không giám sát, chạy cực nhanh trên CPU, giải thích qua SHAP.</w:t>
+                <w:sz w:val="16"/>
+              </w:rPr>
+              <w:t>Stateful stream engine chuẩn mực.</w:t>
+            </w:r>
+          </w:p>
+        </w:tc>
+        <w:tc>
+          <w:tcPr>
+            <w:tcW w:type="dxa" w:w="2304"/>
+            <w:shd w:fill="FFFFFF"/>
+            <w:tcMar>
+              <w:top w:w="50" w:type="dxa"/>
+              <w:bottom w:w="50" w:type="dxa"/>
+              <w:left w:w="60" w:type="dxa"/>
+              <w:right w:w="60" w:type="dxa"/>
+            </w:tcMar>
+          </w:tcPr>
+          <w:p>
+            <w:r>
+              <w:rPr>
+                <w:color w:val="0F172A"/>
+                <w:sz w:val="16"/>
+              </w:rPr>
+              <w:t>Ưu: Xử lý Exactly-once, đồ thị stream lớn.</w:t>
+              <w:br/>
+              <w:t>Nhược: Khởi động nặng, tốn thời gian học.</w:t>
             </w:r>
           </w:p>
         </w:tc>
@@ -3980,20 +5264,679 @@
             <w:tcW w:type="dxa" w:w="1872"/>
             <w:shd w:fill="FFFFFF"/>
             <w:tcMar>
-              <w:top w:w="60" w:type="dxa"/>
-              <w:bottom w:w="60" w:type="dxa"/>
-              <w:left w:w="100" w:type="dxa"/>
-              <w:right w:w="100" w:type="dxa"/>
+              <w:top w:w="50" w:type="dxa"/>
+              <w:bottom w:w="50" w:type="dxa"/>
+              <w:left w:w="60" w:type="dxa"/>
+              <w:right w:w="60" w:type="dxa"/>
             </w:tcMar>
           </w:tcPr>
           <w:p>
             <w:r>
               <w:rPr>
+                <w:color w:val="0F172A"/>
+                <w:sz w:val="16"/>
+              </w:rPr>
+              <w:t>Dùng cho hệ thống lớn cấp Enterprise.</w:t>
+            </w:r>
+          </w:p>
+        </w:tc>
+      </w:tr>
+      <w:tr>
+        <w:tc>
+          <w:tcPr>
+            <w:tcW w:type="dxa" w:w="1728"/>
+            <w:shd w:fill="F8FAFC"/>
+            <w:tcMar>
+              <w:top w:w="50" w:type="dxa"/>
+              <w:bottom w:w="50" w:type="dxa"/>
+              <w:left w:w="60" w:type="dxa"/>
+              <w:right w:w="60" w:type="dxa"/>
+            </w:tcMar>
+          </w:tcPr>
+          <w:p>
+            <w:r>
+              <w:rPr>
+                <w:color w:val="0F172A"/>
+                <w:sz w:val="16"/>
+              </w:rPr>
+              <w:t>Time-Series DB</w:t>
+            </w:r>
+          </w:p>
+        </w:tc>
+        <w:tc>
+          <w:tcPr>
+            <w:tcW w:type="dxa" w:w="1584"/>
+            <w:shd w:fill="F8FAFC"/>
+            <w:tcMar>
+              <w:top w:w="50" w:type="dxa"/>
+              <w:bottom w:w="50" w:type="dxa"/>
+              <w:left w:w="60" w:type="dxa"/>
+              <w:right w:w="60" w:type="dxa"/>
+            </w:tcMar>
+          </w:tcPr>
+          <w:p>
+            <w:r>
+              <w:rPr>
                 <w:b/>
                 <w:color w:val="0F172A"/>
-                <w:sz w:val="17"/>
-              </w:rPr>
-              <w:t>⭐ Khuyên dùng Baseline</w:t>
+                <w:sz w:val="16"/>
+              </w:rPr>
+              <w:t>TimescaleDB</w:t>
+            </w:r>
+          </w:p>
+        </w:tc>
+        <w:tc>
+          <w:tcPr>
+            <w:tcW w:type="dxa" w:w="2592"/>
+            <w:shd w:fill="F8FAFC"/>
+            <w:tcMar>
+              <w:top w:w="50" w:type="dxa"/>
+              <w:bottom w:w="50" w:type="dxa"/>
+              <w:left w:w="60" w:type="dxa"/>
+              <w:right w:w="60" w:type="dxa"/>
+            </w:tcMar>
+          </w:tcPr>
+          <w:p>
+            <w:r>
+              <w:rPr>
+                <w:color w:val="0F172A"/>
+                <w:sz w:val="16"/>
+              </w:rPr>
+              <w:t>PostgreSQL Extension với Hypertables.</w:t>
+            </w:r>
+          </w:p>
+        </w:tc>
+        <w:tc>
+          <w:tcPr>
+            <w:tcW w:type="dxa" w:w="2304"/>
+            <w:shd w:fill="F8FAFC"/>
+            <w:tcMar>
+              <w:top w:w="50" w:type="dxa"/>
+              <w:bottom w:w="50" w:type="dxa"/>
+              <w:left w:w="60" w:type="dxa"/>
+              <w:right w:w="60" w:type="dxa"/>
+            </w:tcMar>
+          </w:tcPr>
+          <w:p>
+            <w:r>
+              <w:rPr>
+                <w:color w:val="0F172A"/>
+                <w:sz w:val="16"/>
+              </w:rPr>
+              <w:t>Ưu: SQL chuẩn, tự phân vùng, nén 90%.</w:t>
+              <w:br/>
+              <w:t>Nhược: Tốn tài nguyên như Postgres.</w:t>
+            </w:r>
+          </w:p>
+        </w:tc>
+        <w:tc>
+          <w:tcPr>
+            <w:tcW w:type="dxa" w:w="1872"/>
+            <w:shd w:fill="F8FAFC"/>
+            <w:tcMar>
+              <w:top w:w="50" w:type="dxa"/>
+              <w:bottom w:w="50" w:type="dxa"/>
+              <w:left w:w="60" w:type="dxa"/>
+              <w:right w:w="60" w:type="dxa"/>
+            </w:tcMar>
+          </w:tcPr>
+          <w:p>
+            <w:r>
+              <w:rPr>
+                <w:color w:val="0F172A"/>
+                <w:sz w:val="16"/>
+              </w:rPr>
+              <w:t>Cấu hình chunk 1 ngày và bật Columnar Compression.</w:t>
+            </w:r>
+          </w:p>
+        </w:tc>
+      </w:tr>
+      <w:tr>
+        <w:tc>
+          <w:tcPr>
+            <w:tcW w:type="dxa" w:w="1728"/>
+            <w:shd w:fill="FFFFFF"/>
+            <w:tcMar>
+              <w:top w:w="50" w:type="dxa"/>
+              <w:bottom w:w="50" w:type="dxa"/>
+              <w:left w:w="60" w:type="dxa"/>
+              <w:right w:w="60" w:type="dxa"/>
+            </w:tcMar>
+          </w:tcPr>
+          <w:p>
+            <w:r>
+              <w:rPr>
+                <w:color w:val="0F172A"/>
+                <w:sz w:val="16"/>
+              </w:rPr>
+              <w:t>Time-Series DB</w:t>
+            </w:r>
+          </w:p>
+        </w:tc>
+        <w:tc>
+          <w:tcPr>
+            <w:tcW w:type="dxa" w:w="1584"/>
+            <w:shd w:fill="FFFFFF"/>
+            <w:tcMar>
+              <w:top w:w="50" w:type="dxa"/>
+              <w:bottom w:w="50" w:type="dxa"/>
+              <w:left w:w="60" w:type="dxa"/>
+              <w:right w:w="60" w:type="dxa"/>
+            </w:tcMar>
+          </w:tcPr>
+          <w:p>
+            <w:r>
+              <w:rPr>
+                <w:b/>
+                <w:color w:val="0F172A"/>
+                <w:sz w:val="16"/>
+              </w:rPr>
+              <w:t>InfluxDB</w:t>
+            </w:r>
+          </w:p>
+        </w:tc>
+        <w:tc>
+          <w:tcPr>
+            <w:tcW w:type="dxa" w:w="2592"/>
+            <w:shd w:fill="FFFFFF"/>
+            <w:tcMar>
+              <w:top w:w="50" w:type="dxa"/>
+              <w:bottom w:w="50" w:type="dxa"/>
+              <w:left w:w="60" w:type="dxa"/>
+              <w:right w:w="60" w:type="dxa"/>
+            </w:tcMar>
+          </w:tcPr>
+          <w:p>
+            <w:r>
+              <w:rPr>
+                <w:color w:val="0F172A"/>
+                <w:sz w:val="16"/>
+              </w:rPr>
+              <w:t>CSDL Time-series chuyên dụng TSM.</w:t>
+            </w:r>
+          </w:p>
+        </w:tc>
+        <w:tc>
+          <w:tcPr>
+            <w:tcW w:type="dxa" w:w="2304"/>
+            <w:shd w:fill="FFFFFF"/>
+            <w:tcMar>
+              <w:top w:w="50" w:type="dxa"/>
+              <w:bottom w:w="50" w:type="dxa"/>
+              <w:left w:w="60" w:type="dxa"/>
+              <w:right w:w="60" w:type="dxa"/>
+            </w:tcMar>
+          </w:tcPr>
+          <w:p>
+            <w:r>
+              <w:rPr>
+                <w:color w:val="0F172A"/>
+                <w:sz w:val="16"/>
+              </w:rPr>
+              <w:t>Ưu: Tốc độ ghi cực nhanh.</w:t>
+              <w:br/>
+              <w:t>Nhược: Lỗi High Cardinality, học ngôn ngữ Flux.</w:t>
+            </w:r>
+          </w:p>
+        </w:tc>
+        <w:tc>
+          <w:tcPr>
+            <w:tcW w:type="dxa" w:w="1872"/>
+            <w:shd w:fill="FFFFFF"/>
+            <w:tcMar>
+              <w:top w:w="50" w:type="dxa"/>
+              <w:bottom w:w="50" w:type="dxa"/>
+              <w:left w:w="60" w:type="dxa"/>
+              <w:right w:w="60" w:type="dxa"/>
+            </w:tcMar>
+          </w:tcPr>
+          <w:p>
+            <w:r>
+              <w:rPr>
+                <w:color w:val="0F172A"/>
+                <w:sz w:val="16"/>
+              </w:rPr>
+              <w:t>Chỉ dùng khi đã quen thuộc với hệ sinh thái Influx.</w:t>
+            </w:r>
+          </w:p>
+        </w:tc>
+      </w:tr>
+      <w:tr>
+        <w:tc>
+          <w:tcPr>
+            <w:tcW w:type="dxa" w:w="1728"/>
+            <w:shd w:fill="F8FAFC"/>
+            <w:tcMar>
+              <w:top w:w="50" w:type="dxa"/>
+              <w:bottom w:w="50" w:type="dxa"/>
+              <w:left w:w="60" w:type="dxa"/>
+              <w:right w:w="60" w:type="dxa"/>
+            </w:tcMar>
+          </w:tcPr>
+          <w:p>
+            <w:r>
+              <w:rPr>
+                <w:color w:val="0F172A"/>
+                <w:sz w:val="16"/>
+              </w:rPr>
+              <w:t>AI Anomaly</w:t>
+            </w:r>
+          </w:p>
+        </w:tc>
+        <w:tc>
+          <w:tcPr>
+            <w:tcW w:type="dxa" w:w="1584"/>
+            <w:shd w:fill="F8FAFC"/>
+            <w:tcMar>
+              <w:top w:w="50" w:type="dxa"/>
+              <w:bottom w:w="50" w:type="dxa"/>
+              <w:left w:w="60" w:type="dxa"/>
+              <w:right w:w="60" w:type="dxa"/>
+            </w:tcMar>
+          </w:tcPr>
+          <w:p>
+            <w:r>
+              <w:rPr>
+                <w:b/>
+                <w:color w:val="0F172A"/>
+                <w:sz w:val="16"/>
+              </w:rPr>
+              <w:t>Isolation Forest</w:t>
+            </w:r>
+          </w:p>
+        </w:tc>
+        <w:tc>
+          <w:tcPr>
+            <w:tcW w:type="dxa" w:w="2592"/>
+            <w:shd w:fill="F8FAFC"/>
+            <w:tcMar>
+              <w:top w:w="50" w:type="dxa"/>
+              <w:bottom w:w="50" w:type="dxa"/>
+              <w:left w:w="60" w:type="dxa"/>
+              <w:right w:w="60" w:type="dxa"/>
+            </w:tcMar>
+          </w:tcPr>
+          <w:p>
+            <w:r>
+              <w:rPr>
+                <w:color w:val="0F172A"/>
+                <w:sz w:val="16"/>
+              </w:rPr>
+              <w:t>Phân lập điểm dị biệt qua cây ngẫu nhiên.</w:t>
+            </w:r>
+          </w:p>
+        </w:tc>
+        <w:tc>
+          <w:tcPr>
+            <w:tcW w:type="dxa" w:w="2304"/>
+            <w:shd w:fill="F8FAFC"/>
+            <w:tcMar>
+              <w:top w:w="50" w:type="dxa"/>
+              <w:bottom w:w="50" w:type="dxa"/>
+              <w:left w:w="60" w:type="dxa"/>
+              <w:right w:w="60" w:type="dxa"/>
+            </w:tcMar>
+          </w:tcPr>
+          <w:p>
+            <w:r>
+              <w:rPr>
+                <w:color w:val="0F172A"/>
+                <w:sz w:val="16"/>
+              </w:rPr>
+              <w:t>Ưu: Nhanh O(n log n), chạy CPU, Unsupervised.</w:t>
+              <w:br/>
+              <w:t>Nhược: Khó học tương quan phi tuyến sâu.</w:t>
+            </w:r>
+          </w:p>
+        </w:tc>
+        <w:tc>
+          <w:tcPr>
+            <w:tcW w:type="dxa" w:w="1872"/>
+            <w:shd w:fill="F8FAFC"/>
+            <w:tcMar>
+              <w:top w:w="50" w:type="dxa"/>
+              <w:bottom w:w="50" w:type="dxa"/>
+              <w:left w:w="60" w:type="dxa"/>
+              <w:right w:w="60" w:type="dxa"/>
+            </w:tcMar>
+          </w:tcPr>
+          <w:p>
+            <w:r>
+              <w:rPr>
+                <w:color w:val="0F172A"/>
+                <w:sz w:val="16"/>
+              </w:rPr>
+              <w:t>Đặt contamination=0.03, kết hợp trích xuất đặc trưng FFT.</w:t>
+            </w:r>
+          </w:p>
+        </w:tc>
+      </w:tr>
+      <w:tr>
+        <w:tc>
+          <w:tcPr>
+            <w:tcW w:type="dxa" w:w="1728"/>
+            <w:shd w:fill="FFFFFF"/>
+            <w:tcMar>
+              <w:top w:w="50" w:type="dxa"/>
+              <w:bottom w:w="50" w:type="dxa"/>
+              <w:left w:w="60" w:type="dxa"/>
+              <w:right w:w="60" w:type="dxa"/>
+            </w:tcMar>
+          </w:tcPr>
+          <w:p>
+            <w:r>
+              <w:rPr>
+                <w:color w:val="0F172A"/>
+                <w:sz w:val="16"/>
+              </w:rPr>
+              <w:t>AI Anomaly</w:t>
+            </w:r>
+          </w:p>
+        </w:tc>
+        <w:tc>
+          <w:tcPr>
+            <w:tcW w:type="dxa" w:w="1584"/>
+            <w:shd w:fill="FFFFFF"/>
+            <w:tcMar>
+              <w:top w:w="50" w:type="dxa"/>
+              <w:bottom w:w="50" w:type="dxa"/>
+              <w:left w:w="60" w:type="dxa"/>
+              <w:right w:w="60" w:type="dxa"/>
+            </w:tcMar>
+          </w:tcPr>
+          <w:p>
+            <w:r>
+              <w:rPr>
+                <w:b/>
+                <w:color w:val="0F172A"/>
+                <w:sz w:val="16"/>
+              </w:rPr>
+              <w:t>Autoencoder</w:t>
+            </w:r>
+          </w:p>
+        </w:tc>
+        <w:tc>
+          <w:tcPr>
+            <w:tcW w:type="dxa" w:w="2592"/>
+            <w:shd w:fill="FFFFFF"/>
+            <w:tcMar>
+              <w:top w:w="50" w:type="dxa"/>
+              <w:bottom w:w="50" w:type="dxa"/>
+              <w:left w:w="60" w:type="dxa"/>
+              <w:right w:w="60" w:type="dxa"/>
+            </w:tcMar>
+          </w:tcPr>
+          <w:p>
+            <w:r>
+              <w:rPr>
+                <w:color w:val="0F172A"/>
+                <w:sz w:val="16"/>
+              </w:rPr>
+              <w:t>Mạng nơ-ron nén và tái tạo tín hiệu.</w:t>
+            </w:r>
+          </w:p>
+        </w:tc>
+        <w:tc>
+          <w:tcPr>
+            <w:tcW w:type="dxa" w:w="2304"/>
+            <w:shd w:fill="FFFFFF"/>
+            <w:tcMar>
+              <w:top w:w="50" w:type="dxa"/>
+              <w:bottom w:w="50" w:type="dxa"/>
+              <w:left w:w="60" w:type="dxa"/>
+              <w:right w:w="60" w:type="dxa"/>
+            </w:tcMar>
+          </w:tcPr>
+          <w:p>
+            <w:r>
+              <w:rPr>
+                <w:color w:val="0F172A"/>
+                <w:sz w:val="16"/>
+              </w:rPr>
+              <w:t>Ưu: Học được quan hệ phức tạp, bắt lỗi mới lạ.</w:t>
+              <w:br/>
+              <w:t>Nhược: Cần chuẩn hóa dữ liệu cẩn thận.</w:t>
+            </w:r>
+          </w:p>
+        </w:tc>
+        <w:tc>
+          <w:tcPr>
+            <w:tcW w:type="dxa" w:w="1872"/>
+            <w:shd w:fill="FFFFFF"/>
+            <w:tcMar>
+              <w:top w:w="50" w:type="dxa"/>
+              <w:bottom w:w="50" w:type="dxa"/>
+              <w:left w:w="60" w:type="dxa"/>
+              <w:right w:w="60" w:type="dxa"/>
+            </w:tcMar>
+          </w:tcPr>
+          <w:p>
+            <w:r>
+              <w:rPr>
+                <w:color w:val="0F172A"/>
+                <w:sz w:val="16"/>
+              </w:rPr>
+              <w:t>Export sang ONNX Runtime để suy luận &lt; 5ms.</w:t>
+            </w:r>
+          </w:p>
+        </w:tc>
+      </w:tr>
+      <w:tr>
+        <w:tc>
+          <w:tcPr>
+            <w:tcW w:type="dxa" w:w="1728"/>
+            <w:shd w:fill="F8FAFC"/>
+            <w:tcMar>
+              <w:top w:w="50" w:type="dxa"/>
+              <w:bottom w:w="50" w:type="dxa"/>
+              <w:left w:w="60" w:type="dxa"/>
+              <w:right w:w="60" w:type="dxa"/>
+            </w:tcMar>
+          </w:tcPr>
+          <w:p>
+            <w:r>
+              <w:rPr>
+                <w:color w:val="0F172A"/>
+                <w:sz w:val="16"/>
+              </w:rPr>
+              <w:t>RCA &amp; XAI</w:t>
+            </w:r>
+          </w:p>
+        </w:tc>
+        <w:tc>
+          <w:tcPr>
+            <w:tcW w:type="dxa" w:w="1584"/>
+            <w:shd w:fill="F8FAFC"/>
+            <w:tcMar>
+              <w:top w:w="50" w:type="dxa"/>
+              <w:bottom w:w="50" w:type="dxa"/>
+              <w:left w:w="60" w:type="dxa"/>
+              <w:right w:w="60" w:type="dxa"/>
+            </w:tcMar>
+          </w:tcPr>
+          <w:p>
+            <w:r>
+              <w:rPr>
+                <w:b/>
+                <w:color w:val="0F172A"/>
+                <w:sz w:val="16"/>
+              </w:rPr>
+              <w:t>SHAP</w:t>
+            </w:r>
+          </w:p>
+        </w:tc>
+        <w:tc>
+          <w:tcPr>
+            <w:tcW w:type="dxa" w:w="2592"/>
+            <w:shd w:fill="F8FAFC"/>
+            <w:tcMar>
+              <w:top w:w="50" w:type="dxa"/>
+              <w:bottom w:w="50" w:type="dxa"/>
+              <w:left w:w="60" w:type="dxa"/>
+              <w:right w:w="60" w:type="dxa"/>
+            </w:tcMar>
+          </w:tcPr>
+          <w:p>
+            <w:r>
+              <w:rPr>
+                <w:color w:val="0F172A"/>
+                <w:sz w:val="16"/>
+              </w:rPr>
+              <w:t>Phân bổ Shapley từ lý thuyết trò chơi.</w:t>
+            </w:r>
+          </w:p>
+        </w:tc>
+        <w:tc>
+          <w:tcPr>
+            <w:tcW w:type="dxa" w:w="2304"/>
+            <w:shd w:fill="F8FAFC"/>
+            <w:tcMar>
+              <w:top w:w="50" w:type="dxa"/>
+              <w:bottom w:w="50" w:type="dxa"/>
+              <w:left w:w="60" w:type="dxa"/>
+              <w:right w:w="60" w:type="dxa"/>
+            </w:tcMar>
+          </w:tcPr>
+          <w:p>
+            <w:r>
+              <w:rPr>
+                <w:color w:val="0F172A"/>
+                <w:sz w:val="16"/>
+              </w:rPr>
+              <w:t>Ưu: Chỉ rõ % đóng góp của từng cảm biến vào lỗi.</w:t>
+              <w:br/>
+              <w:t>Nhược: Tính toán lâu nếu nhiều biến.</w:t>
+            </w:r>
+          </w:p>
+        </w:tc>
+        <w:tc>
+          <w:tcPr>
+            <w:tcW w:type="dxa" w:w="1872"/>
+            <w:shd w:fill="F8FAFC"/>
+            <w:tcMar>
+              <w:top w:w="50" w:type="dxa"/>
+              <w:bottom w:w="50" w:type="dxa"/>
+              <w:left w:w="60" w:type="dxa"/>
+              <w:right w:w="60" w:type="dxa"/>
+            </w:tcMar>
+          </w:tcPr>
+          <w:p>
+            <w:r>
+              <w:rPr>
+                <w:color w:val="0F172A"/>
+                <w:sz w:val="16"/>
+              </w:rPr>
+              <w:t>Dùng TreeSHAP để tính toán trong mili-giây.</w:t>
+            </w:r>
+          </w:p>
+        </w:tc>
+      </w:tr>
+      <w:tr>
+        <w:tc>
+          <w:tcPr>
+            <w:tcW w:type="dxa" w:w="1728"/>
+            <w:shd w:fill="FFFFFF"/>
+            <w:tcMar>
+              <w:top w:w="50" w:type="dxa"/>
+              <w:bottom w:w="50" w:type="dxa"/>
+              <w:left w:w="60" w:type="dxa"/>
+              <w:right w:w="60" w:type="dxa"/>
+            </w:tcMar>
+          </w:tcPr>
+          <w:p>
+            <w:r>
+              <w:rPr>
+                <w:color w:val="0F172A"/>
+                <w:sz w:val="16"/>
+              </w:rPr>
+              <w:t>AI Agent</w:t>
+            </w:r>
+          </w:p>
+        </w:tc>
+        <w:tc>
+          <w:tcPr>
+            <w:tcW w:type="dxa" w:w="1584"/>
+            <w:shd w:fill="FFFFFF"/>
+            <w:tcMar>
+              <w:top w:w="50" w:type="dxa"/>
+              <w:bottom w:w="50" w:type="dxa"/>
+              <w:left w:w="60" w:type="dxa"/>
+              <w:right w:w="60" w:type="dxa"/>
+            </w:tcMar>
+          </w:tcPr>
+          <w:p>
+            <w:r>
+              <w:rPr>
+                <w:b/>
+                <w:color w:val="0F172A"/>
+                <w:sz w:val="16"/>
+              </w:rPr>
+              <w:t>LLM Reasoning</w:t>
+            </w:r>
+          </w:p>
+        </w:tc>
+        <w:tc>
+          <w:tcPr>
+            <w:tcW w:type="dxa" w:w="2592"/>
+            <w:shd w:fill="FFFFFF"/>
+            <w:tcMar>
+              <w:top w:w="50" w:type="dxa"/>
+              <w:bottom w:w="50" w:type="dxa"/>
+              <w:left w:w="60" w:type="dxa"/>
+              <w:right w:w="60" w:type="dxa"/>
+            </w:tcMar>
+          </w:tcPr>
+          <w:p>
+            <w:r>
+              <w:rPr>
+                <w:color w:val="0F172A"/>
+                <w:sz w:val="16"/>
+              </w:rPr>
+              <w:t>Mô hình ngôn ngữ lớn (Gemini/OpenAI).</w:t>
+            </w:r>
+          </w:p>
+        </w:tc>
+        <w:tc>
+          <w:tcPr>
+            <w:tcW w:type="dxa" w:w="2304"/>
+            <w:shd w:fill="FFFFFF"/>
+            <w:tcMar>
+              <w:top w:w="50" w:type="dxa"/>
+              <w:bottom w:w="50" w:type="dxa"/>
+              <w:left w:w="60" w:type="dxa"/>
+              <w:right w:w="60" w:type="dxa"/>
+            </w:tcMar>
+          </w:tcPr>
+          <w:p>
+            <w:r>
+              <w:rPr>
+                <w:color w:val="0F172A"/>
+                <w:sz w:val="16"/>
+              </w:rPr>
+              <w:t>Ưu: Tổng hợp ngữ cảnh, phân tích đa chiều.</w:t>
+              <w:br/>
+              <w:t>Nhược: Có thể bị ảo giác (Hallucination).</w:t>
+            </w:r>
+          </w:p>
+        </w:tc>
+        <w:tc>
+          <w:tcPr>
+            <w:tcW w:type="dxa" w:w="1872"/>
+            <w:shd w:fill="FFFFFF"/>
+            <w:tcMar>
+              <w:top w:w="50" w:type="dxa"/>
+              <w:bottom w:w="50" w:type="dxa"/>
+              <w:left w:w="60" w:type="dxa"/>
+              <w:right w:w="60" w:type="dxa"/>
+            </w:tcMar>
+          </w:tcPr>
+          <w:p>
+            <w:r>
+              <w:rPr>
+                <w:color w:val="0F172A"/>
+                <w:sz w:val="16"/>
+              </w:rPr>
+              <w:t>Bắt buộc bọc qua Safety Guardrails trước khi phát lệnh!</w:t>
             </w:r>
           </w:p>
         </w:tc>
@@ -4018,9 +5961,9 @@
         <w:tblLook w:firstColumn="1" w:firstRow="1" w:lastColumn="0" w:lastRow="0" w:noHBand="0" w:noVBand="1" w:val="04A0"/>
       </w:tblPr>
       <w:tblGrid>
-        <w:gridCol w:w="3312"/>
-        <w:gridCol w:w="3312"/>
-        <w:gridCol w:w="3312"/>
+        <w:gridCol w:w="3360"/>
+        <w:gridCol w:w="3360"/>
+        <w:gridCol w:w="3360"/>
       </w:tblGrid>
       <w:tr>
         <w:tc>
@@ -4069,7 +6012,7 @@
         </w:tc>
         <w:tc>
           <w:tcPr>
-            <w:tcW w:type="dxa" w:w="5184"/>
+            <w:tcW w:type="dxa" w:w="5472"/>
             <w:shd w:fill="15803D"/>
             <w:tcMar>
               <w:top w:w="80" w:type="dxa"/>
@@ -4136,7 +6079,7 @@
         </w:tc>
         <w:tc>
           <w:tcPr>
-            <w:tcW w:type="dxa" w:w="5184"/>
+            <w:tcW w:type="dxa" w:w="5472"/>
             <w:shd w:fill="FFFFFF"/>
             <w:tcMar>
               <w:top w:w="60" w:type="dxa"/>
@@ -4202,7 +6145,7 @@
         </w:tc>
         <w:tc>
           <w:tcPr>
-            <w:tcW w:type="dxa" w:w="5184"/>
+            <w:tcW w:type="dxa" w:w="5472"/>
             <w:shd w:fill="F8FAFC"/>
             <w:tcMar>
               <w:top w:w="60" w:type="dxa"/>
@@ -4268,7 +6211,7 @@
         </w:tc>
         <w:tc>
           <w:tcPr>
-            <w:tcW w:type="dxa" w:w="5184"/>
+            <w:tcW w:type="dxa" w:w="5472"/>
             <w:shd w:fill="FFFFFF"/>
             <w:tcMar>
               <w:top w:w="60" w:type="dxa"/>
@@ -4334,7 +6277,7 @@
         </w:tc>
         <w:tc>
           <w:tcPr>
-            <w:tcW w:type="dxa" w:w="5184"/>
+            <w:tcW w:type="dxa" w:w="5472"/>
             <w:shd w:fill="F8FAFC"/>
             <w:tcMar>
               <w:top w:w="60" w:type="dxa"/>
@@ -4349,7 +6292,7 @@
                 <w:color w:val="0F172A"/>
                 <w:sz w:val="18"/>
               </w:rPr>
-              <w:t>AI Agent đưa ra phương án khắc phục và phát lệnh điều khiển thiết bị tự động qua MQTT/Webhook.</w:t>
+              <w:t>AI Agent đưa ra phương án khắc phục và phát lệnh điều khiển thiết bị tự động qua MQTT/Webhook có kiểm soát an toàn.</w:t>
             </w:r>
           </w:p>
         </w:tc>
@@ -4400,7 +6343,7 @@
         </w:tc>
         <w:tc>
           <w:tcPr>
-            <w:tcW w:type="dxa" w:w="5184"/>
+            <w:tcW w:type="dxa" w:w="5472"/>
             <w:shd w:fill="FFFFFF"/>
             <w:tcMar>
               <w:top w:w="60" w:type="dxa"/>
@@ -4423,7 +6366,7 @@
     </w:tbl>
     <w:sectPr>
       <w:pgSz w:w="12240" w:h="15840"/>
-      <w:pgMar w:top="1152" w:right="1152" w:bottom="1152" w:left="1152" w:header="720" w:footer="720" w:gutter="0"/>
+      <w:pgMar w:top="1080" w:right="1080" w:bottom="1080" w:left="1080" w:header="720" w:footer="720" w:gutter="0"/>
       <w:cols w:space="720"/>
       <w:docGrid w:linePitch="360"/>
     </w:sectPr>

</xml_diff>